<commit_message>
Add three core use cases to Requirements document
Section 2 now covers the three primary use cases:
1. Build Productions - discovery, proposal, build, validation lifecycle
2. Review and Improve Existing Productions - error triage, health assessment, DTL review, modernization advice
3. Create and Optimize Transformations - pipeline discovery, DTL creation, schema introspection, dry-run testing, cross-format mapping insights

Each use case lists the tools and skills involved plus example prompts.
Updated both .md and .docx versions.

Co-Authored-By: Claude Opus 4.6 <noreply@anthropic.com>
</commit_message>
<xml_diff>
--- a/docs/01_Requirements_User_Stories.docx
+++ b/docs/01_Requirements_User_Stories.docx
@@ -67,27 +67,32 @@
     </w:p>
     <w:p>
       <w:r>
-        <w:t>2. Developer Experience</w:t>
+        <w:t>2. Core Use Cases</w:t>
       </w:r>
     </w:p>
     <w:p>
       <w:r>
-        <w:t>3. Builder Experience - Admin UI</w:t>
+        <w:t>3. Developer Experience</w:t>
       </w:r>
     </w:p>
     <w:p>
       <w:r>
-        <w:t>4. Builder Experience - Chatbot</w:t>
+        <w:t>4. Builder Experience - Admin UI</w:t>
       </w:r>
     </w:p>
     <w:p>
       <w:r>
-        <w:t>5. End-to-End Scenario</w:t>
+        <w:t>5. Builder Experience - Chatbot</w:t>
       </w:r>
     </w:p>
     <w:p>
       <w:r>
-        <w:t>6. Non-Functional Requirements</w:t>
+        <w:t>6. End-to-End Scenario</w:t>
+      </w:r>
+    </w:p>
+    <w:p>
+      <w:r>
+        <w:t>7. Non-Functional Requirements</w:t>
       </w:r>
     </w:p>
     <w:p>
@@ -320,7 +325,606 @@
         <w:pStyle w:val="Heading1"/>
       </w:pPr>
       <w:r>
-        <w:t>2. Developer Experience</w:t>
+        <w:t>2. Core Use Cases</w:t>
+      </w:r>
+    </w:p>
+    <w:p>
+      <w:r>
+        <w:t>The Agentic Health Interoperability Copilot addresses three primary use cases that cover the full lifecycle of healthcare integration work inside IRIS for Health. Each use case represents a category of tasks that integration engineers perform daily and that the agent can accelerate through natural-language conversation.</w:t>
+      </w:r>
+    </w:p>
+    <w:p>
+      <w:pPr>
+        <w:jc w:val="center"/>
+      </w:pPr>
+      <w:r>
+        <w:drawing>
+          <wp:inline xmlns:a="http://schemas.openxmlformats.org/drawingml/2006/main" xmlns:pic="http://schemas.openxmlformats.org/drawingml/2006/picture">
+            <wp:extent cx="5669280" cy="3543300"/>
+            <wp:docPr id="1" name="Picture 1"/>
+            <wp:cNvGraphicFramePr>
+              <a:graphicFrameLocks noChangeAspect="1"/>
+            </wp:cNvGraphicFramePr>
+            <a:graphic>
+              <a:graphicData uri="http://schemas.openxmlformats.org/drawingml/2006/picture">
+                <pic:pic>
+                  <pic:nvPicPr>
+                    <pic:cNvPr id="0" name="15_chatbot.png"/>
+                    <pic:cNvPicPr/>
+                  </pic:nvPicPr>
+                  <pic:blipFill>
+                    <a:blip r:embed="rId9"/>
+                    <a:stretch>
+                      <a:fillRect/>
+                    </a:stretch>
+                  </pic:blipFill>
+                  <pic:spPr>
+                    <a:xfrm>
+                      <a:off x="0" y="0"/>
+                      <a:ext cx="5669280" cy="3543300"/>
+                    </a:xfrm>
+                    <a:prstGeom prst="rect"/>
+                  </pic:spPr>
+                </pic:pic>
+              </a:graphicData>
+            </a:graphic>
+          </wp:inline>
+        </w:drawing>
+      </w:r>
+    </w:p>
+    <w:p>
+      <w:pPr>
+        <w:jc w:val="center"/>
+      </w:pPr>
+      <w:r>
+        <w:rPr>
+          <w:i/>
+          <w:color w:val="666666"/>
+          <w:sz w:val="18"/>
+        </w:rPr>
+        <w:t>Figure: Chat interface showing starter prompts organized by use case category: Build, Transform, Operate, and Review</w:t>
+      </w:r>
+    </w:p>
+    <w:p/>
+    <w:p>
+      <w:pPr>
+        <w:pStyle w:val="Heading2"/>
+      </w:pPr>
+      <w:r>
+        <w:t>2.1 Use Case 1: Build Productions</w:t>
+      </w:r>
+    </w:p>
+    <w:p>
+      <w:r>
+        <w:t>The most common task for an integration engineer is building new Productions -- the runtime message-processing pipelines in IRIS for Health. A Production consists of Business Services (inbound), Business Processes (routing/orchestration), and Business Operations (outbound), wired together with settings, routing rules, and message transformations.</w:t>
+      </w:r>
+    </w:p>
+    <w:p>
+      <w:r>
+        <w:t>The agent assists the Builder through the entire production lifecycle:</w:t>
+      </w:r>
+    </w:p>
+    <w:p>
+      <w:pPr>
+        <w:pStyle w:val="ListBullet"/>
+      </w:pPr>
+      <w:r>
+        <w:t>Discovery: The Builder describes their integration goal in plain English (e.g., 'build a production that receives ADT messages over MLLP, transforms them to FHIR R4, and sends them to a REST endpoint'). The agent searches the Ens.* vector catalog to find the right Business Host classes (EnsLib.HL7.Service.TCPService, EnsLib.FHIR.Operation.REST, etc.).</w:t>
+      </w:r>
+    </w:p>
+    <w:p>
+      <w:pPr>
+        <w:pStyle w:val="ListBullet"/>
+      </w:pPr>
+      <w:r>
+        <w:t>Proposal: The agent presents a production layout -- which hosts to add, what settings to configure, which adapters to use -- and asks the Builder to approve before making changes.</w:t>
+      </w:r>
+    </w:p>
+    <w:p>
+      <w:pPr>
+        <w:pStyle w:val="ListBullet"/>
+      </w:pPr>
+      <w:r>
+        <w:t>Build: Upon approval, the agent creates the production class, adds each Business Host with appropriate settings, creates routing rules, and compiles everything. Each mutating step goes through the confirmation gate.</w:t>
+      </w:r>
+    </w:p>
+    <w:p>
+      <w:pPr>
+        <w:pStyle w:val="ListBullet"/>
+      </w:pPr>
+      <w:r>
+        <w:t>Validation: The agent runs PostBuildValidation to check for configuration errors, sends a test HL7 message through the pipeline, and verifies that messages flow end-to-end without errors.</w:t>
+      </w:r>
+    </w:p>
+    <w:p/>
+    <w:p>
+      <w:pPr>
+        <w:pStyle w:val="ListBullet"/>
+      </w:pPr>
+      <w:r>
+        <w:t>Tools involved:</w:t>
+      </w:r>
+    </w:p>
+    <w:p>
+      <w:pPr>
+        <w:pStyle w:val="ListBullet2"/>
+      </w:pPr>
+      <w:r>
+        <w:t>search_ens -- find the right Business Host classes from the vector catalog</w:t>
+      </w:r>
+    </w:p>
+    <w:p>
+      <w:pPr>
+        <w:pStyle w:val="ListBullet2"/>
+      </w:pPr>
+      <w:r>
+        <w:t>describe_class -- inspect class details, parameters, and settings</w:t>
+      </w:r>
+    </w:p>
+    <w:p>
+      <w:pPr>
+        <w:pStyle w:val="ListBullet2"/>
+      </w:pPr>
+      <w:r>
+        <w:t>create_production -- create the production class definition</w:t>
+      </w:r>
+    </w:p>
+    <w:p>
+      <w:pPr>
+        <w:pStyle w:val="ListBullet2"/>
+      </w:pPr>
+      <w:r>
+        <w:t>add_business_host -- add Business Services, Processes, and Operations</w:t>
+      </w:r>
+    </w:p>
+    <w:p>
+      <w:pPr>
+        <w:pStyle w:val="ListBullet2"/>
+      </w:pPr>
+      <w:r>
+        <w:t>update_business_host_settings -- configure adapter settings, file paths, connection parameters</w:t>
+      </w:r>
+    </w:p>
+    <w:p>
+      <w:pPr>
+        <w:pStyle w:val="ListBullet2"/>
+      </w:pPr>
+      <w:r>
+        <w:t>create_routing_rule -- create routing rules with conditions and actions</w:t>
+      </w:r>
+    </w:p>
+    <w:p>
+      <w:pPr>
+        <w:pStyle w:val="ListBullet2"/>
+      </w:pPr>
+      <w:r>
+        <w:t>start_production / stop_production -- lifecycle management</w:t>
+      </w:r>
+    </w:p>
+    <w:p>
+      <w:pPr>
+        <w:pStyle w:val="ListBullet2"/>
+      </w:pPr>
+      <w:r>
+        <w:t>PostBuildValidation -- automated post-build health check</w:t>
+      </w:r>
+    </w:p>
+    <w:p>
+      <w:pPr>
+        <w:pStyle w:val="ListBullet2"/>
+      </w:pPr>
+      <w:r>
+        <w:t>BuildAndSendHL7TestMessage -- generate and send test messages through the pipeline</w:t>
+      </w:r>
+    </w:p>
+    <w:p/>
+    <w:p>
+      <w:r>
+        <w:t>Example prompts:</w:t>
+      </w:r>
+    </w:p>
+    <w:p>
+      <w:pPr>
+        <w:pStyle w:val="ListBullet"/>
+      </w:pPr>
+      <w:r>
+        <w:t>"Build a complete production that receives HL7 v2.5 ADT^A01 admission messages over an inbound folder, transforms each ADT into an ORU^R01 observation report, routes the transformed messages to an outbound folder, and sends failures to a dead-letter folder."</w:t>
+      </w:r>
+    </w:p>
+    <w:p>
+      <w:pPr>
+        <w:pStyle w:val="ListBullet"/>
+      </w:pPr>
+      <w:r>
+        <w:t>"I need a production that receives X12 270 eligibility inquiries over SFTP, calls our internal eligibility REST API, constructs the X12 271 response, and writes it back to the payer's SFTP outbound folder."</w:t>
+      </w:r>
+    </w:p>
+    <w:p>
+      <w:pPr>
+        <w:pStyle w:val="Heading2"/>
+      </w:pPr>
+      <w:r>
+        <w:t>2.2 Use Case 2: Review and Improve Existing Productions</w:t>
+      </w:r>
+    </w:p>
+    <w:p>
+      <w:r>
+        <w:t>Integration engineers inherit productions built by others, or maintain productions that were built months or years ago. They need to understand what a production does, identify problems, and find opportunities to modernize it using newer IRIS features and best practices.</w:t>
+      </w:r>
+    </w:p>
+    <w:p>
+      <w:r>
+        <w:t>The agent helps the Builder review and optimize existing integrations:</w:t>
+      </w:r>
+    </w:p>
+    <w:p>
+      <w:pPr>
+        <w:pStyle w:val="ListBullet"/>
+      </w:pPr>
+      <w:r>
+        <w:t>Error Triage: The agent queries the Event Log and Message Header tables to find recent errors, groups them by Business Host, identifies the most frequent error messages, and recommends remediation steps. It can spot suspended or errored messages that need manual intervention.</w:t>
+      </w:r>
+    </w:p>
+    <w:p>
+      <w:pPr>
+        <w:pStyle w:val="ListBullet"/>
+      </w:pPr>
+      <w:r>
+        <w:t>Production Health Assessment: The agent inspects the production configuration, checks queue depths, reviews throughput statistics, and identifies bottlenecks. It can recommend settings changes (pool size, throttle, retry intervals) based on what it observes.</w:t>
+      </w:r>
+    </w:p>
+    <w:p>
+      <w:pPr>
+        <w:pStyle w:val="ListBullet"/>
+      </w:pPr>
+      <w:r>
+        <w:t>DTL Review: The agent reviews Data Transformation Language (DTL) definitions and identifies hardcoded values that should be lookup tables, missing null checks on source fields, incorrect handling of repeating fields, and segments being dropped. It suggests refactored versions with explanations.</w:t>
+      </w:r>
+    </w:p>
+    <w:p>
+      <w:pPr>
+        <w:pStyle w:val="ListBullet"/>
+      </w:pPr>
+      <w:r>
+        <w:t>Modernization Advice: The agent knows about newer IRIS features (via Skills) and can recommend upgrades -- for example, replacing a custom BPL with a built-in DTL, using record maps instead of custom parsers, or adopting the HL7-to-SDA-to-FHIR pipeline instead of point-to-point transformations.</w:t>
+      </w:r>
+    </w:p>
+    <w:p/>
+    <w:p>
+      <w:pPr>
+        <w:pStyle w:val="ListBullet"/>
+      </w:pPr>
+      <w:r>
+        <w:t>Tools involved:</w:t>
+      </w:r>
+    </w:p>
+    <w:p>
+      <w:pPr>
+        <w:pStyle w:val="ListBullet2"/>
+      </w:pPr>
+      <w:r>
+        <w:t>get_production -- inspect the full production configuration and all hosts</w:t>
+      </w:r>
+    </w:p>
+    <w:p>
+      <w:pPr>
+        <w:pStyle w:val="ListBullet2"/>
+      </w:pPr>
+      <w:r>
+        <w:t>query_event_log -- search the Event Log for errors, warnings, and trace messages</w:t>
+      </w:r>
+    </w:p>
+    <w:p>
+      <w:pPr>
+        <w:pStyle w:val="ListBullet2"/>
+      </w:pPr>
+      <w:r>
+        <w:t>top_errors -- group errors by frequency and identify systemic issues</w:t>
+      </w:r>
+    </w:p>
+    <w:p>
+      <w:pPr>
+        <w:pStyle w:val="ListBullet2"/>
+      </w:pPr>
+      <w:r>
+        <w:t>query_message_status -- find messages in Error or Suspended state</w:t>
+      </w:r>
+    </w:p>
+    <w:p>
+      <w:pPr>
+        <w:pStyle w:val="ListBullet2"/>
+      </w:pPr>
+      <w:r>
+        <w:t>message_summary -- throughput statistics across all hosts</w:t>
+      </w:r>
+    </w:p>
+    <w:p>
+      <w:pPr>
+        <w:pStyle w:val="ListBullet2"/>
+      </w:pPr>
+      <w:r>
+        <w:t>queue_status -- check for queue buildup indicating backpressure</w:t>
+      </w:r>
+    </w:p>
+    <w:p>
+      <w:pPr>
+        <w:pStyle w:val="ListBullet2"/>
+      </w:pPr>
+      <w:r>
+        <w:t>describe_class -- look up what a Business Host class does and its available settings</w:t>
+      </w:r>
+    </w:p>
+    <w:p>
+      <w:pPr>
+        <w:pStyle w:val="ListBullet2"/>
+      </w:pPr>
+      <w:r>
+        <w:t>list_dtls / get_dtl -- review existing transformation logic</w:t>
+      </w:r>
+    </w:p>
+    <w:p>
+      <w:pPr>
+        <w:pStyle w:val="ListBullet2"/>
+      </w:pPr>
+      <w:r>
+        <w:t>Skills: Productions, DTL, BPL, Adapters, ESBPattern -- domain knowledge for recommendations</w:t>
+      </w:r>
+    </w:p>
+    <w:p/>
+    <w:p>
+      <w:r>
+        <w:t>Example prompts:</w:t>
+      </w:r>
+    </w:p>
+    <w:p>
+      <w:pPr>
+        <w:pStyle w:val="ListBullet"/>
+      </w:pPr>
+      <w:r>
+        <w:t>"Review the last 2 hours of errors across all productions. Group them by Business Host, show the top 5 most frequent error messages with counts, identify messages stuck in Suspended or Error state, and recommend remediation steps."</w:t>
+      </w:r>
+    </w:p>
+    <w:p>
+      <w:pPr>
+        <w:pStyle w:val="ListBullet"/>
+      </w:pPr>
+      <w:r>
+        <w:t>"Review our current ADT_A08_to_SDA3 DTL for: hardcoded values that should be lookup tables, missing null checks on source fields, incorrect handling of repeating PID-3 identifiers, and segments we are dropping that we should not."</w:t>
+      </w:r>
+    </w:p>
+    <w:p>
+      <w:pPr>
+        <w:pStyle w:val="Heading2"/>
+      </w:pPr>
+      <w:r>
+        <w:t>2.3 Use Case 3: Create and Optimize Transformations</w:t>
+      </w:r>
+    </w:p>
+    <w:p>
+      <w:r>
+        <w:t>Data Transformations are the heart of healthcare interoperability. Integration engineers spend most of their time writing, debugging, and optimizing DTL (Data Transformation Language) and BPL (Business Process Language) definitions that convert messages between formats -- HL7 v2 to SDA3, SDA3 to FHIR R4, CDA to SDA3, and more.</w:t>
+      </w:r>
+    </w:p>
+    <w:p>
+      <w:r>
+        <w:t>The agent assists the Builder with transformation work at every stage:</w:t>
+      </w:r>
+    </w:p>
+    <w:p>
+      <w:pPr>
+        <w:pStyle w:val="ListBullet"/>
+      </w:pPr>
+      <w:r>
+        <w:t>Pipeline Discovery: The agent traces the full transformation pipeline for any format pair (e.g., HL7 v2 to FHIR R4) showing which IRIS classes handle each step, what intermediate formats are used, and where the data flows. The Data Atlas (Transforms tab) provides this information visually at the field level.</w:t>
+      </w:r>
+    </w:p>
+    <w:p>
+      <w:pPr>
+        <w:pStyle w:val="ListBullet"/>
+      </w:pPr>
+      <w:r>
+        <w:t>DTL Creation: The agent creates new DTL definitions by first searching the HS.* catalog for existing transformations that handle the same or similar format pair, then scaffolding a new DTL with the correct source/target classes and document types. It can populate field mappings based on the Data Atlas mappings.</w:t>
+      </w:r>
+    </w:p>
+    <w:p>
+      <w:pPr>
+        <w:pStyle w:val="ListBullet"/>
+      </w:pPr>
+      <w:r>
+        <w:t>Schema Introspection: The agent can introspect HL7 v2 message schemas (segments, fields, components) and FHIR R4 resource structures so the Builder understands what data is available at each point in the pipeline. It knows about composite types (XAD for addresses, XPN for names, CX for identifiers) and can show sub-field level detail.</w:t>
+      </w:r>
+    </w:p>
+    <w:p>
+      <w:pPr>
+        <w:pStyle w:val="ListBullet"/>
+      </w:pPr>
+      <w:r>
+        <w:t>Dry-Run Testing: The agent can execute a DTL against a sample message (DryRunDTL) to verify the transformation produces the expected output without deploying to a production. It can compare before/after messages field by field.</w:t>
+      </w:r>
+    </w:p>
+    <w:p>
+      <w:pPr>
+        <w:pStyle w:val="ListBullet"/>
+      </w:pPr>
+      <w:r>
+        <w:t>Cross-Format Mapping Insights: Through the Data Atlas, the agent (and the Builder via the admin UI) can see exactly which HL7 fields map through SDA3 to FHIR, which fields are inbound-only (arrive but don't continue), and which are outbound-only (produced in the target but not sourced from the input). This enables gap analysis before writing any code.</w:t>
+      </w:r>
+    </w:p>
+    <w:p/>
+    <w:p>
+      <w:pPr>
+        <w:pStyle w:val="ListBullet"/>
+      </w:pPr>
+      <w:r>
+        <w:t>Tools involved:</w:t>
+      </w:r>
+    </w:p>
+    <w:p>
+      <w:pPr>
+        <w:pStyle w:val="ListBullet2"/>
+      </w:pPr>
+      <w:r>
+        <w:t>list_dtls -- discover existing transformations in the namespace</w:t>
+      </w:r>
+    </w:p>
+    <w:p>
+      <w:pPr>
+        <w:pStyle w:val="ListBullet2"/>
+      </w:pPr>
+      <w:r>
+        <w:t>create_dtl -- scaffold a new DTL with source/target classes</w:t>
+      </w:r>
+    </w:p>
+    <w:p>
+      <w:pPr>
+        <w:pStyle w:val="ListBullet2"/>
+      </w:pPr>
+      <w:r>
+        <w:t>update_dtl / compile_dtl -- modify and compile transformation logic</w:t>
+      </w:r>
+    </w:p>
+    <w:p>
+      <w:pPr>
+        <w:pStyle w:val="ListBullet2"/>
+      </w:pPr>
+      <w:r>
+        <w:t>dry_run_dtl -- test a transformation against sample data</w:t>
+      </w:r>
+    </w:p>
+    <w:p>
+      <w:pPr>
+        <w:pStyle w:val="ListBullet2"/>
+      </w:pPr>
+      <w:r>
+        <w:t>list_sda_fhir_dtls -- find built-in SDA3-to-FHIR transformations</w:t>
+      </w:r>
+    </w:p>
+    <w:p>
+      <w:pPr>
+        <w:pStyle w:val="ListBullet2"/>
+      </w:pPr>
+      <w:r>
+        <w:t>describe_transformation_pipeline -- trace the full format conversion path</w:t>
+      </w:r>
+    </w:p>
+    <w:p>
+      <w:pPr>
+        <w:pStyle w:val="ListBullet2"/>
+      </w:pPr>
+      <w:r>
+        <w:t>get_hl7_schema_map / get_hl7_segment_fields -- introspect HL7 v2 message structures</w:t>
+      </w:r>
+    </w:p>
+    <w:p>
+      <w:pPr>
+        <w:pStyle w:val="ListBullet2"/>
+      </w:pPr>
+      <w:r>
+        <w:t>search_hs -- semantic search for transformation classes in the HS.* catalog</w:t>
+      </w:r>
+    </w:p>
+    <w:p>
+      <w:pPr>
+        <w:pStyle w:val="ListBullet2"/>
+      </w:pPr>
+      <w:r>
+        <w:t>compare_messages -- field-level diff between two messages</w:t>
+      </w:r>
+    </w:p>
+    <w:p>
+      <w:pPr>
+        <w:pStyle w:val="ListBullet2"/>
+      </w:pPr>
+      <w:r>
+        <w:t>Skills: DTL, HL7v2, FHIRR4, SDA, CDA, X12 -- deep domain knowledge for each format</w:t>
+      </w:r>
+    </w:p>
+    <w:p/>
+    <w:p>
+      <w:r>
+        <w:t>Example prompts:</w:t>
+      </w:r>
+    </w:p>
+    <w:p>
+      <w:pPr>
+        <w:pStyle w:val="ListBullet"/>
+      </w:pPr>
+      <w:r>
+        <w:t>"Create an interface that accepts any HL7 v2 message (ADT, ORU, ORM, MDM, SIU) on a single inbound MLLP service, transforms it to the appropriate FHIR R4 resources using the built-in HL7-to-SDA-to-FHIR pipeline, and POSTs the resulting Bundle to our FHIR Server."</w:t>
+      </w:r>
+    </w:p>
+    <w:p>
+      <w:pPr>
+        <w:pStyle w:val="ListBullet"/>
+      </w:pPr>
+      <w:r>
+        <w:t>"Build a production that ingests C-CDA documents via a REST endpoint, validates them against the C-CDA R2.1 schema, transforms them to FHIR R4 Composition + DocumentReference + Patient/Encounter/Condition resources using SDA3 as the intermediate model, and persists the Bundle to our FHIR repository."</w:t>
+      </w:r>
+    </w:p>
+    <w:p>
+      <w:pPr>
+        <w:jc w:val="center"/>
+      </w:pPr>
+      <w:r>
+        <w:drawing>
+          <wp:inline xmlns:a="http://schemas.openxmlformats.org/drawingml/2006/main" xmlns:pic="http://schemas.openxmlformats.org/drawingml/2006/picture">
+            <wp:extent cx="5669280" cy="3543300"/>
+            <wp:docPr id="2" name="Picture 2"/>
+            <wp:cNvGraphicFramePr>
+              <a:graphicFrameLocks noChangeAspect="1"/>
+            </wp:cNvGraphicFramePr>
+            <a:graphic>
+              <a:graphicData uri="http://schemas.openxmlformats.org/drawingml/2006/picture">
+                <pic:pic>
+                  <pic:nvPicPr>
+                    <pic:cNvPr id="0" name="13_transforms_hl7_fhir.png"/>
+                    <pic:cNvPicPr/>
+                  </pic:nvPicPr>
+                  <pic:blipFill>
+                    <a:blip r:embed="rId10"/>
+                    <a:stretch>
+                      <a:fillRect/>
+                    </a:stretch>
+                  </pic:blipFill>
+                  <pic:spPr>
+                    <a:xfrm>
+                      <a:off x="0" y="0"/>
+                      <a:ext cx="5669280" cy="3543300"/>
+                    </a:xfrm>
+                    <a:prstGeom prst="rect"/>
+                  </pic:spPr>
+                </pic:pic>
+              </a:graphicData>
+            </a:graphic>
+          </wp:inline>
+        </w:drawing>
+      </w:r>
+    </w:p>
+    <w:p>
+      <w:pPr>
+        <w:jc w:val="center"/>
+      </w:pPr>
+      <w:r>
+        <w:rPr>
+          <w:i/>
+          <w:color w:val="666666"/>
+          <w:sz w:val="18"/>
+        </w:rPr>
+        <w:t>Figure: Data Atlas: the Transforms tab showing field-level HL7 v2 to FHIR R4 mappings through SDA3, with coverage filters and IRIS class names -- a key reference tool for Use Cases 2 and 3</w:t>
+      </w:r>
+    </w:p>
+    <w:p/>
+    <w:p>
+      <w:r>
+        <w:br w:type="page"/>
+      </w:r>
+    </w:p>
+    <w:p>
+      <w:pPr>
+        <w:pStyle w:val="Heading1"/>
+      </w:pPr>
+      <w:r>
+        <w:t>3. Developer Experience</w:t>
       </w:r>
     </w:p>
     <w:p>
@@ -333,7 +937,7 @@
         <w:pStyle w:val="Heading2"/>
       </w:pPr>
       <w:r>
-        <w:t>2.1 Security Requirements</w:t>
+        <w:t>3.1 Security Requirements</w:t>
       </w:r>
     </w:p>
     <w:tbl>
@@ -556,7 +1160,7 @@
         <w:pStyle w:val="Heading2"/>
       </w:pPr>
       <w:r>
-        <w:t>2.2 User Stories</w:t>
+        <w:t>3.2 User Stories</w:t>
       </w:r>
     </w:p>
     <w:p>
@@ -887,7 +1491,7 @@
         <w:pStyle w:val="Heading1"/>
       </w:pPr>
       <w:r>
-        <w:t>3. Builder Experience - Admin UI</w:t>
+        <w:t>4. Builder Experience - Admin UI</w:t>
       </w:r>
     </w:p>
     <w:p>
@@ -905,7 +1509,7 @@
         <w:pStyle w:val="Heading2"/>
       </w:pPr>
       <w:r>
-        <w:t>3.1 Security Requirements</w:t>
+        <w:t>4.1 Security Requirements</w:t>
       </w:r>
     </w:p>
     <w:tbl>
@@ -1100,7 +1704,7 @@
         <w:pStyle w:val="Heading2"/>
       </w:pPr>
       <w:r>
-        <w:t>3.2 US-B01: Configure an LLM Connection</w:t>
+        <w:t>4.2 US-B01: Configure an LLM Connection</w:t>
       </w:r>
     </w:p>
     <w:p>
@@ -1121,7 +1725,7 @@
         <w:drawing>
           <wp:inline xmlns:a="http://schemas.openxmlformats.org/drawingml/2006/main" xmlns:pic="http://schemas.openxmlformats.org/drawingml/2006/picture">
             <wp:extent cx="5669280" cy="3543300"/>
-            <wp:docPr id="1" name="Picture 1"/>
+            <wp:docPr id="3" name="Picture 3"/>
             <wp:cNvGraphicFramePr>
               <a:graphicFrameLocks noChangeAspect="1"/>
             </wp:cNvGraphicFramePr>
@@ -1130,6 +1734,798 @@
                 <pic:pic>
                   <pic:nvPicPr>
                     <pic:cNvPr id="0" name="09_connections_list.png"/>
+                    <pic:cNvPicPr/>
+                  </pic:nvPicPr>
+                  <pic:blipFill>
+                    <a:blip r:embed="rId11"/>
+                    <a:stretch>
+                      <a:fillRect/>
+                    </a:stretch>
+                  </pic:blipFill>
+                  <pic:spPr>
+                    <a:xfrm>
+                      <a:off x="0" y="0"/>
+                      <a:ext cx="5669280" cy="3543300"/>
+                    </a:xfrm>
+                    <a:prstGeom prst="rect"/>
+                  </pic:spPr>
+                </pic:pic>
+              </a:graphicData>
+            </a:graphic>
+          </wp:inline>
+        </w:drawing>
+      </w:r>
+    </w:p>
+    <w:p>
+      <w:pPr>
+        <w:jc w:val="center"/>
+      </w:pPr>
+      <w:r>
+        <w:rPr>
+          <w:i/>
+          <w:color w:val="666666"/>
+          <w:sz w:val="18"/>
+        </w:rPr>
+        <w:t>Figure: Connections tab showing the configured AWS Bedrock connection with DEFAULT and CORE badges, green status dot</w:t>
+      </w:r>
+    </w:p>
+    <w:p/>
+    <w:p>
+      <w:r>
+        <w:t>Clicking a connection opens the detail editor with all configuration fields:</w:t>
+      </w:r>
+    </w:p>
+    <w:p>
+      <w:pPr>
+        <w:jc w:val="center"/>
+      </w:pPr>
+      <w:r>
+        <w:drawing>
+          <wp:inline xmlns:a="http://schemas.openxmlformats.org/drawingml/2006/main" xmlns:pic="http://schemas.openxmlformats.org/drawingml/2006/picture">
+            <wp:extent cx="5669280" cy="3543300"/>
+            <wp:docPr id="4" name="Picture 4"/>
+            <wp:cNvGraphicFramePr>
+              <a:graphicFrameLocks noChangeAspect="1"/>
+            </wp:cNvGraphicFramePr>
+            <a:graphic>
+              <a:graphicData uri="http://schemas.openxmlformats.org/drawingml/2006/picture">
+                <pic:pic>
+                  <pic:nvPicPr>
+                    <pic:cNvPr id="0" name="10_connection_detail.png"/>
+                    <pic:cNvPicPr/>
+                  </pic:nvPicPr>
+                  <pic:blipFill>
+                    <a:blip r:embed="rId12"/>
+                    <a:stretch>
+                      <a:fillRect/>
+                    </a:stretch>
+                  </pic:blipFill>
+                  <pic:spPr>
+                    <a:xfrm>
+                      <a:off x="0" y="0"/>
+                      <a:ext cx="5669280" cy="3543300"/>
+                    </a:xfrm>
+                    <a:prstGeom prst="rect"/>
+                  </pic:spPr>
+                </pic:pic>
+              </a:graphicData>
+            </a:graphic>
+          </wp:inline>
+        </w:drawing>
+      </w:r>
+    </w:p>
+    <w:p>
+      <w:pPr>
+        <w:jc w:val="center"/>
+      </w:pPr>
+      <w:r>
+        <w:rPr>
+          <w:i/>
+          <w:color w:val="666666"/>
+          <w:sz w:val="18"/>
+        </w:rPr>
+        <w:t>Figure: Connection detail editor showing provider, model, region, API key (masked), and Test Connection button with green TESTED OK status</w:t>
+      </w:r>
+    </w:p>
+    <w:p/>
+    <w:p>
+      <w:pPr>
+        <w:pStyle w:val="Heading2"/>
+      </w:pPr>
+      <w:r>
+        <w:t>4.3 US-B02: Configure the Agent</w:t>
+      </w:r>
+    </w:p>
+    <w:p>
+      <w:r>
+        <w:t>As a Builder, I want to customize the agent's system prompt, temperature, max iterations, bound MCPs, and skills, so that the agent behaves according to our integration requirements.</w:t>
+      </w:r>
+    </w:p>
+    <w:p>
+      <w:pPr>
+        <w:jc w:val="center"/>
+      </w:pPr>
+      <w:r>
+        <w:drawing>
+          <wp:inline xmlns:a="http://schemas.openxmlformats.org/drawingml/2006/main" xmlns:pic="http://schemas.openxmlformats.org/drawingml/2006/picture">
+            <wp:extent cx="5669280" cy="3543300"/>
+            <wp:docPr id="5" name="Picture 5"/>
+            <wp:cNvGraphicFramePr>
+              <a:graphicFrameLocks noChangeAspect="1"/>
+            </wp:cNvGraphicFramePr>
+            <a:graphic>
+              <a:graphicData uri="http://schemas.openxmlformats.org/drawingml/2006/picture">
+                <pic:pic>
+                  <pic:nvPicPr>
+                    <pic:cNvPr id="0" name="02_agent_detail.png"/>
+                    <pic:cNvPicPr/>
+                  </pic:nvPicPr>
+                  <pic:blipFill>
+                    <a:blip r:embed="rId13"/>
+                    <a:stretch>
+                      <a:fillRect/>
+                    </a:stretch>
+                  </pic:blipFill>
+                  <pic:spPr>
+                    <a:xfrm>
+                      <a:off x="0" y="0"/>
+                      <a:ext cx="5669280" cy="3543300"/>
+                    </a:xfrm>
+                    <a:prstGeom prst="rect"/>
+                  </pic:spPr>
+                </pic:pic>
+              </a:graphicData>
+            </a:graphic>
+          </wp:inline>
+        </w:drawing>
+      </w:r>
+    </w:p>
+    <w:p>
+      <w:pPr>
+        <w:jc w:val="center"/>
+      </w:pPr>
+      <w:r>
+        <w:rPr>
+          <w:i/>
+          <w:color w:val="666666"/>
+          <w:sz w:val="18"/>
+        </w:rPr>
+        <w:t>Figure: Agent editor showing the HealthInterop agent configuration: class name, temperature slider, max iterations, tool binding mode, system prompt with persona and formatting rules</w:t>
+      </w:r>
+    </w:p>
+    <w:p/>
+    <w:p>
+      <w:pPr>
+        <w:pStyle w:val="Heading2"/>
+      </w:pPr>
+      <w:r>
+        <w:t>4.4 US-B03: Configure MCP Servers</w:t>
+      </w:r>
+    </w:p>
+    <w:p>
+      <w:r>
+        <w:t>As a Builder, I want to enable/disable MCP servers and customize their descriptions, so that I can control which capability domains the agent has access to.</w:t>
+      </w:r>
+    </w:p>
+    <w:p>
+      <w:pPr>
+        <w:jc w:val="center"/>
+      </w:pPr>
+      <w:r>
+        <w:drawing>
+          <wp:inline xmlns:a="http://schemas.openxmlformats.org/drawingml/2006/main" xmlns:pic="http://schemas.openxmlformats.org/drawingml/2006/picture">
+            <wp:extent cx="5669280" cy="3543300"/>
+            <wp:docPr id="6" name="Picture 6"/>
+            <wp:cNvGraphicFramePr>
+              <a:graphicFrameLocks noChangeAspect="1"/>
+            </wp:cNvGraphicFramePr>
+            <a:graphic>
+              <a:graphicData uri="http://schemas.openxmlformats.org/drawingml/2006/picture">
+                <pic:pic>
+                  <pic:nvPicPr>
+                    <pic:cNvPr id="0" name="03_mcps_list.png"/>
+                    <pic:cNvPicPr/>
+                  </pic:nvPicPr>
+                  <pic:blipFill>
+                    <a:blip r:embed="rId14"/>
+                    <a:stretch>
+                      <a:fillRect/>
+                    </a:stretch>
+                  </pic:blipFill>
+                  <pic:spPr>
+                    <a:xfrm>
+                      <a:off x="0" y="0"/>
+                      <a:ext cx="5669280" cy="3543300"/>
+                    </a:xfrm>
+                    <a:prstGeom prst="rect"/>
+                  </pic:spPr>
+                </pic:pic>
+              </a:graphicData>
+            </a:graphic>
+          </wp:inline>
+        </w:drawing>
+      </w:r>
+    </w:p>
+    <w:p>
+      <w:pPr>
+        <w:jc w:val="center"/>
+      </w:pPr>
+      <w:r>
+        <w:rPr>
+          <w:i/>
+          <w:color w:val="666666"/>
+          <w:sz w:val="18"/>
+        </w:rPr>
+        <w:t>Figure: MCPs tab showing the four MCP servers: catalog, production, testing, and transform, each with their class name, description, and toolset count</w:t>
+      </w:r>
+    </w:p>
+    <w:p/>
+    <w:p>
+      <w:pPr>
+        <w:pStyle w:val="Heading2"/>
+      </w:pPr>
+      <w:r>
+        <w:t>4.5 US-B04: Configure ToolSets and Tools</w:t>
+      </w:r>
+    </w:p>
+    <w:p>
+      <w:r>
+        <w:t>As a Builder, I want to view and customize ToolSets and their individual tools, so that I can tune tool descriptions, toggle tools on/off, and dry-run tools.</w:t>
+      </w:r>
+    </w:p>
+    <w:p>
+      <w:pPr>
+        <w:jc w:val="center"/>
+      </w:pPr>
+      <w:r>
+        <w:drawing>
+          <wp:inline xmlns:a="http://schemas.openxmlformats.org/drawingml/2006/main" xmlns:pic="http://schemas.openxmlformats.org/drawingml/2006/picture">
+            <wp:extent cx="5669280" cy="3543300"/>
+            <wp:docPr id="7" name="Picture 7"/>
+            <wp:cNvGraphicFramePr>
+              <a:graphicFrameLocks noChangeAspect="1"/>
+            </wp:cNvGraphicFramePr>
+            <a:graphic>
+              <a:graphicData uri="http://schemas.openxmlformats.org/drawingml/2006/picture">
+                <pic:pic>
+                  <pic:nvPicPr>
+                    <pic:cNvPr id="0" name="04_toolsets_list.png"/>
+                    <pic:cNvPicPr/>
+                  </pic:nvPicPr>
+                  <pic:blipFill>
+                    <a:blip r:embed="rId15"/>
+                    <a:stretch>
+                      <a:fillRect/>
+                    </a:stretch>
+                  </pic:blipFill>
+                  <pic:spPr>
+                    <a:xfrm>
+                      <a:off x="0" y="0"/>
+                      <a:ext cx="5669280" cy="3543300"/>
+                    </a:xfrm>
+                    <a:prstGeom prst="rect"/>
+                  </pic:spPr>
+                </pic:pic>
+              </a:graphicData>
+            </a:graphic>
+          </wp:inline>
+        </w:drawing>
+      </w:r>
+    </w:p>
+    <w:p>
+      <w:pPr>
+        <w:jc w:val="center"/>
+      </w:pPr>
+      <w:r>
+        <w:rPr>
+          <w:i/>
+          <w:color w:val="666666"/>
+          <w:sz w:val="18"/>
+        </w:rPr>
+        <w:t>Figure: ToolSets tab showing the five ToolSets: Catalog (8 tools), Monitoring (6 tools), Production (13 tools), Testing (8 tools), Transform (13 tools)</w:t>
+      </w:r>
+    </w:p>
+    <w:p/>
+    <w:p>
+      <w:pPr>
+        <w:jc w:val="center"/>
+      </w:pPr>
+      <w:r>
+        <w:drawing>
+          <wp:inline xmlns:a="http://schemas.openxmlformats.org/drawingml/2006/main" xmlns:pic="http://schemas.openxmlformats.org/drawingml/2006/picture">
+            <wp:extent cx="5669280" cy="3543300"/>
+            <wp:docPr id="8" name="Picture 8"/>
+            <wp:cNvGraphicFramePr>
+              <a:graphicFrameLocks noChangeAspect="1"/>
+            </wp:cNvGraphicFramePr>
+            <a:graphic>
+              <a:graphicData uri="http://schemas.openxmlformats.org/drawingml/2006/picture">
+                <pic:pic>
+                  <pic:nvPicPr>
+                    <pic:cNvPr id="0" name="05_tools_list.png"/>
+                    <pic:cNvPicPr/>
+                  </pic:nvPicPr>
+                  <pic:blipFill>
+                    <a:blip r:embed="rId16"/>
+                    <a:stretch>
+                      <a:fillRect/>
+                    </a:stretch>
+                  </pic:blipFill>
+                  <pic:spPr>
+                    <a:xfrm>
+                      <a:off x="0" y="0"/>
+                      <a:ext cx="5669280" cy="3543300"/>
+                    </a:xfrm>
+                    <a:prstGeom prst="rect"/>
+                  </pic:spPr>
+                </pic:pic>
+              </a:graphicData>
+            </a:graphic>
+          </wp:inline>
+        </w:drawing>
+      </w:r>
+    </w:p>
+    <w:p>
+      <w:pPr>
+        <w:jc w:val="center"/>
+      </w:pPr>
+      <w:r>
+        <w:rPr>
+          <w:i/>
+          <w:color w:val="666666"/>
+          <w:sz w:val="18"/>
+        </w:rPr>
+        <w:t>Figure: Tools tab listing all 42 tools across the five ToolSet classes, sorted alphabetically</w:t>
+      </w:r>
+    </w:p>
+    <w:p/>
+    <w:p>
+      <w:r>
+        <w:t>Clicking a tool opens the detail editor with the LLM-facing description and input schema:</w:t>
+      </w:r>
+    </w:p>
+    <w:p>
+      <w:pPr>
+        <w:jc w:val="center"/>
+      </w:pPr>
+      <w:r>
+        <w:drawing>
+          <wp:inline xmlns:a="http://schemas.openxmlformats.org/drawingml/2006/main" xmlns:pic="http://schemas.openxmlformats.org/drawingml/2006/picture">
+            <wp:extent cx="5669280" cy="3543300"/>
+            <wp:docPr id="9" name="Picture 9"/>
+            <wp:cNvGraphicFramePr>
+              <a:graphicFrameLocks noChangeAspect="1"/>
+            </wp:cNvGraphicFramePr>
+            <a:graphic>
+              <a:graphicData uri="http://schemas.openxmlformats.org/drawingml/2006/picture">
+                <pic:pic>
+                  <pic:nvPicPr>
+                    <pic:cNvPr id="0" name="06_tool_detail.png"/>
+                    <pic:cNvPicPr/>
+                  </pic:nvPicPr>
+                  <pic:blipFill>
+                    <a:blip r:embed="rId17"/>
+                    <a:stretch>
+                      <a:fillRect/>
+                    </a:stretch>
+                  </pic:blipFill>
+                  <pic:spPr>
+                    <a:xfrm>
+                      <a:off x="0" y="0"/>
+                      <a:ext cx="5669280" cy="3543300"/>
+                    </a:xfrm>
+                    <a:prstGeom prst="rect"/>
+                  </pic:spPr>
+                </pic:pic>
+              </a:graphicData>
+            </a:graphic>
+          </wp:inline>
+        </w:drawing>
+      </w:r>
+    </w:p>
+    <w:p>
+      <w:pPr>
+        <w:jc w:val="center"/>
+      </w:pPr>
+      <w:r>
+        <w:rPr>
+          <w:i/>
+          <w:color w:val="666666"/>
+          <w:sz w:val="18"/>
+        </w:rPr>
+        <w:t>Figure: Tool detail editor for DescribeClass showing the contract-style description, method signature, JSON input schema, implementation kind, timeout, and confirmation requirement</w:t>
+      </w:r>
+    </w:p>
+    <w:p/>
+    <w:p>
+      <w:pPr>
+        <w:pStyle w:val="Heading2"/>
+      </w:pPr>
+      <w:r>
+        <w:t>4.6 US-B05: Configure Skills</w:t>
+      </w:r>
+    </w:p>
+    <w:p>
+      <w:r>
+        <w:t>As a Builder, I want to view and edit the INSTRUCTIONS content for each skill, so that I can refine the agent's domain knowledge without Developer involvement.</w:t>
+      </w:r>
+    </w:p>
+    <w:p>
+      <w:pPr>
+        <w:jc w:val="center"/>
+      </w:pPr>
+      <w:r>
+        <w:drawing>
+          <wp:inline xmlns:a="http://schemas.openxmlformats.org/drawingml/2006/main" xmlns:pic="http://schemas.openxmlformats.org/drawingml/2006/picture">
+            <wp:extent cx="5669280" cy="3543300"/>
+            <wp:docPr id="10" name="Picture 10"/>
+            <wp:cNvGraphicFramePr>
+              <a:graphicFrameLocks noChangeAspect="1"/>
+            </wp:cNvGraphicFramePr>
+            <a:graphic>
+              <a:graphicData uri="http://schemas.openxmlformats.org/drawingml/2006/picture">
+                <pic:pic>
+                  <pic:nvPicPr>
+                    <pic:cNvPr id="0" name="07_skills_list.png"/>
+                    <pic:cNvPicPr/>
+                  </pic:nvPicPr>
+                  <pic:blipFill>
+                    <a:blip r:embed="rId18"/>
+                    <a:stretch>
+                      <a:fillRect/>
+                    </a:stretch>
+                  </pic:blipFill>
+                  <pic:spPr>
+                    <a:xfrm>
+                      <a:off x="0" y="0"/>
+                      <a:ext cx="5669280" cy="3543300"/>
+                    </a:xfrm>
+                    <a:prstGeom prst="rect"/>
+                  </pic:spPr>
+                </pic:pic>
+              </a:graphicData>
+            </a:graphic>
+          </wp:inline>
+        </w:drawing>
+      </w:r>
+    </w:p>
+    <w:p>
+      <w:pPr>
+        <w:jc w:val="center"/>
+      </w:pPr>
+      <w:r>
+        <w:rPr>
+          <w:i/>
+          <w:color w:val="666666"/>
+          <w:sz w:val="18"/>
+        </w:rPr>
+        <w:t>Figure: Skills tab showing the 12 shipped skills: Adapters, BPL, CDA, DTL, ESBPattern, FHIRR4, HL7v2, Productions, and more</w:t>
+      </w:r>
+    </w:p>
+    <w:p/>
+    <w:p>
+      <w:pPr>
+        <w:jc w:val="center"/>
+      </w:pPr>
+      <w:r>
+        <w:drawing>
+          <wp:inline xmlns:a="http://schemas.openxmlformats.org/drawingml/2006/main" xmlns:pic="http://schemas.openxmlformats.org/drawingml/2006/picture">
+            <wp:extent cx="5669280" cy="3543300"/>
+            <wp:docPr id="11" name="Picture 11"/>
+            <wp:cNvGraphicFramePr>
+              <a:graphicFrameLocks noChangeAspect="1"/>
+            </wp:cNvGraphicFramePr>
+            <a:graphic>
+              <a:graphicData uri="http://schemas.openxmlformats.org/drawingml/2006/picture">
+                <pic:pic>
+                  <pic:nvPicPr>
+                    <pic:cNvPr id="0" name="08_skill_detail.png"/>
+                    <pic:cNvPicPr/>
+                  </pic:nvPicPr>
+                  <pic:blipFill>
+                    <a:blip r:embed="rId19"/>
+                    <a:stretch>
+                      <a:fillRect/>
+                    </a:stretch>
+                  </pic:blipFill>
+                  <pic:spPr>
+                    <a:xfrm>
+                      <a:off x="0" y="0"/>
+                      <a:ext cx="5669280" cy="3543300"/>
+                    </a:xfrm>
+                    <a:prstGeom prst="rect"/>
+                  </pic:spPr>
+                </pic:pic>
+              </a:graphicData>
+            </a:graphic>
+          </wp:inline>
+        </w:drawing>
+      </w:r>
+    </w:p>
+    <w:p>
+      <w:pPr>
+        <w:jc w:val="center"/>
+      </w:pPr>
+      <w:r>
+        <w:rPr>
+          <w:i/>
+          <w:color w:val="666666"/>
+          <w:sz w:val="18"/>
+        </w:rPr>
+        <w:t>Figure: Skill editor for Adapters showing the class name, description field, bound ToolSets, and expandable class source viewer</w:t>
+      </w:r>
+    </w:p>
+    <w:p/>
+    <w:p>
+      <w:pPr>
+        <w:pStyle w:val="Heading2"/>
+      </w:pPr>
+      <w:r>
+        <w:t>4.7 US-B06: Review Transformation Mappings (Data Atlas)</w:t>
+      </w:r>
+    </w:p>
+    <w:p>
+      <w:r>
+        <w:t>As a Builder, I want to explore field-level mappings between HL7 v2, SDA3, and FHIR R4 formats, so that I can understand how data flows through the transformation pipeline and identify which IRIS classes handle each mapping.</w:t>
+      </w:r>
+    </w:p>
+    <w:p>
+      <w:r>
+        <w:t>The Transforms tab provides a Data Atlas: a visual field-level mapping explorer. The user selects a source format (e.g., HL7 v2) and target format (e.g., FHIR R4), then browses SDA3 data types in the sidebar. For each type, the three-column table shows:</w:t>
+      </w:r>
+    </w:p>
+    <w:p>
+      <w:pPr>
+        <w:pStyle w:val="ListBullet"/>
+      </w:pPr>
+      <w:r>
+        <w:t>Source field (e.g., PID.11.3 City) with the IRIS class that performs the inbound mapping</w:t>
+      </w:r>
+    </w:p>
+    <w:p>
+      <w:pPr>
+        <w:pStyle w:val="ListBullet"/>
+      </w:pPr>
+      <w:r>
+        <w:t>SDA3 canonical field (e.g., City)</w:t>
+      </w:r>
+    </w:p>
+    <w:p>
+      <w:pPr>
+        <w:pStyle w:val="ListBullet"/>
+      </w:pPr>
+      <w:r>
+        <w:t>Target field (e.g., city) with the IRIS class that performs the outbound mapping</w:t>
+      </w:r>
+    </w:p>
+    <w:p>
+      <w:pPr>
+        <w:jc w:val="center"/>
+      </w:pPr>
+      <w:r>
+        <w:drawing>
+          <wp:inline xmlns:a="http://schemas.openxmlformats.org/drawingml/2006/main" xmlns:pic="http://schemas.openxmlformats.org/drawingml/2006/picture">
+            <wp:extent cx="5669280" cy="3543300"/>
+            <wp:docPr id="12" name="Picture 12"/>
+            <wp:cNvGraphicFramePr>
+              <a:graphicFrameLocks noChangeAspect="1"/>
+            </wp:cNvGraphicFramePr>
+            <a:graphic>
+              <a:graphicData uri="http://schemas.openxmlformats.org/drawingml/2006/picture">
+                <pic:pic>
+                  <pic:nvPicPr>
+                    <pic:cNvPr id="0" name="13_transforms_hl7_fhir.png"/>
+                    <pic:cNvPicPr/>
+                  </pic:nvPicPr>
+                  <pic:blipFill>
+                    <a:blip r:embed="rId10"/>
+                    <a:stretch>
+                      <a:fillRect/>
+                    </a:stretch>
+                  </pic:blipFill>
+                  <pic:spPr>
+                    <a:xfrm>
+                      <a:off x="0" y="0"/>
+                      <a:ext cx="5669280" cy="3543300"/>
+                    </a:xfrm>
+                    <a:prstGeom prst="rect"/>
+                  </pic:spPr>
+                </pic:pic>
+              </a:graphicData>
+            </a:graphic>
+          </wp:inline>
+        </w:drawing>
+      </w:r>
+    </w:p>
+    <w:p>
+      <w:pPr>
+        <w:jc w:val="center"/>
+      </w:pPr>
+      <w:r>
+        <w:rPr>
+          <w:i/>
+          <w:color w:val="666666"/>
+          <w:sz w:val="18"/>
+        </w:rPr>
+        <w:t>Figure: Data Atlas: HL7 v2 to FHIR R4 via SDA3.Address, showing sub-field level mappings (PID.11.3 City, PID.11.6 Country), coverage filter chips (End-to-end, Inbound only, Outbound only), and IRIS class names inline (HS.Gateway.HL7.HL7ToSDA3, HS.FHIR.DTL.SDA3.vR4.Address.Address)</w:t>
+      </w:r>
+    </w:p>
+    <w:p/>
+    <w:p>
+      <w:pPr>
+        <w:pStyle w:val="Heading2"/>
+      </w:pPr>
+      <w:r>
+        <w:t>4.8 US-B07: Browse Vector Catalogs</w:t>
+      </w:r>
+    </w:p>
+    <w:p>
+      <w:r>
+        <w:t>As a Builder, I want to search the Ens.* and HS.* vector catalogs to find Business Hosts, adapters, and transformation classes.</w:t>
+      </w:r>
+    </w:p>
+    <w:p>
+      <w:pPr>
+        <w:jc w:val="center"/>
+      </w:pPr>
+      <w:r>
+        <w:drawing>
+          <wp:inline xmlns:a="http://schemas.openxmlformats.org/drawingml/2006/main" xmlns:pic="http://schemas.openxmlformats.org/drawingml/2006/picture">
+            <wp:extent cx="5669280" cy="3543300"/>
+            <wp:docPr id="13" name="Picture 13"/>
+            <wp:cNvGraphicFramePr>
+              <a:graphicFrameLocks noChangeAspect="1"/>
+            </wp:cNvGraphicFramePr>
+            <a:graphic>
+              <a:graphicData uri="http://schemas.openxmlformats.org/drawingml/2006/picture">
+                <pic:pic>
+                  <pic:nvPicPr>
+                    <pic:cNvPr id="0" name="11_catalogs.png"/>
+                    <pic:cNvPicPr/>
+                  </pic:nvPicPr>
+                  <pic:blipFill>
+                    <a:blip r:embed="rId20"/>
+                    <a:stretch>
+                      <a:fillRect/>
+                    </a:stretch>
+                  </pic:blipFill>
+                  <pic:spPr>
+                    <a:xfrm>
+                      <a:off x="0" y="0"/>
+                      <a:ext cx="5669280" cy="3543300"/>
+                    </a:xfrm>
+                    <a:prstGeom prst="rect"/>
+                  </pic:spPr>
+                </pic:pic>
+              </a:graphicData>
+            </a:graphic>
+          </wp:inline>
+        </w:drawing>
+      </w:r>
+    </w:p>
+    <w:p>
+      <w:pPr>
+        <w:jc w:val="center"/>
+      </w:pPr>
+      <w:r>
+        <w:rPr>
+          <w:i/>
+          <w:color w:val="666666"/>
+          <w:sz w:val="18"/>
+        </w:rPr>
+        <w:t>Figure: Catalogs tab showing search_ens (164 rows indexed) and search_hs (58 rows indexed) catalogs with kind breakdowns, rebuild buttons, test search panel, and browse panel</w:t>
+      </w:r>
+    </w:p>
+    <w:p/>
+    <w:p>
+      <w:pPr>
+        <w:pStyle w:val="Heading2"/>
+      </w:pPr>
+      <w:r>
+        <w:t>4.9 US-B08: View Audit Log</w:t>
+      </w:r>
+    </w:p>
+    <w:p>
+      <w:r>
+        <w:t>As a Builder, I want to view the audit trail of all API requests, so that I can track who did what, when, and how long it took.</w:t>
+      </w:r>
+    </w:p>
+    <w:p>
+      <w:pPr>
+        <w:jc w:val="center"/>
+      </w:pPr>
+      <w:r>
+        <w:drawing>
+          <wp:inline xmlns:a="http://schemas.openxmlformats.org/drawingml/2006/main" xmlns:pic="http://schemas.openxmlformats.org/drawingml/2006/picture">
+            <wp:extent cx="5669280" cy="3543300"/>
+            <wp:docPr id="14" name="Picture 14"/>
+            <wp:cNvGraphicFramePr>
+              <a:graphicFrameLocks noChangeAspect="1"/>
+            </wp:cNvGraphicFramePr>
+            <a:graphic>
+              <a:graphicData uri="http://schemas.openxmlformats.org/drawingml/2006/picture">
+                <pic:pic>
+                  <pic:nvPicPr>
+                    <pic:cNvPr id="0" name="14_audit.png"/>
+                    <pic:cNvPicPr/>
+                  </pic:nvPicPr>
+                  <pic:blipFill>
+                    <a:blip r:embed="rId21"/>
+                    <a:stretch>
+                      <a:fillRect/>
+                    </a:stretch>
+                  </pic:blipFill>
+                  <pic:spPr>
+                    <a:xfrm>
+                      <a:off x="0" y="0"/>
+                      <a:ext cx="5669280" cy="3543300"/>
+                    </a:xfrm>
+                    <a:prstGeom prst="rect"/>
+                  </pic:spPr>
+                </pic:pic>
+              </a:graphicData>
+            </a:graphic>
+          </wp:inline>
+        </w:drawing>
+      </w:r>
+    </w:p>
+    <w:p>
+      <w:pPr>
+        <w:jc w:val="center"/>
+      </w:pPr>
+      <w:r>
+        <w:rPr>
+          <w:i/>
+          <w:color w:val="666666"/>
+          <w:sz w:val="18"/>
+        </w:rPr>
+        <w:t>Figure: Audit tab showing the request log with status codes, HTTP methods, paths, kind classification, timestamps, usernames, namespace, duration, and byte counts</w:t>
+      </w:r>
+    </w:p>
+    <w:p/>
+    <w:p>
+      <w:r>
+        <w:br w:type="page"/>
+      </w:r>
+    </w:p>
+    <w:p>
+      <w:pPr>
+        <w:pStyle w:val="Heading1"/>
+      </w:pPr>
+      <w:r>
+        <w:t>5. Builder Experience - Chatbot</w:t>
+      </w:r>
+    </w:p>
+    <w:p>
+      <w:pPr>
+        <w:pStyle w:val="Heading2"/>
+      </w:pPr>
+      <w:r>
+        <w:t>5.1 US-B09: Chat with the Agent</w:t>
+      </w:r>
+    </w:p>
+    <w:p>
+      <w:r>
+        <w:t>As a Builder, I want to type a natural-language request (e.g., 'build me a production that ingests ADT messages and routes them to two downstream systems'), so that the agent searches catalogs, proposes hosts, asks for confirmation, creates the production, sends a test HL7 message, and validates the result.</w:t>
+      </w:r>
+    </w:p>
+    <w:p>
+      <w:pPr>
+        <w:jc w:val="center"/>
+      </w:pPr>
+      <w:r>
+        <w:drawing>
+          <wp:inline xmlns:a="http://schemas.openxmlformats.org/drawingml/2006/main" xmlns:pic="http://schemas.openxmlformats.org/drawingml/2006/picture">
+            <wp:extent cx="5669280" cy="3543300"/>
+            <wp:docPr id="15" name="Picture 15"/>
+            <wp:cNvGraphicFramePr>
+              <a:graphicFrameLocks noChangeAspect="1"/>
+            </wp:cNvGraphicFramePr>
+            <a:graphic>
+              <a:graphicData uri="http://schemas.openxmlformats.org/drawingml/2006/picture">
+                <pic:pic>
+                  <pic:nvPicPr>
+                    <pic:cNvPr id="0" name="15_chatbot.png"/>
                     <pic:cNvPicPr/>
                   </pic:nvPicPr>
                   <pic:blipFill>
@@ -1162,798 +2558,6 @@
           <w:color w:val="666666"/>
           <w:sz w:val="18"/>
         </w:rPr>
-        <w:t>Figure: Connections tab showing the configured AWS Bedrock connection with DEFAULT and CORE badges, green status dot</w:t>
-      </w:r>
-    </w:p>
-    <w:p/>
-    <w:p>
-      <w:r>
-        <w:t>Clicking a connection opens the detail editor with all configuration fields:</w:t>
-      </w:r>
-    </w:p>
-    <w:p>
-      <w:pPr>
-        <w:jc w:val="center"/>
-      </w:pPr>
-      <w:r>
-        <w:drawing>
-          <wp:inline xmlns:a="http://schemas.openxmlformats.org/drawingml/2006/main" xmlns:pic="http://schemas.openxmlformats.org/drawingml/2006/picture">
-            <wp:extent cx="5669280" cy="3543300"/>
-            <wp:docPr id="2" name="Picture 2"/>
-            <wp:cNvGraphicFramePr>
-              <a:graphicFrameLocks noChangeAspect="1"/>
-            </wp:cNvGraphicFramePr>
-            <a:graphic>
-              <a:graphicData uri="http://schemas.openxmlformats.org/drawingml/2006/picture">
-                <pic:pic>
-                  <pic:nvPicPr>
-                    <pic:cNvPr id="0" name="10_connection_detail.png"/>
-                    <pic:cNvPicPr/>
-                  </pic:nvPicPr>
-                  <pic:blipFill>
-                    <a:blip r:embed="rId10"/>
-                    <a:stretch>
-                      <a:fillRect/>
-                    </a:stretch>
-                  </pic:blipFill>
-                  <pic:spPr>
-                    <a:xfrm>
-                      <a:off x="0" y="0"/>
-                      <a:ext cx="5669280" cy="3543300"/>
-                    </a:xfrm>
-                    <a:prstGeom prst="rect"/>
-                  </pic:spPr>
-                </pic:pic>
-              </a:graphicData>
-            </a:graphic>
-          </wp:inline>
-        </w:drawing>
-      </w:r>
-    </w:p>
-    <w:p>
-      <w:pPr>
-        <w:jc w:val="center"/>
-      </w:pPr>
-      <w:r>
-        <w:rPr>
-          <w:i/>
-          <w:color w:val="666666"/>
-          <w:sz w:val="18"/>
-        </w:rPr>
-        <w:t>Figure: Connection detail editor showing provider, model, region, API key (masked), and Test Connection button with green TESTED OK status</w:t>
-      </w:r>
-    </w:p>
-    <w:p/>
-    <w:p>
-      <w:pPr>
-        <w:pStyle w:val="Heading2"/>
-      </w:pPr>
-      <w:r>
-        <w:t>3.3 US-B02: Configure the Agent</w:t>
-      </w:r>
-    </w:p>
-    <w:p>
-      <w:r>
-        <w:t>As a Builder, I want to customize the agent's system prompt, temperature, max iterations, bound MCPs, and skills, so that the agent behaves according to our integration requirements.</w:t>
-      </w:r>
-    </w:p>
-    <w:p>
-      <w:pPr>
-        <w:jc w:val="center"/>
-      </w:pPr>
-      <w:r>
-        <w:drawing>
-          <wp:inline xmlns:a="http://schemas.openxmlformats.org/drawingml/2006/main" xmlns:pic="http://schemas.openxmlformats.org/drawingml/2006/picture">
-            <wp:extent cx="5669280" cy="3543300"/>
-            <wp:docPr id="3" name="Picture 3"/>
-            <wp:cNvGraphicFramePr>
-              <a:graphicFrameLocks noChangeAspect="1"/>
-            </wp:cNvGraphicFramePr>
-            <a:graphic>
-              <a:graphicData uri="http://schemas.openxmlformats.org/drawingml/2006/picture">
-                <pic:pic>
-                  <pic:nvPicPr>
-                    <pic:cNvPr id="0" name="02_agent_detail.png"/>
-                    <pic:cNvPicPr/>
-                  </pic:nvPicPr>
-                  <pic:blipFill>
-                    <a:blip r:embed="rId11"/>
-                    <a:stretch>
-                      <a:fillRect/>
-                    </a:stretch>
-                  </pic:blipFill>
-                  <pic:spPr>
-                    <a:xfrm>
-                      <a:off x="0" y="0"/>
-                      <a:ext cx="5669280" cy="3543300"/>
-                    </a:xfrm>
-                    <a:prstGeom prst="rect"/>
-                  </pic:spPr>
-                </pic:pic>
-              </a:graphicData>
-            </a:graphic>
-          </wp:inline>
-        </w:drawing>
-      </w:r>
-    </w:p>
-    <w:p>
-      <w:pPr>
-        <w:jc w:val="center"/>
-      </w:pPr>
-      <w:r>
-        <w:rPr>
-          <w:i/>
-          <w:color w:val="666666"/>
-          <w:sz w:val="18"/>
-        </w:rPr>
-        <w:t>Figure: Agent editor showing the HealthInterop agent configuration: class name, temperature slider, max iterations, tool binding mode, system prompt with persona and formatting rules</w:t>
-      </w:r>
-    </w:p>
-    <w:p/>
-    <w:p>
-      <w:pPr>
-        <w:pStyle w:val="Heading2"/>
-      </w:pPr>
-      <w:r>
-        <w:t>3.4 US-B03: Configure MCP Servers</w:t>
-      </w:r>
-    </w:p>
-    <w:p>
-      <w:r>
-        <w:t>As a Builder, I want to enable/disable MCP servers and customize their descriptions, so that I can control which capability domains the agent has access to.</w:t>
-      </w:r>
-    </w:p>
-    <w:p>
-      <w:pPr>
-        <w:jc w:val="center"/>
-      </w:pPr>
-      <w:r>
-        <w:drawing>
-          <wp:inline xmlns:a="http://schemas.openxmlformats.org/drawingml/2006/main" xmlns:pic="http://schemas.openxmlformats.org/drawingml/2006/picture">
-            <wp:extent cx="5669280" cy="3543300"/>
-            <wp:docPr id="4" name="Picture 4"/>
-            <wp:cNvGraphicFramePr>
-              <a:graphicFrameLocks noChangeAspect="1"/>
-            </wp:cNvGraphicFramePr>
-            <a:graphic>
-              <a:graphicData uri="http://schemas.openxmlformats.org/drawingml/2006/picture">
-                <pic:pic>
-                  <pic:nvPicPr>
-                    <pic:cNvPr id="0" name="03_mcps_list.png"/>
-                    <pic:cNvPicPr/>
-                  </pic:nvPicPr>
-                  <pic:blipFill>
-                    <a:blip r:embed="rId12"/>
-                    <a:stretch>
-                      <a:fillRect/>
-                    </a:stretch>
-                  </pic:blipFill>
-                  <pic:spPr>
-                    <a:xfrm>
-                      <a:off x="0" y="0"/>
-                      <a:ext cx="5669280" cy="3543300"/>
-                    </a:xfrm>
-                    <a:prstGeom prst="rect"/>
-                  </pic:spPr>
-                </pic:pic>
-              </a:graphicData>
-            </a:graphic>
-          </wp:inline>
-        </w:drawing>
-      </w:r>
-    </w:p>
-    <w:p>
-      <w:pPr>
-        <w:jc w:val="center"/>
-      </w:pPr>
-      <w:r>
-        <w:rPr>
-          <w:i/>
-          <w:color w:val="666666"/>
-          <w:sz w:val="18"/>
-        </w:rPr>
-        <w:t>Figure: MCPs tab showing the four MCP servers: catalog, production, testing, and transform, each with their class name, description, and toolset count</w:t>
-      </w:r>
-    </w:p>
-    <w:p/>
-    <w:p>
-      <w:pPr>
-        <w:pStyle w:val="Heading2"/>
-      </w:pPr>
-      <w:r>
-        <w:t>3.5 US-B04: Configure ToolSets and Tools</w:t>
-      </w:r>
-    </w:p>
-    <w:p>
-      <w:r>
-        <w:t>As a Builder, I want to view and customize ToolSets and their individual tools, so that I can tune tool descriptions, toggle tools on/off, and dry-run tools.</w:t>
-      </w:r>
-    </w:p>
-    <w:p>
-      <w:pPr>
-        <w:jc w:val="center"/>
-      </w:pPr>
-      <w:r>
-        <w:drawing>
-          <wp:inline xmlns:a="http://schemas.openxmlformats.org/drawingml/2006/main" xmlns:pic="http://schemas.openxmlformats.org/drawingml/2006/picture">
-            <wp:extent cx="5669280" cy="3543300"/>
-            <wp:docPr id="5" name="Picture 5"/>
-            <wp:cNvGraphicFramePr>
-              <a:graphicFrameLocks noChangeAspect="1"/>
-            </wp:cNvGraphicFramePr>
-            <a:graphic>
-              <a:graphicData uri="http://schemas.openxmlformats.org/drawingml/2006/picture">
-                <pic:pic>
-                  <pic:nvPicPr>
-                    <pic:cNvPr id="0" name="04_toolsets_list.png"/>
-                    <pic:cNvPicPr/>
-                  </pic:nvPicPr>
-                  <pic:blipFill>
-                    <a:blip r:embed="rId13"/>
-                    <a:stretch>
-                      <a:fillRect/>
-                    </a:stretch>
-                  </pic:blipFill>
-                  <pic:spPr>
-                    <a:xfrm>
-                      <a:off x="0" y="0"/>
-                      <a:ext cx="5669280" cy="3543300"/>
-                    </a:xfrm>
-                    <a:prstGeom prst="rect"/>
-                  </pic:spPr>
-                </pic:pic>
-              </a:graphicData>
-            </a:graphic>
-          </wp:inline>
-        </w:drawing>
-      </w:r>
-    </w:p>
-    <w:p>
-      <w:pPr>
-        <w:jc w:val="center"/>
-      </w:pPr>
-      <w:r>
-        <w:rPr>
-          <w:i/>
-          <w:color w:val="666666"/>
-          <w:sz w:val="18"/>
-        </w:rPr>
-        <w:t>Figure: ToolSets tab showing the five ToolSets: Catalog (8 tools), Monitoring (6 tools), Production (13 tools), Testing (8 tools), Transform (13 tools)</w:t>
-      </w:r>
-    </w:p>
-    <w:p/>
-    <w:p>
-      <w:pPr>
-        <w:jc w:val="center"/>
-      </w:pPr>
-      <w:r>
-        <w:drawing>
-          <wp:inline xmlns:a="http://schemas.openxmlformats.org/drawingml/2006/main" xmlns:pic="http://schemas.openxmlformats.org/drawingml/2006/picture">
-            <wp:extent cx="5669280" cy="3543300"/>
-            <wp:docPr id="6" name="Picture 6"/>
-            <wp:cNvGraphicFramePr>
-              <a:graphicFrameLocks noChangeAspect="1"/>
-            </wp:cNvGraphicFramePr>
-            <a:graphic>
-              <a:graphicData uri="http://schemas.openxmlformats.org/drawingml/2006/picture">
-                <pic:pic>
-                  <pic:nvPicPr>
-                    <pic:cNvPr id="0" name="05_tools_list.png"/>
-                    <pic:cNvPicPr/>
-                  </pic:nvPicPr>
-                  <pic:blipFill>
-                    <a:blip r:embed="rId14"/>
-                    <a:stretch>
-                      <a:fillRect/>
-                    </a:stretch>
-                  </pic:blipFill>
-                  <pic:spPr>
-                    <a:xfrm>
-                      <a:off x="0" y="0"/>
-                      <a:ext cx="5669280" cy="3543300"/>
-                    </a:xfrm>
-                    <a:prstGeom prst="rect"/>
-                  </pic:spPr>
-                </pic:pic>
-              </a:graphicData>
-            </a:graphic>
-          </wp:inline>
-        </w:drawing>
-      </w:r>
-    </w:p>
-    <w:p>
-      <w:pPr>
-        <w:jc w:val="center"/>
-      </w:pPr>
-      <w:r>
-        <w:rPr>
-          <w:i/>
-          <w:color w:val="666666"/>
-          <w:sz w:val="18"/>
-        </w:rPr>
-        <w:t>Figure: Tools tab listing all 42 tools across the five ToolSet classes, sorted alphabetically</w:t>
-      </w:r>
-    </w:p>
-    <w:p/>
-    <w:p>
-      <w:r>
-        <w:t>Clicking a tool opens the detail editor with the LLM-facing description and input schema:</w:t>
-      </w:r>
-    </w:p>
-    <w:p>
-      <w:pPr>
-        <w:jc w:val="center"/>
-      </w:pPr>
-      <w:r>
-        <w:drawing>
-          <wp:inline xmlns:a="http://schemas.openxmlformats.org/drawingml/2006/main" xmlns:pic="http://schemas.openxmlformats.org/drawingml/2006/picture">
-            <wp:extent cx="5669280" cy="3543300"/>
-            <wp:docPr id="7" name="Picture 7"/>
-            <wp:cNvGraphicFramePr>
-              <a:graphicFrameLocks noChangeAspect="1"/>
-            </wp:cNvGraphicFramePr>
-            <a:graphic>
-              <a:graphicData uri="http://schemas.openxmlformats.org/drawingml/2006/picture">
-                <pic:pic>
-                  <pic:nvPicPr>
-                    <pic:cNvPr id="0" name="06_tool_detail.png"/>
-                    <pic:cNvPicPr/>
-                  </pic:nvPicPr>
-                  <pic:blipFill>
-                    <a:blip r:embed="rId15"/>
-                    <a:stretch>
-                      <a:fillRect/>
-                    </a:stretch>
-                  </pic:blipFill>
-                  <pic:spPr>
-                    <a:xfrm>
-                      <a:off x="0" y="0"/>
-                      <a:ext cx="5669280" cy="3543300"/>
-                    </a:xfrm>
-                    <a:prstGeom prst="rect"/>
-                  </pic:spPr>
-                </pic:pic>
-              </a:graphicData>
-            </a:graphic>
-          </wp:inline>
-        </w:drawing>
-      </w:r>
-    </w:p>
-    <w:p>
-      <w:pPr>
-        <w:jc w:val="center"/>
-      </w:pPr>
-      <w:r>
-        <w:rPr>
-          <w:i/>
-          <w:color w:val="666666"/>
-          <w:sz w:val="18"/>
-        </w:rPr>
-        <w:t>Figure: Tool detail editor for DescribeClass showing the contract-style description, method signature, JSON input schema, implementation kind, timeout, and confirmation requirement</w:t>
-      </w:r>
-    </w:p>
-    <w:p/>
-    <w:p>
-      <w:pPr>
-        <w:pStyle w:val="Heading2"/>
-      </w:pPr>
-      <w:r>
-        <w:t>3.6 US-B05: Configure Skills</w:t>
-      </w:r>
-    </w:p>
-    <w:p>
-      <w:r>
-        <w:t>As a Builder, I want to view and edit the INSTRUCTIONS content for each skill, so that I can refine the agent's domain knowledge without Developer involvement.</w:t>
-      </w:r>
-    </w:p>
-    <w:p>
-      <w:pPr>
-        <w:jc w:val="center"/>
-      </w:pPr>
-      <w:r>
-        <w:drawing>
-          <wp:inline xmlns:a="http://schemas.openxmlformats.org/drawingml/2006/main" xmlns:pic="http://schemas.openxmlformats.org/drawingml/2006/picture">
-            <wp:extent cx="5669280" cy="3543300"/>
-            <wp:docPr id="8" name="Picture 8"/>
-            <wp:cNvGraphicFramePr>
-              <a:graphicFrameLocks noChangeAspect="1"/>
-            </wp:cNvGraphicFramePr>
-            <a:graphic>
-              <a:graphicData uri="http://schemas.openxmlformats.org/drawingml/2006/picture">
-                <pic:pic>
-                  <pic:nvPicPr>
-                    <pic:cNvPr id="0" name="07_skills_list.png"/>
-                    <pic:cNvPicPr/>
-                  </pic:nvPicPr>
-                  <pic:blipFill>
-                    <a:blip r:embed="rId16"/>
-                    <a:stretch>
-                      <a:fillRect/>
-                    </a:stretch>
-                  </pic:blipFill>
-                  <pic:spPr>
-                    <a:xfrm>
-                      <a:off x="0" y="0"/>
-                      <a:ext cx="5669280" cy="3543300"/>
-                    </a:xfrm>
-                    <a:prstGeom prst="rect"/>
-                  </pic:spPr>
-                </pic:pic>
-              </a:graphicData>
-            </a:graphic>
-          </wp:inline>
-        </w:drawing>
-      </w:r>
-    </w:p>
-    <w:p>
-      <w:pPr>
-        <w:jc w:val="center"/>
-      </w:pPr>
-      <w:r>
-        <w:rPr>
-          <w:i/>
-          <w:color w:val="666666"/>
-          <w:sz w:val="18"/>
-        </w:rPr>
-        <w:t>Figure: Skills tab showing the 12 shipped skills: Adapters, BPL, CDA, DTL, ESBPattern, FHIRR4, HL7v2, Productions, and more</w:t>
-      </w:r>
-    </w:p>
-    <w:p/>
-    <w:p>
-      <w:pPr>
-        <w:jc w:val="center"/>
-      </w:pPr>
-      <w:r>
-        <w:drawing>
-          <wp:inline xmlns:a="http://schemas.openxmlformats.org/drawingml/2006/main" xmlns:pic="http://schemas.openxmlformats.org/drawingml/2006/picture">
-            <wp:extent cx="5669280" cy="3543300"/>
-            <wp:docPr id="9" name="Picture 9"/>
-            <wp:cNvGraphicFramePr>
-              <a:graphicFrameLocks noChangeAspect="1"/>
-            </wp:cNvGraphicFramePr>
-            <a:graphic>
-              <a:graphicData uri="http://schemas.openxmlformats.org/drawingml/2006/picture">
-                <pic:pic>
-                  <pic:nvPicPr>
-                    <pic:cNvPr id="0" name="08_skill_detail.png"/>
-                    <pic:cNvPicPr/>
-                  </pic:nvPicPr>
-                  <pic:blipFill>
-                    <a:blip r:embed="rId17"/>
-                    <a:stretch>
-                      <a:fillRect/>
-                    </a:stretch>
-                  </pic:blipFill>
-                  <pic:spPr>
-                    <a:xfrm>
-                      <a:off x="0" y="0"/>
-                      <a:ext cx="5669280" cy="3543300"/>
-                    </a:xfrm>
-                    <a:prstGeom prst="rect"/>
-                  </pic:spPr>
-                </pic:pic>
-              </a:graphicData>
-            </a:graphic>
-          </wp:inline>
-        </w:drawing>
-      </w:r>
-    </w:p>
-    <w:p>
-      <w:pPr>
-        <w:jc w:val="center"/>
-      </w:pPr>
-      <w:r>
-        <w:rPr>
-          <w:i/>
-          <w:color w:val="666666"/>
-          <w:sz w:val="18"/>
-        </w:rPr>
-        <w:t>Figure: Skill editor for Adapters showing the class name, description field, bound ToolSets, and expandable class source viewer</w:t>
-      </w:r>
-    </w:p>
-    <w:p/>
-    <w:p>
-      <w:pPr>
-        <w:pStyle w:val="Heading2"/>
-      </w:pPr>
-      <w:r>
-        <w:t>3.7 US-B06: Review Transformation Mappings (Data Atlas)</w:t>
-      </w:r>
-    </w:p>
-    <w:p>
-      <w:r>
-        <w:t>As a Builder, I want to explore field-level mappings between HL7 v2, SDA3, and FHIR R4 formats, so that I can understand how data flows through the transformation pipeline and identify which IRIS classes handle each mapping.</w:t>
-      </w:r>
-    </w:p>
-    <w:p>
-      <w:r>
-        <w:t>The Transforms tab provides a Data Atlas: a visual field-level mapping explorer. The user selects a source format (e.g., HL7 v2) and target format (e.g., FHIR R4), then browses SDA3 data types in the sidebar. For each type, the three-column table shows:</w:t>
-      </w:r>
-    </w:p>
-    <w:p>
-      <w:pPr>
-        <w:pStyle w:val="ListBullet"/>
-      </w:pPr>
-      <w:r>
-        <w:t>Source field (e.g., PID.11.3 City) with the IRIS class that performs the inbound mapping</w:t>
-      </w:r>
-    </w:p>
-    <w:p>
-      <w:pPr>
-        <w:pStyle w:val="ListBullet"/>
-      </w:pPr>
-      <w:r>
-        <w:t>SDA3 canonical field (e.g., City)</w:t>
-      </w:r>
-    </w:p>
-    <w:p>
-      <w:pPr>
-        <w:pStyle w:val="ListBullet"/>
-      </w:pPr>
-      <w:r>
-        <w:t>Target field (e.g., city) with the IRIS class that performs the outbound mapping</w:t>
-      </w:r>
-    </w:p>
-    <w:p>
-      <w:pPr>
-        <w:jc w:val="center"/>
-      </w:pPr>
-      <w:r>
-        <w:drawing>
-          <wp:inline xmlns:a="http://schemas.openxmlformats.org/drawingml/2006/main" xmlns:pic="http://schemas.openxmlformats.org/drawingml/2006/picture">
-            <wp:extent cx="5669280" cy="3543300"/>
-            <wp:docPr id="10" name="Picture 10"/>
-            <wp:cNvGraphicFramePr>
-              <a:graphicFrameLocks noChangeAspect="1"/>
-            </wp:cNvGraphicFramePr>
-            <a:graphic>
-              <a:graphicData uri="http://schemas.openxmlformats.org/drawingml/2006/picture">
-                <pic:pic>
-                  <pic:nvPicPr>
-                    <pic:cNvPr id="0" name="13_transforms_hl7_fhir.png"/>
-                    <pic:cNvPicPr/>
-                  </pic:nvPicPr>
-                  <pic:blipFill>
-                    <a:blip r:embed="rId18"/>
-                    <a:stretch>
-                      <a:fillRect/>
-                    </a:stretch>
-                  </pic:blipFill>
-                  <pic:spPr>
-                    <a:xfrm>
-                      <a:off x="0" y="0"/>
-                      <a:ext cx="5669280" cy="3543300"/>
-                    </a:xfrm>
-                    <a:prstGeom prst="rect"/>
-                  </pic:spPr>
-                </pic:pic>
-              </a:graphicData>
-            </a:graphic>
-          </wp:inline>
-        </w:drawing>
-      </w:r>
-    </w:p>
-    <w:p>
-      <w:pPr>
-        <w:jc w:val="center"/>
-      </w:pPr>
-      <w:r>
-        <w:rPr>
-          <w:i/>
-          <w:color w:val="666666"/>
-          <w:sz w:val="18"/>
-        </w:rPr>
-        <w:t>Figure: Data Atlas: HL7 v2 to FHIR R4 via SDA3.Address, showing sub-field level mappings (PID.11.3 City, PID.11.6 Country), coverage filter chips (End-to-end, Inbound only, Outbound only), and IRIS class names inline (HS.Gateway.HL7.HL7ToSDA3, HS.FHIR.DTL.SDA3.vR4.Address.Address)</w:t>
-      </w:r>
-    </w:p>
-    <w:p/>
-    <w:p>
-      <w:pPr>
-        <w:pStyle w:val="Heading2"/>
-      </w:pPr>
-      <w:r>
-        <w:t>3.8 US-B07: Browse Vector Catalogs</w:t>
-      </w:r>
-    </w:p>
-    <w:p>
-      <w:r>
-        <w:t>As a Builder, I want to search the Ens.* and HS.* vector catalogs to find Business Hosts, adapters, and transformation classes.</w:t>
-      </w:r>
-    </w:p>
-    <w:p>
-      <w:pPr>
-        <w:jc w:val="center"/>
-      </w:pPr>
-      <w:r>
-        <w:drawing>
-          <wp:inline xmlns:a="http://schemas.openxmlformats.org/drawingml/2006/main" xmlns:pic="http://schemas.openxmlformats.org/drawingml/2006/picture">
-            <wp:extent cx="5669280" cy="3543300"/>
-            <wp:docPr id="11" name="Picture 11"/>
-            <wp:cNvGraphicFramePr>
-              <a:graphicFrameLocks noChangeAspect="1"/>
-            </wp:cNvGraphicFramePr>
-            <a:graphic>
-              <a:graphicData uri="http://schemas.openxmlformats.org/drawingml/2006/picture">
-                <pic:pic>
-                  <pic:nvPicPr>
-                    <pic:cNvPr id="0" name="11_catalogs.png"/>
-                    <pic:cNvPicPr/>
-                  </pic:nvPicPr>
-                  <pic:blipFill>
-                    <a:blip r:embed="rId19"/>
-                    <a:stretch>
-                      <a:fillRect/>
-                    </a:stretch>
-                  </pic:blipFill>
-                  <pic:spPr>
-                    <a:xfrm>
-                      <a:off x="0" y="0"/>
-                      <a:ext cx="5669280" cy="3543300"/>
-                    </a:xfrm>
-                    <a:prstGeom prst="rect"/>
-                  </pic:spPr>
-                </pic:pic>
-              </a:graphicData>
-            </a:graphic>
-          </wp:inline>
-        </w:drawing>
-      </w:r>
-    </w:p>
-    <w:p>
-      <w:pPr>
-        <w:jc w:val="center"/>
-      </w:pPr>
-      <w:r>
-        <w:rPr>
-          <w:i/>
-          <w:color w:val="666666"/>
-          <w:sz w:val="18"/>
-        </w:rPr>
-        <w:t>Figure: Catalogs tab showing search_ens (164 rows indexed) and search_hs (58 rows indexed) catalogs with kind breakdowns, rebuild buttons, test search panel, and browse panel</w:t>
-      </w:r>
-    </w:p>
-    <w:p/>
-    <w:p>
-      <w:pPr>
-        <w:pStyle w:val="Heading2"/>
-      </w:pPr>
-      <w:r>
-        <w:t>3.9 US-B08: View Audit Log</w:t>
-      </w:r>
-    </w:p>
-    <w:p>
-      <w:r>
-        <w:t>As a Builder, I want to view the audit trail of all API requests, so that I can track who did what, when, and how long it took.</w:t>
-      </w:r>
-    </w:p>
-    <w:p>
-      <w:pPr>
-        <w:jc w:val="center"/>
-      </w:pPr>
-      <w:r>
-        <w:drawing>
-          <wp:inline xmlns:a="http://schemas.openxmlformats.org/drawingml/2006/main" xmlns:pic="http://schemas.openxmlformats.org/drawingml/2006/picture">
-            <wp:extent cx="5669280" cy="3543300"/>
-            <wp:docPr id="12" name="Picture 12"/>
-            <wp:cNvGraphicFramePr>
-              <a:graphicFrameLocks noChangeAspect="1"/>
-            </wp:cNvGraphicFramePr>
-            <a:graphic>
-              <a:graphicData uri="http://schemas.openxmlformats.org/drawingml/2006/picture">
-                <pic:pic>
-                  <pic:nvPicPr>
-                    <pic:cNvPr id="0" name="14_audit.png"/>
-                    <pic:cNvPicPr/>
-                  </pic:nvPicPr>
-                  <pic:blipFill>
-                    <a:blip r:embed="rId20"/>
-                    <a:stretch>
-                      <a:fillRect/>
-                    </a:stretch>
-                  </pic:blipFill>
-                  <pic:spPr>
-                    <a:xfrm>
-                      <a:off x="0" y="0"/>
-                      <a:ext cx="5669280" cy="3543300"/>
-                    </a:xfrm>
-                    <a:prstGeom prst="rect"/>
-                  </pic:spPr>
-                </pic:pic>
-              </a:graphicData>
-            </a:graphic>
-          </wp:inline>
-        </w:drawing>
-      </w:r>
-    </w:p>
-    <w:p>
-      <w:pPr>
-        <w:jc w:val="center"/>
-      </w:pPr>
-      <w:r>
-        <w:rPr>
-          <w:i/>
-          <w:color w:val="666666"/>
-          <w:sz w:val="18"/>
-        </w:rPr>
-        <w:t>Figure: Audit tab showing the request log with status codes, HTTP methods, paths, kind classification, timestamps, usernames, namespace, duration, and byte counts</w:t>
-      </w:r>
-    </w:p>
-    <w:p/>
-    <w:p>
-      <w:r>
-        <w:br w:type="page"/>
-      </w:r>
-    </w:p>
-    <w:p>
-      <w:pPr>
-        <w:pStyle w:val="Heading1"/>
-      </w:pPr>
-      <w:r>
-        <w:t>4. Builder Experience - Chatbot</w:t>
-      </w:r>
-    </w:p>
-    <w:p>
-      <w:pPr>
-        <w:pStyle w:val="Heading2"/>
-      </w:pPr>
-      <w:r>
-        <w:t>4.1 US-B09: Chat with the Agent</w:t>
-      </w:r>
-    </w:p>
-    <w:p>
-      <w:r>
-        <w:t>As a Builder, I want to type a natural-language request (e.g., 'build me a production that ingests ADT messages and routes them to two downstream systems'), so that the agent searches catalogs, proposes hosts, asks for confirmation, creates the production, sends a test HL7 message, and validates the result.</w:t>
-      </w:r>
-    </w:p>
-    <w:p>
-      <w:pPr>
-        <w:jc w:val="center"/>
-      </w:pPr>
-      <w:r>
-        <w:drawing>
-          <wp:inline xmlns:a="http://schemas.openxmlformats.org/drawingml/2006/main" xmlns:pic="http://schemas.openxmlformats.org/drawingml/2006/picture">
-            <wp:extent cx="5669280" cy="3543300"/>
-            <wp:docPr id="13" name="Picture 13"/>
-            <wp:cNvGraphicFramePr>
-              <a:graphicFrameLocks noChangeAspect="1"/>
-            </wp:cNvGraphicFramePr>
-            <a:graphic>
-              <a:graphicData uri="http://schemas.openxmlformats.org/drawingml/2006/picture">
-                <pic:pic>
-                  <pic:nvPicPr>
-                    <pic:cNvPr id="0" name="15_chatbot.png"/>
-                    <pic:cNvPicPr/>
-                  </pic:nvPicPr>
-                  <pic:blipFill>
-                    <a:blip r:embed="rId21"/>
-                    <a:stretch>
-                      <a:fillRect/>
-                    </a:stretch>
-                  </pic:blipFill>
-                  <pic:spPr>
-                    <a:xfrm>
-                      <a:off x="0" y="0"/>
-                      <a:ext cx="5669280" cy="3543300"/>
-                    </a:xfrm>
-                    <a:prstGeom prst="rect"/>
-                  </pic:spPr>
-                </pic:pic>
-              </a:graphicData>
-            </a:graphic>
-          </wp:inline>
-        </w:drawing>
-      </w:r>
-    </w:p>
-    <w:p>
-      <w:pPr>
-        <w:jc w:val="center"/>
-      </w:pPr>
-      <w:r>
-        <w:rPr>
-          <w:i/>
-          <w:color w:val="666666"/>
-          <w:sz w:val="18"/>
-        </w:rPr>
         <w:t>Figure: Chat interface showing the welcome screen with starter prompts (Build, Transform, Operate, Review categories), conversation history sidebar, namespace and connection indicators in the top bar, and the message input area</w:t>
       </w:r>
     </w:p>
@@ -2016,7 +2620,7 @@
         <w:pStyle w:val="Heading1"/>
       </w:pPr>
       <w:r>
-        <w:t>5. End-to-End Scenario</w:t>
+        <w:t>6. End-to-End Scenario</w:t>
       </w:r>
     </w:p>
     <w:p>
@@ -2084,7 +2688,7 @@
         <w:pStyle w:val="Heading1"/>
       </w:pPr>
       <w:r>
-        <w:t>6. Non-Functional Requirements</w:t>
+        <w:t>7. Non-Functional Requirements</w:t>
       </w:r>
     </w:p>
     <w:tbl>

</xml_diff>

<commit_message>
Rename Data Atlas to Transformation and Mapping Catalog across all docs
Corrects terminology in all source markdown files, build scripts, and
regenerated .docx and .pptx binaries. 37 occurrences replaced, zero remaining.

Co-Authored-By: Claude Opus 4.6 <noreply@anthropic.com>
</commit_message>
<xml_diff>
--- a/docs/01_Requirements_User_Stories.docx
+++ b/docs/01_Requirements_User_Stories.docx
@@ -715,7 +715,7 @@
         <w:pStyle w:val="ListBullet"/>
       </w:pPr>
       <w:r>
-        <w:t>Pipeline Discovery: The agent traces the full transformation pipeline for any format pair (e.g., HL7 v2 to FHIR R4) showing which IRIS classes handle each step, what intermediate formats are used, and where the data flows. The Data Atlas (Transforms tab) provides this information visually at the field level.</w:t>
+        <w:t>Pipeline Discovery: The agent traces the full transformation pipeline for any format pair (e.g., HL7 v2 to FHIR R4) showing which IRIS classes handle each step, what intermediate formats are used, and where the data flows. The Transformation and Mapping Catalog (Transforms tab) provides this information visually at the field level.</w:t>
       </w:r>
     </w:p>
     <w:p>
@@ -723,7 +723,7 @@
         <w:pStyle w:val="ListBullet"/>
       </w:pPr>
       <w:r>
-        <w:t>DTL Creation: The agent creates new DTL definitions by first searching the HS.* catalog for existing transformations that handle the same or similar format pair, then scaffolding a new DTL with the correct source/target classes and document types. It can populate field mappings based on the Data Atlas mappings.</w:t>
+        <w:t>DTL Creation: The agent creates new DTL definitions by first searching the HS.* catalog for existing transformations that handle the same or similar format pair, then scaffolding a new DTL with the correct source/target classes and document types. It can populate field mappings based on the Transformation and Mapping Catalog mappings.</w:t>
       </w:r>
     </w:p>
     <w:p>
@@ -747,7 +747,7 @@
         <w:pStyle w:val="ListBullet"/>
       </w:pPr>
       <w:r>
-        <w:t>Cross-Format Mapping Insights: Through the Data Atlas, the agent (and the Builder via the admin UI) can see exactly which HL7 fields map through SDA3 to FHIR, which fields are inbound-only (arrive but don't continue), and which are outbound-only (produced in the target but not sourced from the input). This enables gap analysis before writing any code.</w:t>
+        <w:t>Cross-Format Mapping Insights: Through the Transformation and Mapping Catalog, the agent (and the Builder via the admin UI) can see exactly which HL7 fields map through SDA3 to FHIR, which fields are inbound-only (arrive but don't continue), and which are outbound-only (produced in the target but not sourced from the input). This enables gap analysis before writing any code.</w:t>
       </w:r>
     </w:p>
     <w:p/>
@@ -910,7 +910,7 @@
           <w:color w:val="666666"/>
           <w:sz w:val="18"/>
         </w:rPr>
-        <w:t>Figure: Data Atlas: the Transforms tab showing field-level HL7 v2 to FHIR R4 mappings through SDA3, with coverage filters and IRIS class names -- a key reference tool for Use Cases 2 and 3</w:t>
+        <w:t>Figure: Transformation and Mapping Catalog: the Transforms tab showing field-level HL7 v2 to FHIR R4 mappings through SDA3, with coverage filters and IRIS class names -- a key reference tool for Use Cases 2 and 3</w:t>
       </w:r>
     </w:p>
     <w:p/>
@@ -2261,7 +2261,7 @@
         <w:pStyle w:val="Heading2"/>
       </w:pPr>
       <w:r>
-        <w:t>4.7 US-B06: Review Transformation Mappings (Data Atlas)</w:t>
+        <w:t>4.7 US-B06: Review Transformation Mappings (Transformation and Mapping Catalog)</w:t>
       </w:r>
     </w:p>
     <w:p>
@@ -2271,7 +2271,7 @@
     </w:p>
     <w:p>
       <w:r>
-        <w:t>The Transforms tab provides a Data Atlas: a visual field-level mapping explorer. The user selects a source format (e.g., HL7 v2) and target format (e.g., FHIR R4), then browses SDA3 data types in the sidebar. For each type, the three-column table shows:</w:t>
+        <w:t>The Transforms tab provides a Transformation and Mapping Catalog: a visual field-level mapping explorer. The user selects a source format (e.g., HL7 v2) and target format (e.g., FHIR R4), then browses SDA3 data types in the sidebar. For each type, the three-column table shows:</w:t>
       </w:r>
     </w:p>
     <w:p>
@@ -2347,7 +2347,7 @@
           <w:color w:val="666666"/>
           <w:sz w:val="18"/>
         </w:rPr>
-        <w:t>Figure: Data Atlas: HL7 v2 to FHIR R4 via SDA3.Address, showing sub-field level mappings (PID.11.3 City, PID.11.6 Country), coverage filter chips (End-to-end, Inbound only, Outbound only), and IRIS class names inline (HS.Gateway.HL7.HL7ToSDA3, HS.FHIR.DTL.SDA3.vR4.Address.Address)</w:t>
+        <w:t>Figure: Transformation and Mapping Catalog: HL7 v2 to FHIR R4 via SDA3.Address, showing sub-field level mappings (PID.11.3 City, PID.11.6 Country), coverage filter chips (End-to-end, Inbound only, Outbound only), and IRIS class names inline (HS.Gateway.HL7.HL7ToSDA3, HS.FHIR.DTL.SDA3.vR4.Address.Address)</w:t>
       </w:r>
     </w:p>
     <w:p/>
@@ -3314,7 +3314,7 @@
               <w:rPr>
                 <w:sz w:val="20"/>
               </w:rPr>
-              <w:t>Field-level mapping explorer (Data Atlas)</w:t>
+              <w:t>Field-level mapping explorer (Transformation and Mapping Catalog)</w:t>
             </w:r>
           </w:p>
         </w:tc>

</xml_diff>

<commit_message>
Update docs to v3.0: Builder/Operator personas, source control, enhanced security
- Split End User into Builder (dev-time) and Operator (run-time) personas
- Add Builder vs Operator tool access table enforced via ToolSet binding
- Add Section 10: Source Control and Change Control Integration (HCC hooks, CI/CD)
- Add LLM Permission Delegation: agent never bypasses authenticated user permissions
- Add Namespace Constraints: Foundation namespaces always read-only
- Add Security Enforcement Layers appendix (4-layer model)
- Add AI Hub-covered stories section (US-H01 through US-H08)
- Add user stories: US-D07, US-E01-E04, US-SC01-SC03
- Update Tech Spec with permission delegation, namespace constraints, source control
- Update build_all_docx.py to match v3.0 markdown structure
- Rebuild all three .docx files

Co-Authored-By: Claude Opus 4.6 <noreply@anthropic.com>
</commit_message>
<xml_diff>
--- a/docs/01_Requirements_User_Stories.docx
+++ b/docs/01_Requirements_User_Stories.docx
@@ -44,7 +44,7 @@
           <w:color w:val="999999"/>
           <w:sz w:val="20"/>
         </w:rPr>
-        <w:t>Version 2.0 | May 2026 | InterSystems AI Hub</w:t>
+        <w:t>Version 3.0 | May 2026 | InterSystems AI Hub</w:t>
       </w:r>
     </w:p>
     <w:p>
@@ -97,7 +97,17 @@
     </w:p>
     <w:p>
       <w:r>
-        <w:t xml:space="preserve">    2.3 End User (System Integrator)</w:t>
+        <w:t xml:space="preserve">    2.3 End User: Builder</w:t>
+      </w:r>
+    </w:p>
+    <w:p>
+      <w:r>
+        <w:t xml:space="preserve">    2.4 End User: Operator</w:t>
+      </w:r>
+    </w:p>
+    <w:p>
+      <w:r>
+        <w:t xml:space="preserve">    2.5 Builder vs Operator: Tool Access</w:t>
       </w:r>
     </w:p>
     <w:p>
@@ -117,17 +127,17 @@
     </w:p>
     <w:p>
       <w:r>
-        <w:t xml:space="preserve">    5.1 Build Productions</w:t>
-      </w:r>
-    </w:p>
-    <w:p>
-      <w:r>
-        <w:t xml:space="preserve">    5.2 Review and Improve Existing Productions</w:t>
-      </w:r>
-    </w:p>
-    <w:p>
-      <w:r>
-        <w:t xml:space="preserve">    5.3 Create and Optimize Transformations</w:t>
+        <w:t xml:space="preserve">    5.1 Build Productions (Builder)</w:t>
+      </w:r>
+    </w:p>
+    <w:p>
+      <w:r>
+        <w:t xml:space="preserve">    5.2 Review and Improve Existing Productions (Operator, with Builder escalation)</w:t>
+      </w:r>
+    </w:p>
+    <w:p>
+      <w:r>
+        <w:t xml:space="preserve">    5.3 Create and Optimize Transformations (Builder)</w:t>
       </w:r>
     </w:p>
     <w:p>
@@ -142,7 +152,27 @@
     </w:p>
     <w:p>
       <w:r>
-        <w:t>8. End User (System Integrator) Experience</w:t>
+        <w:t>8. End User Experience</w:t>
+      </w:r>
+    </w:p>
+    <w:p>
+      <w:r>
+        <w:t xml:space="preserve">    8.1 The Chatbot</w:t>
+      </w:r>
+    </w:p>
+    <w:p>
+      <w:r>
+        <w:t xml:space="preserve">    8.2 Performance Guardrails</w:t>
+      </w:r>
+    </w:p>
+    <w:p>
+      <w:r>
+        <w:t xml:space="preserve">    8.3 Builder User Stories</w:t>
+      </w:r>
+    </w:p>
+    <w:p>
+      <w:r>
+        <w:t xml:space="preserve">    8.4 Operator User Stories</w:t>
       </w:r>
     </w:p>
     <w:p>
@@ -152,12 +182,17 @@
     </w:p>
     <w:p>
       <w:r>
-        <w:t>10. End-to-End Scenario</w:t>
-      </w:r>
-    </w:p>
-    <w:p>
-      <w:r>
-        <w:t>11. Non-Functional Requirements</w:t>
+        <w:t>10. Source Control and Change Control Integration</w:t>
+      </w:r>
+    </w:p>
+    <w:p>
+      <w:r>
+        <w:t>11. End-to-End Scenario</w:t>
+      </w:r>
+    </w:p>
+    <w:p>
+      <w:r>
+        <w:t>12. Non-Functional Requirements</w:t>
       </w:r>
     </w:p>
     <w:p>
@@ -168,6 +203,11 @@
     <w:p>
       <w:r>
         <w:t>Appendix B: %AI Framework Primitives Used</w:t>
+      </w:r>
+    </w:p>
+    <w:p>
+      <w:r>
+        <w:t>Appendix C: Security Enforcement Layers</w:t>
       </w:r>
     </w:p>
     <w:p>
@@ -554,7 +594,7 @@
     </w:p>
     <w:p>
       <w:r>
-        <w:t>The system serves three distinct personas, each with a different interface and security scope.</w:t>
+        <w:t>The system serves four distinct personas. The End User role is split into Builder and Operator because the distinction affects which tools are available, which permissions are required, and whether the agent operates as a dev-time or run-time tool.</w:t>
       </w:r>
     </w:p>
     <w:p>
@@ -805,7 +845,7 @@
               <w:rPr>
                 <w:sz w:val="20"/>
               </w:rPr>
-              <w:t>Configures all AI settings: creates agents with custom system prompts, assembles MCP Servers from available ToolSets, links Skills to Agents, manages LLM connections, builds vector catalogs, reviews audit logs</w:t>
+              <w:t>Configures all AI settings: creates agents with custom system prompts, assembles MCP Servers from available ToolSets, links Skills to Agents, manages LLM connections, builds vector catalogs, reviews audit logs. Assigns Builder and Operator roles to end users</w:t>
             </w:r>
           </w:p>
         </w:tc>
@@ -889,7 +929,7 @@
               <w:rPr>
                 <w:sz w:val="20"/>
               </w:rPr>
-              <w:t>A fully configured agent ready for end users to interact with</w:t>
+              <w:t>A fully configured agent ready for end users to interact with, with appropriate tool access per role</w:t>
             </w:r>
           </w:p>
         </w:tc>
@@ -898,7 +938,7 @@
     <w:p/>
     <w:p>
       <w:r>
-        <w:t>The AI Hub Admin decides how the copilot behaves. They configure the agent's personality, which tools are available, which skills are loaded, and which LLM provider powers the responses. No code editing required -- everything is configuration through the admin UI.</w:t>
+        <w:t>The AI Hub Admin decides how the copilot behaves. They configure the agent's personality, which tools are available, which skills are loaded, and which LLM provider powers the responses. They also control which tools are available to Builders versus Operators through ToolSet configuration and role-based tool filtering. No code editing required -- everything is configuration through the admin UI.</w:t>
       </w:r>
     </w:p>
     <w:p>
@@ -959,7 +999,7 @@
         <w:pStyle w:val="Heading2"/>
       </w:pPr>
       <w:r>
-        <w:t>2.3 End User (System Integrator)</w:t>
+        <w:t>2.3 End User: Builder</w:t>
       </w:r>
     </w:p>
     <w:tbl>
@@ -1030,7 +1070,7 @@
               <w:rPr>
                 <w:sz w:val="20"/>
               </w:rPr>
-              <w:t>Uses the chatbot to build productions, review existing integrations, create transformations, test messages, and explore the IRIS class catalog</w:t>
+              <w:t>Uses the chatbot to create new integration artifacts: productions, DTLs, BPLs, routing rules, lookup tables. This is a dev-time role -- the Builder authors new content that will be deployed</w:t>
             </w:r>
           </w:p>
         </w:tc>
@@ -1086,7 +1126,7 @@
               <w:rPr>
                 <w:sz w:val="20"/>
               </w:rPr>
-              <w:t>Chat access only. All mutating operations require explicit approval via the confirmation gate</w:t>
+              <w:t>Chat access plus create/update/delete permissions on interoperability classes. All mutating operations require explicit approval via the confirmation gate. Changes flow through source control hooks</w:t>
             </w:r>
           </w:p>
         </w:tc>
@@ -1114,7 +1154,35 @@
               <w:rPr>
                 <w:sz w:val="20"/>
               </w:rPr>
-              <w:t>Working productions, transformations, and validated message flows</w:t>
+              <w:t>New or modified productions, transformations, and routing rules -- exported to source control</w:t>
+            </w:r>
+          </w:p>
+        </w:tc>
+      </w:tr>
+      <w:tr>
+        <w:tc>
+          <w:tcPr>
+            <w:tcW w:type="dxa" w:w="4320"/>
+          </w:tcPr>
+          <w:p>
+            <w:r>
+              <w:rPr>
+                <w:sz w:val="20"/>
+              </w:rPr>
+              <w:t>Primary use cases</w:t>
+            </w:r>
+          </w:p>
+        </w:tc>
+        <w:tc>
+          <w:tcPr>
+            <w:tcW w:type="dxa" w:w="4320"/>
+          </w:tcPr>
+          <w:p>
+            <w:r>
+              <w:rPr>
+                <w:sz w:val="20"/>
+              </w:rPr>
+              <w:t>UC-1 (Build Productions), UC-3 (Create Transformations)</w:t>
             </w:r>
           </w:p>
         </w:tc>
@@ -1123,7 +1191,738 @@
     <w:p/>
     <w:p>
       <w:r>
-        <w:t>The End User is the system integrator who needs to get healthcare integration work done. They describe what they need in plain English and the copilot builds it. They do not configure the agent or write code -- they use the agent that the AI Hub Admin has configured.</w:t>
+        <w:t>The Builder creates new integration artifacts through conversation. Because Builders create and modify class definitions, their work triggers source control hooks (see Section 10) and feeds into the CI/CD pipeline. Builder tool access includes create_production, add_business_host, create_dtl, compile_dtl, create_routing_rule, and other mutating tools.</w:t>
+      </w:r>
+    </w:p>
+    <w:p>
+      <w:pPr>
+        <w:pStyle w:val="Heading2"/>
+      </w:pPr>
+      <w:r>
+        <w:t>2.4 End User: Operator</w:t>
+      </w:r>
+    </w:p>
+    <w:tbl>
+      <w:tblPr>
+        <w:tblStyle w:val="TableGrid"/>
+        <w:tblW w:type="auto" w:w="0"/>
+        <w:jc w:val="center"/>
+        <w:tblLook w:firstColumn="1" w:firstRow="1" w:lastColumn="0" w:lastRow="0" w:noHBand="0" w:noVBand="1" w:val="04A0"/>
+      </w:tblPr>
+      <w:tblGrid>
+        <w:gridCol w:w="4320"/>
+        <w:gridCol w:w="4320"/>
+      </w:tblGrid>
+      <w:tr>
+        <w:tc>
+          <w:tcPr>
+            <w:tcW w:type="dxa" w:w="4320"/>
+            <w:shd w:val="clear" w:color="auto" w:fill="1A1A2E"/>
+          </w:tcPr>
+          <w:p>
+            <w:r>
+              <w:rPr>
+                <w:b/>
+                <w:color w:val="FFFFFF"/>
+                <w:sz w:val="20"/>
+              </w:rPr>
+              <w:t>Attribute</w:t>
+            </w:r>
+          </w:p>
+        </w:tc>
+        <w:tc>
+          <w:tcPr>
+            <w:tcW w:type="dxa" w:w="4320"/>
+            <w:shd w:val="clear" w:color="auto" w:fill="1A1A2E"/>
+          </w:tcPr>
+          <w:p>
+            <w:r>
+              <w:rPr>
+                <w:b/>
+                <w:color w:val="FFFFFF"/>
+                <w:sz w:val="20"/>
+              </w:rPr>
+              <w:t>Detail</w:t>
+            </w:r>
+          </w:p>
+        </w:tc>
+      </w:tr>
+      <w:tr>
+        <w:tc>
+          <w:tcPr>
+            <w:tcW w:type="dxa" w:w="4320"/>
+          </w:tcPr>
+          <w:p>
+            <w:r>
+              <w:rPr>
+                <w:sz w:val="20"/>
+              </w:rPr>
+              <w:t>Role</w:t>
+            </w:r>
+          </w:p>
+        </w:tc>
+        <w:tc>
+          <w:tcPr>
+            <w:tcW w:type="dxa" w:w="4320"/>
+          </w:tcPr>
+          <w:p>
+            <w:r>
+              <w:rPr>
+                <w:sz w:val="20"/>
+              </w:rPr>
+              <w:t>Uses the chatbot to monitor, triage, and review existing integrations at run-time. The Operator does not create new productions or DTLs -- they observe, diagnose, and recommend</w:t>
+            </w:r>
+          </w:p>
+        </w:tc>
+      </w:tr>
+      <w:tr>
+        <w:tc>
+          <w:tcPr>
+            <w:tcW w:type="dxa" w:w="4320"/>
+          </w:tcPr>
+          <w:p>
+            <w:r>
+              <w:rPr>
+                <w:sz w:val="20"/>
+              </w:rPr>
+              <w:t>Primary interface</w:t>
+            </w:r>
+          </w:p>
+        </w:tc>
+        <w:tc>
+          <w:tcPr>
+            <w:tcW w:type="dxa" w:w="4320"/>
+          </w:tcPr>
+          <w:p>
+            <w:r>
+              <w:rPr>
+                <w:sz w:val="20"/>
+              </w:rPr>
+              <w:t>Chatbot at /agentic/chat/index.html (standalone or embedded in the Interop Editor)</w:t>
+            </w:r>
+          </w:p>
+        </w:tc>
+      </w:tr>
+      <w:tr>
+        <w:tc>
+          <w:tcPr>
+            <w:tcW w:type="dxa" w:w="4320"/>
+          </w:tcPr>
+          <w:p>
+            <w:r>
+              <w:rPr>
+                <w:sz w:val="20"/>
+              </w:rPr>
+              <w:t>Security scope</w:t>
+            </w:r>
+          </w:p>
+        </w:tc>
+        <w:tc>
+          <w:tcPr>
+            <w:tcW w:type="dxa" w:w="4320"/>
+          </w:tcPr>
+          <w:p>
+            <w:r>
+              <w:rPr>
+                <w:sz w:val="20"/>
+              </w:rPr>
+              <w:t>Chat access plus read-only access to production configurations and monitoring data. May adjust operational settings (pool size, throttle, retry intervals) but not structural changes</w:t>
+            </w:r>
+          </w:p>
+        </w:tc>
+      </w:tr>
+      <w:tr>
+        <w:tc>
+          <w:tcPr>
+            <w:tcW w:type="dxa" w:w="4320"/>
+          </w:tcPr>
+          <w:p>
+            <w:r>
+              <w:rPr>
+                <w:sz w:val="20"/>
+              </w:rPr>
+              <w:t>Deliverable</w:t>
+            </w:r>
+          </w:p>
+        </w:tc>
+        <w:tc>
+          <w:tcPr>
+            <w:tcW w:type="dxa" w:w="4320"/>
+          </w:tcPr>
+          <w:p>
+            <w:r>
+              <w:rPr>
+                <w:sz w:val="20"/>
+              </w:rPr>
+              <w:t>Diagnosis reports, remediation recommendations, settings adjustments, modernization advice</w:t>
+            </w:r>
+          </w:p>
+        </w:tc>
+      </w:tr>
+      <w:tr>
+        <w:tc>
+          <w:tcPr>
+            <w:tcW w:type="dxa" w:w="4320"/>
+          </w:tcPr>
+          <w:p>
+            <w:r>
+              <w:rPr>
+                <w:sz w:val="20"/>
+              </w:rPr>
+              <w:t>Primary use cases</w:t>
+            </w:r>
+          </w:p>
+        </w:tc>
+        <w:tc>
+          <w:tcPr>
+            <w:tcW w:type="dxa" w:w="4320"/>
+          </w:tcPr>
+          <w:p>
+            <w:r>
+              <w:rPr>
+                <w:sz w:val="20"/>
+              </w:rPr>
+              <w:t>UC-2 (Review and Improve Existing Productions)</w:t>
+            </w:r>
+          </w:p>
+        </w:tc>
+      </w:tr>
+    </w:tbl>
+    <w:p/>
+    <w:p>
+      <w:r>
+        <w:t>The Operator focuses on run-time concerns: error triage, throughput monitoring, queue depth analysis, and production health assessment. They can recommend changes (refactor this DTL, add a dead-letter queue, increase pool size) but structural changes require a Builder. Operator tool access includes get_production, query_event_log, top_errors, message_summary, queue_status, and other read/monitoring tools.</w:t>
+      </w:r>
+    </w:p>
+    <w:p>
+      <w:pPr>
+        <w:pStyle w:val="Heading2"/>
+      </w:pPr>
+      <w:r>
+        <w:t>2.5 Builder vs Operator: Tool Access</w:t>
+      </w:r>
+    </w:p>
+    <w:p>
+      <w:r>
+        <w:t>The distinction between Builder and Operator is enforced through tool availability. The AI Hub Admin configures which ToolSets are available to each role:</w:t>
+      </w:r>
+    </w:p>
+    <w:tbl>
+      <w:tblPr>
+        <w:tblStyle w:val="TableGrid"/>
+        <w:tblW w:type="auto" w:w="0"/>
+        <w:jc w:val="center"/>
+        <w:tblLook w:firstColumn="1" w:firstRow="1" w:lastColumn="0" w:lastRow="0" w:noHBand="0" w:noVBand="1" w:val="04A0"/>
+      </w:tblPr>
+      <w:tblGrid>
+        <w:gridCol w:w="2160"/>
+        <w:gridCol w:w="2160"/>
+        <w:gridCol w:w="2160"/>
+        <w:gridCol w:w="2160"/>
+      </w:tblGrid>
+      <w:tr>
+        <w:tc>
+          <w:tcPr>
+            <w:tcW w:type="dxa" w:w="2160"/>
+            <w:shd w:val="clear" w:color="auto" w:fill="1A1A2E"/>
+          </w:tcPr>
+          <w:p>
+            <w:r>
+              <w:rPr>
+                <w:b/>
+                <w:color w:val="FFFFFF"/>
+                <w:sz w:val="20"/>
+              </w:rPr>
+              <w:t>Tool Category</w:t>
+            </w:r>
+          </w:p>
+        </w:tc>
+        <w:tc>
+          <w:tcPr>
+            <w:tcW w:type="dxa" w:w="2160"/>
+            <w:shd w:val="clear" w:color="auto" w:fill="1A1A2E"/>
+          </w:tcPr>
+          <w:p>
+            <w:r>
+              <w:rPr>
+                <w:b/>
+                <w:color w:val="FFFFFF"/>
+                <w:sz w:val="20"/>
+              </w:rPr>
+              <w:t>Builder</w:t>
+            </w:r>
+          </w:p>
+        </w:tc>
+        <w:tc>
+          <w:tcPr>
+            <w:tcW w:type="dxa" w:w="2160"/>
+            <w:shd w:val="clear" w:color="auto" w:fill="1A1A2E"/>
+          </w:tcPr>
+          <w:p>
+            <w:r>
+              <w:rPr>
+                <w:b/>
+                <w:color w:val="FFFFFF"/>
+                <w:sz w:val="20"/>
+              </w:rPr>
+              <w:t>Operator</w:t>
+            </w:r>
+          </w:p>
+        </w:tc>
+        <w:tc>
+          <w:tcPr>
+            <w:tcW w:type="dxa" w:w="2160"/>
+            <w:shd w:val="clear" w:color="auto" w:fill="1A1A2E"/>
+          </w:tcPr>
+          <w:p>
+            <w:r>
+              <w:rPr>
+                <w:b/>
+                <w:color w:val="FFFFFF"/>
+                <w:sz w:val="20"/>
+              </w:rPr>
+              <w:t>Examples</w:t>
+            </w:r>
+          </w:p>
+        </w:tc>
+      </w:tr>
+      <w:tr>
+        <w:tc>
+          <w:tcPr>
+            <w:tcW w:type="dxa" w:w="2160"/>
+          </w:tcPr>
+          <w:p>
+            <w:r>
+              <w:rPr>
+                <w:sz w:val="20"/>
+              </w:rPr>
+              <w:t>Create/Update/Delete</w:t>
+            </w:r>
+          </w:p>
+        </w:tc>
+        <w:tc>
+          <w:tcPr>
+            <w:tcW w:type="dxa" w:w="2160"/>
+          </w:tcPr>
+          <w:p>
+            <w:r>
+              <w:rPr>
+                <w:sz w:val="20"/>
+              </w:rPr>
+              <w:t>Yes</w:t>
+            </w:r>
+          </w:p>
+        </w:tc>
+        <w:tc>
+          <w:tcPr>
+            <w:tcW w:type="dxa" w:w="2160"/>
+          </w:tcPr>
+          <w:p>
+            <w:r>
+              <w:rPr>
+                <w:sz w:val="20"/>
+              </w:rPr>
+              <w:t>No</w:t>
+            </w:r>
+          </w:p>
+        </w:tc>
+        <w:tc>
+          <w:tcPr>
+            <w:tcW w:type="dxa" w:w="2160"/>
+          </w:tcPr>
+          <w:p>
+            <w:r>
+              <w:rPr>
+                <w:sz w:val="20"/>
+              </w:rPr>
+              <w:t>create_production, create_dtl, add_business_host</w:t>
+            </w:r>
+          </w:p>
+        </w:tc>
+      </w:tr>
+      <w:tr>
+        <w:tc>
+          <w:tcPr>
+            <w:tcW w:type="dxa" w:w="2160"/>
+          </w:tcPr>
+          <w:p>
+            <w:r>
+              <w:rPr>
+                <w:sz w:val="20"/>
+              </w:rPr>
+              <w:t>Start/Stop</w:t>
+            </w:r>
+          </w:p>
+        </w:tc>
+        <w:tc>
+          <w:tcPr>
+            <w:tcW w:type="dxa" w:w="2160"/>
+          </w:tcPr>
+          <w:p>
+            <w:r>
+              <w:rPr>
+                <w:sz w:val="20"/>
+              </w:rPr>
+              <w:t>Yes</w:t>
+            </w:r>
+          </w:p>
+        </w:tc>
+        <w:tc>
+          <w:tcPr>
+            <w:tcW w:type="dxa" w:w="2160"/>
+          </w:tcPr>
+          <w:p>
+            <w:r>
+              <w:rPr>
+                <w:sz w:val="20"/>
+              </w:rPr>
+              <w:t>No</w:t>
+            </w:r>
+          </w:p>
+        </w:tc>
+        <w:tc>
+          <w:tcPr>
+            <w:tcW w:type="dxa" w:w="2160"/>
+          </w:tcPr>
+          <w:p>
+            <w:r>
+              <w:rPr>
+                <w:sz w:val="20"/>
+              </w:rPr>
+              <w:t>start_production, stop_production</w:t>
+            </w:r>
+          </w:p>
+        </w:tc>
+      </w:tr>
+      <w:tr>
+        <w:tc>
+          <w:tcPr>
+            <w:tcW w:type="dxa" w:w="2160"/>
+          </w:tcPr>
+          <w:p>
+            <w:r>
+              <w:rPr>
+                <w:sz w:val="20"/>
+              </w:rPr>
+              <w:t>Compile</w:t>
+            </w:r>
+          </w:p>
+        </w:tc>
+        <w:tc>
+          <w:tcPr>
+            <w:tcW w:type="dxa" w:w="2160"/>
+          </w:tcPr>
+          <w:p>
+            <w:r>
+              <w:rPr>
+                <w:sz w:val="20"/>
+              </w:rPr>
+              <w:t>Yes</w:t>
+            </w:r>
+          </w:p>
+        </w:tc>
+        <w:tc>
+          <w:tcPr>
+            <w:tcW w:type="dxa" w:w="2160"/>
+          </w:tcPr>
+          <w:p>
+            <w:r>
+              <w:rPr>
+                <w:sz w:val="20"/>
+              </w:rPr>
+              <w:t>No</w:t>
+            </w:r>
+          </w:p>
+        </w:tc>
+        <w:tc>
+          <w:tcPr>
+            <w:tcW w:type="dxa" w:w="2160"/>
+          </w:tcPr>
+          <w:p>
+            <w:r>
+              <w:rPr>
+                <w:sz w:val="20"/>
+              </w:rPr>
+              <w:t>compile_dtl</w:t>
+            </w:r>
+          </w:p>
+        </w:tc>
+      </w:tr>
+      <w:tr>
+        <w:tc>
+          <w:tcPr>
+            <w:tcW w:type="dxa" w:w="2160"/>
+          </w:tcPr>
+          <w:p>
+            <w:r>
+              <w:rPr>
+                <w:sz w:val="20"/>
+              </w:rPr>
+              <w:t>Read/Inspect</w:t>
+            </w:r>
+          </w:p>
+        </w:tc>
+        <w:tc>
+          <w:tcPr>
+            <w:tcW w:type="dxa" w:w="2160"/>
+          </w:tcPr>
+          <w:p>
+            <w:r>
+              <w:rPr>
+                <w:sz w:val="20"/>
+              </w:rPr>
+              <w:t>Yes</w:t>
+            </w:r>
+          </w:p>
+        </w:tc>
+        <w:tc>
+          <w:tcPr>
+            <w:tcW w:type="dxa" w:w="2160"/>
+          </w:tcPr>
+          <w:p>
+            <w:r>
+              <w:rPr>
+                <w:sz w:val="20"/>
+              </w:rPr>
+              <w:t>Yes</w:t>
+            </w:r>
+          </w:p>
+        </w:tc>
+        <w:tc>
+          <w:tcPr>
+            <w:tcW w:type="dxa" w:w="2160"/>
+          </w:tcPr>
+          <w:p>
+            <w:r>
+              <w:rPr>
+                <w:sz w:val="20"/>
+              </w:rPr>
+              <w:t>get_production, list_dtls, describe_class</w:t>
+            </w:r>
+          </w:p>
+        </w:tc>
+      </w:tr>
+      <w:tr>
+        <w:tc>
+          <w:tcPr>
+            <w:tcW w:type="dxa" w:w="2160"/>
+          </w:tcPr>
+          <w:p>
+            <w:r>
+              <w:rPr>
+                <w:sz w:val="20"/>
+              </w:rPr>
+              <w:t>Monitoring</w:t>
+            </w:r>
+          </w:p>
+        </w:tc>
+        <w:tc>
+          <w:tcPr>
+            <w:tcW w:type="dxa" w:w="2160"/>
+          </w:tcPr>
+          <w:p>
+            <w:r>
+              <w:rPr>
+                <w:sz w:val="20"/>
+              </w:rPr>
+              <w:t>Yes</w:t>
+            </w:r>
+          </w:p>
+        </w:tc>
+        <w:tc>
+          <w:tcPr>
+            <w:tcW w:type="dxa" w:w="2160"/>
+          </w:tcPr>
+          <w:p>
+            <w:r>
+              <w:rPr>
+                <w:sz w:val="20"/>
+              </w:rPr>
+              <w:t>Yes</w:t>
+            </w:r>
+          </w:p>
+        </w:tc>
+        <w:tc>
+          <w:tcPr>
+            <w:tcW w:type="dxa" w:w="2160"/>
+          </w:tcPr>
+          <w:p>
+            <w:r>
+              <w:rPr>
+                <w:sz w:val="20"/>
+              </w:rPr>
+              <w:t>query_event_log, top_errors, message_summary</w:t>
+            </w:r>
+          </w:p>
+        </w:tc>
+      </w:tr>
+      <w:tr>
+        <w:tc>
+          <w:tcPr>
+            <w:tcW w:type="dxa" w:w="2160"/>
+          </w:tcPr>
+          <w:p>
+            <w:r>
+              <w:rPr>
+                <w:sz w:val="20"/>
+              </w:rPr>
+              <w:t>Search</w:t>
+            </w:r>
+          </w:p>
+        </w:tc>
+        <w:tc>
+          <w:tcPr>
+            <w:tcW w:type="dxa" w:w="2160"/>
+          </w:tcPr>
+          <w:p>
+            <w:r>
+              <w:rPr>
+                <w:sz w:val="20"/>
+              </w:rPr>
+              <w:t>Yes</w:t>
+            </w:r>
+          </w:p>
+        </w:tc>
+        <w:tc>
+          <w:tcPr>
+            <w:tcW w:type="dxa" w:w="2160"/>
+          </w:tcPr>
+          <w:p>
+            <w:r>
+              <w:rPr>
+                <w:sz w:val="20"/>
+              </w:rPr>
+              <w:t>Yes</w:t>
+            </w:r>
+          </w:p>
+        </w:tc>
+        <w:tc>
+          <w:tcPr>
+            <w:tcW w:type="dxa" w:w="2160"/>
+          </w:tcPr>
+          <w:p>
+            <w:r>
+              <w:rPr>
+                <w:sz w:val="20"/>
+              </w:rPr>
+              <w:t>search_ens, search_hs</w:t>
+            </w:r>
+          </w:p>
+        </w:tc>
+      </w:tr>
+      <w:tr>
+        <w:tc>
+          <w:tcPr>
+            <w:tcW w:type="dxa" w:w="2160"/>
+          </w:tcPr>
+          <w:p>
+            <w:r>
+              <w:rPr>
+                <w:sz w:val="20"/>
+              </w:rPr>
+              <w:t>Testing</w:t>
+            </w:r>
+          </w:p>
+        </w:tc>
+        <w:tc>
+          <w:tcPr>
+            <w:tcW w:type="dxa" w:w="2160"/>
+          </w:tcPr>
+          <w:p>
+            <w:r>
+              <w:rPr>
+                <w:sz w:val="20"/>
+              </w:rPr>
+              <w:t>Yes</w:t>
+            </w:r>
+          </w:p>
+        </w:tc>
+        <w:tc>
+          <w:tcPr>
+            <w:tcW w:type="dxa" w:w="2160"/>
+          </w:tcPr>
+          <w:p>
+            <w:r>
+              <w:rPr>
+                <w:sz w:val="20"/>
+              </w:rPr>
+              <w:t>Limited</w:t>
+            </w:r>
+          </w:p>
+        </w:tc>
+        <w:tc>
+          <w:tcPr>
+            <w:tcW w:type="dxa" w:w="2160"/>
+          </w:tcPr>
+          <w:p>
+            <w:r>
+              <w:rPr>
+                <w:sz w:val="20"/>
+              </w:rPr>
+              <w:t>send_hl7, validate_hl7_structure</w:t>
+            </w:r>
+          </w:p>
+        </w:tc>
+      </w:tr>
+      <w:tr>
+        <w:tc>
+          <w:tcPr>
+            <w:tcW w:type="dxa" w:w="2160"/>
+          </w:tcPr>
+          <w:p>
+            <w:r>
+              <w:rPr>
+                <w:sz w:val="20"/>
+              </w:rPr>
+              <w:t>Settings adjustment</w:t>
+            </w:r>
+          </w:p>
+        </w:tc>
+        <w:tc>
+          <w:tcPr>
+            <w:tcW w:type="dxa" w:w="2160"/>
+          </w:tcPr>
+          <w:p>
+            <w:r>
+              <w:rPr>
+                <w:sz w:val="20"/>
+              </w:rPr>
+              <w:t>Yes</w:t>
+            </w:r>
+          </w:p>
+        </w:tc>
+        <w:tc>
+          <w:tcPr>
+            <w:tcW w:type="dxa" w:w="2160"/>
+          </w:tcPr>
+          <w:p>
+            <w:r>
+              <w:rPr>
+                <w:sz w:val="20"/>
+              </w:rPr>
+              <w:t>Yes (operational only)</w:t>
+            </w:r>
+          </w:p>
+        </w:tc>
+        <w:tc>
+          <w:tcPr>
+            <w:tcW w:type="dxa" w:w="2160"/>
+          </w:tcPr>
+          <w:p>
+            <w:r>
+              <w:rPr>
+                <w:sz w:val="20"/>
+              </w:rPr>
+              <w:t>update_business_host_settings</w:t>
+            </w:r>
+          </w:p>
+        </w:tc>
+      </w:tr>
+    </w:tbl>
+    <w:p/>
+    <w:p>
+      <w:r>
+        <w:t>This separation matters for security: the Operator's agent instance cannot create or modify class definitions, which means it cannot accidentally (or through prompt injection) alter production behavior. The AI Hub Admin enforces this by binding different ToolSets to Builder-mode and Operator-mode agent configurations.</w:t>
       </w:r>
     </w:p>
     <w:p>
@@ -2002,7 +2801,7 @@
     </w:p>
     <w:p>
       <w:r>
-        <w:t>The copilot addresses three primary use cases that cover the full lifecycle of healthcare integration work inside IRIS for Health. These are the tasks that End Users (System Integrators) perform through the chatbot.</w:t>
+        <w:t>The copilot addresses three primary use cases that cover the full lifecycle of healthcare integration work inside IRIS for Health. Each use case maps to a primary End User persona (Builder or Operator).</w:t>
       </w:r>
     </w:p>
     <w:p>
@@ -2063,7 +2862,7 @@
         <w:pStyle w:val="Heading2"/>
       </w:pPr>
       <w:r>
-        <w:t>5.1 Use Case 1: Build Productions</w:t>
+        <w:t>5.1 Use Case 1: Build Productions (Builder)</w:t>
       </w:r>
     </w:p>
     <w:p>
@@ -2073,7 +2872,7 @@
     </w:p>
     <w:p>
       <w:r>
-        <w:t>The agent assists the End User through the entire production lifecycle:</w:t>
+        <w:t>The agent assists the Builder through the entire production lifecycle:</w:t>
       </w:r>
     </w:p>
     <w:p>
@@ -2081,7 +2880,7 @@
         <w:pStyle w:val="ListBullet"/>
       </w:pPr>
       <w:r>
-        <w:t>Discovery: The End User describes their integration goal in plain English (e.g., 'build a production that receives ADT messages over MLLP, transforms them to FHIR R4, and sends them to a REST endpoint'). The agent searches the Ens.* vector catalog to find the right Business Host classes.</w:t>
+        <w:t>Discovery: The End User describes their integration goal in plain English (e.g., 'build a production that receives ADT messages over MLLP, transforms them to FHIR R4, and sends them to a REST endpoint'). The agent searches the Ens.* vector catalog to find the right Business Host classes (EnsLib.HL7.Service.TCPService, EnsLib.FHIR.Operation.REST, etc.).</w:t>
       </w:r>
     </w:p>
     <w:p>
@@ -2089,7 +2888,7 @@
         <w:pStyle w:val="ListBullet"/>
       </w:pPr>
       <w:r>
-        <w:t>Proposal: The agent presents a production layout -- which hosts to add, what settings to configure, which adapters to use -- and asks the End User to approve before making changes.</w:t>
+        <w:t>Proposal: The agent presents a production layout -- which hosts to add, what settings to configure, which adapters to use -- and asks the Builder to approve before making changes.</w:t>
       </w:r>
     </w:p>
     <w:p>
@@ -2108,6 +2907,14 @@
         <w:t>Validation: The agent runs PostBuildValidation to check for configuration errors, sends a test HL7 message through the pipeline, and verifies that messages flow end-to-end without errors.</w:t>
       </w:r>
     </w:p>
+    <w:p>
+      <w:pPr>
+        <w:pStyle w:val="ListBullet"/>
+      </w:pPr>
+      <w:r>
+        <w:t>Source Control: After successful build, the newly created classes (production definition, routing rules) are captured by Health Connect Cloud source control hooks and exported to the Git repository for CI/CD review (see Section 10).</w:t>
+      </w:r>
+    </w:p>
     <w:p/>
     <w:p>
       <w:r>
@@ -2219,7 +3026,7 @@
         <w:pStyle w:val="Heading2"/>
       </w:pPr>
       <w:r>
-        <w:t>5.2 Use Case 2: Review and Improve Existing Productions</w:t>
+        <w:t>5.2 Use Case 2: Review and Improve Existing Productions (Operator, with Builder escalation)</w:t>
       </w:r>
     </w:p>
     <w:p>
@@ -2229,7 +3036,13 @@
     </w:p>
     <w:p>
       <w:r>
-        <w:t>The agent helps the End User review and optimize existing integrations:</w:t>
+        <w:t>This use case spans both personas. The Operator handles the read-only investigative work (error triage, health assessment, throughput analysis). When the investigation reveals changes that need to be made (refactor a DTL, add a dead-letter queue, restructure routing rules), those changes escalate to the Builder.</w:t>
+      </w:r>
+    </w:p>
+    <w:p/>
+    <w:p>
+      <w:r>
+        <w:t>Operator activities (read-only, run-time):</w:t>
       </w:r>
     </w:p>
     <w:p>
@@ -2253,7 +3066,13 @@
         <w:pStyle w:val="ListBullet"/>
       </w:pPr>
       <w:r>
-        <w:t>DTL Review: The agent reviews Data Transformation Language (DTL) definitions and identifies hardcoded values that should be lookup tables, missing null checks on source fields, incorrect handling of repeating fields, and segments being dropped. It suggests refactored versions with explanations.</w:t>
+        <w:t>Operational Settings Adjustment: The Operator can adjust operational settings (pool size, throttle, retry intervals, call interval) through the agent without Builder involvement. These are runtime tuning changes, not structural modifications.</w:t>
+      </w:r>
+    </w:p>
+    <w:p/>
+    <w:p>
+      <w:r>
+        <w:t>Builder activities (mutating, dev-time):</w:t>
       </w:r>
     </w:p>
     <w:p>
@@ -2261,13 +3080,21 @@
         <w:pStyle w:val="ListBullet"/>
       </w:pPr>
       <w:r>
-        <w:t>Modernization Advice: The agent knows about newer IRIS features (via Skills) and can recommend upgrades -- for example, replacing a custom BPL with a built-in DTL, using record maps instead of custom parsers, or adopting the HL7-to-SDA-to-FHIR pipeline instead of point-to-point transformations.</w:t>
+        <w:t>DTL Review and Refactoring: The agent reviews Data Transformation Language (DTL) definitions and identifies hardcoded values that should be lookup tables, missing null checks on source fields, incorrect handling of repeating fields, and segments being dropped. It suggests refactored versions with explanations. Implementing the refactored DTL requires Builder permissions.</w:t>
+      </w:r>
+    </w:p>
+    <w:p>
+      <w:pPr>
+        <w:pStyle w:val="ListBullet"/>
+      </w:pPr>
+      <w:r>
+        <w:t>Modernization: The agent knows about newer IRIS features (via Skills) and can recommend upgrades -- for example, replacing a custom BPL with a built-in DTL, using record maps instead of custom parsers, or adopting the HL7-to-SDA-to-FHIR pipeline instead of point-to-point transformations. Implementing these changes requires Builder permissions.</w:t>
       </w:r>
     </w:p>
     <w:p/>
     <w:p>
       <w:r>
-        <w:t>Tools involved:</w:t>
+        <w:t>Tools involved (Operator):</w:t>
       </w:r>
     </w:p>
     <w:p>
@@ -2337,13 +3164,43 @@
     <w:p/>
     <w:p>
       <w:r>
+        <w:t>Tools involved (Builder escalation):</w:t>
+      </w:r>
+    </w:p>
+    <w:p>
+      <w:pPr>
+        <w:pStyle w:val="ListBullet"/>
+      </w:pPr>
+      <w:r>
+        <w:t>update_business_host_settings -- reconfigure adapter settings</w:t>
+      </w:r>
+    </w:p>
+    <w:p>
+      <w:pPr>
+        <w:pStyle w:val="ListBullet"/>
+      </w:pPr>
+      <w:r>
+        <w:t>update_dtl / compile_dtl -- modify and compile transformation logic</w:t>
+      </w:r>
+    </w:p>
+    <w:p>
+      <w:pPr>
+        <w:pStyle w:val="ListBullet"/>
+      </w:pPr>
+      <w:r>
+        <w:t>create_routing_rule -- add new routing rules</w:t>
+      </w:r>
+    </w:p>
+    <w:p/>
+    <w:p>
+      <w:r>
         <w:t>Skills involved: Productions, DTL, BPL, Adapters, ESBPattern</w:t>
       </w:r>
     </w:p>
     <w:p/>
     <w:p>
       <w:r>
-        <w:t>Example prompts:</w:t>
+        <w:t>Example prompts (Operator):</w:t>
       </w:r>
     </w:p>
     <w:p>
@@ -2359,15 +3216,37 @@
         <w:pStyle w:val="ListBullet"/>
       </w:pPr>
       <w:r>
+        <w:t>"What is the throughput of the ADT_Router process over the last 24 hours? Are there any queue depth spikes?"</w:t>
+      </w:r>
+    </w:p>
+    <w:p/>
+    <w:p>
+      <w:r>
+        <w:t>Example prompts (Builder):</w:t>
+      </w:r>
+    </w:p>
+    <w:p>
+      <w:pPr>
+        <w:pStyle w:val="ListBullet"/>
+      </w:pPr>
+      <w:r>
         <w:t>"Review our current ADT_A08_to_SDA3 DTL for: hardcoded values that should be lookup tables, missing null checks on source fields, incorrect handling of repeating PID-3 identifiers, and segments we are dropping that we should not."</w:t>
       </w:r>
     </w:p>
     <w:p>
       <w:pPr>
+        <w:pStyle w:val="ListBullet"/>
+      </w:pPr>
+      <w:r>
+        <w:t>"Refactor the ADT routing to use the built-in HL7-to-SDA-to-FHIR pipeline instead of our custom point-to-point DTLs."</w:t>
+      </w:r>
+    </w:p>
+    <w:p>
+      <w:pPr>
         <w:pStyle w:val="Heading2"/>
       </w:pPr>
       <w:r>
-        <w:t>5.3 Use Case 3: Create and Optimize Transformations</w:t>
+        <w:t>5.3 Use Case 3: Create and Optimize Transformations (Builder)</w:t>
       </w:r>
     </w:p>
     <w:p>
@@ -2377,7 +3256,7 @@
     </w:p>
     <w:p>
       <w:r>
-        <w:t>The agent assists the End User with transformation work at every stage:</w:t>
+        <w:t>The agent assists the Builder with transformation work at every stage:</w:t>
       </w:r>
     </w:p>
     <w:p>
@@ -2401,7 +3280,7 @@
         <w:pStyle w:val="ListBullet"/>
       </w:pPr>
       <w:r>
-        <w:t>Schema Introspection: The agent can introspect HL7 v2 message schemas (segments, fields, components) and FHIR R4 resource structures so the End User understands what data is available at each point in the pipeline.</w:t>
+        <w:t>Schema Introspection: The agent can introspect HL7 v2 message schemas (segments, fields, components) and FHIR R4 resource structures so the Builder understands what data is available at each point in the pipeline.</w:t>
       </w:r>
     </w:p>
     <w:p>
@@ -2418,6 +3297,14 @@
       </w:pPr>
       <w:r>
         <w:t>Cross-Format Mapping Insights: Through the Transformation and Mapping Catalog, the agent can see exactly which HL7 fields map through SDA3 to FHIR, which fields are inbound-only, and which are outbound-only. This enables gap analysis before writing any code.</w:t>
+      </w:r>
+    </w:p>
+    <w:p>
+      <w:pPr>
+        <w:pStyle w:val="ListBullet"/>
+      </w:pPr>
+      <w:r>
+        <w:t>Source Control: After creating or modifying DTLs and BPLs, the source control hooks capture the new class definitions and export them to Git for CI/CD review (see Section 10).</w:t>
       </w:r>
     </w:p>
     <w:p>
@@ -2665,6 +3552,14 @@
     </w:p>
     <w:p>
       <w:pPr>
+        <w:pStyle w:val="ListBullet"/>
+      </w:pPr>
+      <w:r>
+        <w:t>Tool specifies whether it is available to Builder, Operator, or both roles</w:t>
+      </w:r>
+    </w:p>
+    <w:p>
+      <w:pPr>
         <w:pStyle w:val="Heading3"/>
       </w:pPr>
       <w:r>
@@ -2903,6 +3798,64 @@
       </w:pPr>
       <w:r>
         <w:t>Catalog rebuild can be triggered from admin UI or scheduled</w:t>
+      </w:r>
+    </w:p>
+    <w:p>
+      <w:pPr>
+        <w:pStyle w:val="Heading3"/>
+      </w:pPr>
+      <w:r>
+        <w:t>US-D07: Implement Permission-Aware Tools</w:t>
+      </w:r>
+    </w:p>
+    <w:p>
+      <w:r>
+        <w:t>As a Developer, I want to write tools that validate the authenticated user's permissions before executing, so that the LLM agent cannot bypass the user's security constraints even if the tool is technically available.</w:t>
+      </w:r>
+    </w:p>
+    <w:p>
+      <w:r>
+        <w:t>Acceptance criteria:</w:t>
+      </w:r>
+    </w:p>
+    <w:p>
+      <w:pPr>
+        <w:pStyle w:val="ListBullet"/>
+      </w:pPr>
+      <w:r>
+        <w:t>Every mutating tool receives the authenticated username from the REST layer</w:t>
+      </w:r>
+    </w:p>
+    <w:p>
+      <w:pPr>
+        <w:pStyle w:val="ListBullet"/>
+      </w:pPr>
+      <w:r>
+        <w:t>The tool checks the user's roles and database privileges before executing (e.g., $System.Security.Check())</w:t>
+      </w:r>
+    </w:p>
+    <w:p>
+      <w:pPr>
+        <w:pStyle w:val="ListBullet"/>
+      </w:pPr>
+      <w:r>
+        <w:t>If the user lacks permission, the tool returns a structured error explaining which permission is missing</w:t>
+      </w:r>
+    </w:p>
+    <w:p>
+      <w:pPr>
+        <w:pStyle w:val="ListBullet"/>
+      </w:pPr>
+      <w:r>
+        <w:t>The agent receives this error and explains to the user what happened (not a silent failure)</w:t>
+      </w:r>
+    </w:p>
+    <w:p>
+      <w:pPr>
+        <w:pStyle w:val="ListBullet"/>
+      </w:pPr>
+      <w:r>
+        <w:t>Foundation namespace (HSLIB, HSSYS, ENSLIB) writes are always rejected regardless of user role</w:t>
       </w:r>
     </w:p>
     <w:p>
@@ -3058,6 +4011,12 @@
         <w:t>Changes saved as override rows that survive IPM upgrades</w:t>
       </w:r>
     </w:p>
+    <w:p/>
+    <w:p>
+      <w:r>
+        <w:t>Note: The AI Hub Admin can configure separate agent profiles for Builder and Operator roles, each with different ToolSet bindings. This enforces the privilege separation described in Section 2.5.</w:t>
+      </w:r>
+    </w:p>
     <w:p>
       <w:pPr>
         <w:pStyle w:val="Heading2"/>
@@ -4270,6 +5229,416 @@
     </w:p>
     <w:p/>
     <w:p>
+      <w:pPr>
+        <w:pStyle w:val="Heading2"/>
+      </w:pPr>
+      <w:r>
+        <w:t>7.7 User Stories Covered by the AI Hub Framework</w:t>
+      </w:r>
+    </w:p>
+    <w:p>
+      <w:r>
+        <w:t>The following capabilities are required by this project but are expected to be provided by the AI Hub framework itself rather than implemented in the application layer. They are listed here to ensure coverage tracking:</w:t>
+      </w:r>
+    </w:p>
+    <w:tbl>
+      <w:tblPr>
+        <w:tblStyle w:val="TableGrid"/>
+        <w:tblW w:type="auto" w:w="0"/>
+        <w:jc w:val="center"/>
+        <w:tblLook w:firstColumn="1" w:firstRow="1" w:lastColumn="0" w:lastRow="0" w:noHBand="0" w:noVBand="1" w:val="04A0"/>
+      </w:tblPr>
+      <w:tblGrid>
+        <w:gridCol w:w="2880"/>
+        <w:gridCol w:w="2880"/>
+        <w:gridCol w:w="2880"/>
+      </w:tblGrid>
+      <w:tr>
+        <w:tc>
+          <w:tcPr>
+            <w:tcW w:type="dxa" w:w="2880"/>
+            <w:shd w:val="clear" w:color="auto" w:fill="1A1A2E"/>
+          </w:tcPr>
+          <w:p>
+            <w:r>
+              <w:rPr>
+                <w:b/>
+                <w:color w:val="FFFFFF"/>
+                <w:sz w:val="20"/>
+              </w:rPr>
+              <w:t>Story</w:t>
+            </w:r>
+          </w:p>
+        </w:tc>
+        <w:tc>
+          <w:tcPr>
+            <w:tcW w:type="dxa" w:w="2880"/>
+            <w:shd w:val="clear" w:color="auto" w:fill="1A1A2E"/>
+          </w:tcPr>
+          <w:p>
+            <w:r>
+              <w:rPr>
+                <w:b/>
+                <w:color w:val="FFFFFF"/>
+                <w:sz w:val="20"/>
+              </w:rPr>
+              <w:t>Requirement</w:t>
+            </w:r>
+          </w:p>
+        </w:tc>
+        <w:tc>
+          <w:tcPr>
+            <w:tcW w:type="dxa" w:w="2880"/>
+            <w:shd w:val="clear" w:color="auto" w:fill="1A1A2E"/>
+          </w:tcPr>
+          <w:p>
+            <w:r>
+              <w:rPr>
+                <w:b/>
+                <w:color w:val="FFFFFF"/>
+                <w:sz w:val="20"/>
+              </w:rPr>
+              <w:t>Expected Coverage</w:t>
+            </w:r>
+          </w:p>
+        </w:tc>
+      </w:tr>
+      <w:tr>
+        <w:tc>
+          <w:tcPr>
+            <w:tcW w:type="dxa" w:w="2880"/>
+          </w:tcPr>
+          <w:p>
+            <w:r>
+              <w:rPr>
+                <w:sz w:val="20"/>
+              </w:rPr>
+              <w:t>US-H01</w:t>
+            </w:r>
+          </w:p>
+        </w:tc>
+        <w:tc>
+          <w:tcPr>
+            <w:tcW w:type="dxa" w:w="2880"/>
+          </w:tcPr>
+          <w:p>
+            <w:r>
+              <w:rPr>
+                <w:sz w:val="20"/>
+              </w:rPr>
+              <w:t>Agent lifecycle management (create, configure, delete agents)</w:t>
+            </w:r>
+          </w:p>
+        </w:tc>
+        <w:tc>
+          <w:tcPr>
+            <w:tcW w:type="dxa" w:w="2880"/>
+          </w:tcPr>
+          <w:p>
+            <w:r>
+              <w:rPr>
+                <w:sz w:val="20"/>
+              </w:rPr>
+              <w:t>AI Hub admin UI</w:t>
+            </w:r>
+          </w:p>
+        </w:tc>
+      </w:tr>
+      <w:tr>
+        <w:tc>
+          <w:tcPr>
+            <w:tcW w:type="dxa" w:w="2880"/>
+          </w:tcPr>
+          <w:p>
+            <w:r>
+              <w:rPr>
+                <w:sz w:val="20"/>
+              </w:rPr>
+              <w:t>US-H02</w:t>
+            </w:r>
+          </w:p>
+        </w:tc>
+        <w:tc>
+          <w:tcPr>
+            <w:tcW w:type="dxa" w:w="2880"/>
+          </w:tcPr>
+          <w:p>
+            <w:r>
+              <w:rPr>
+                <w:sz w:val="20"/>
+              </w:rPr>
+              <w:t>MCP server registration and discovery</w:t>
+            </w:r>
+          </w:p>
+        </w:tc>
+        <w:tc>
+          <w:tcPr>
+            <w:tcW w:type="dxa" w:w="2880"/>
+          </w:tcPr>
+          <w:p>
+            <w:r>
+              <w:rPr>
+                <w:sz w:val="20"/>
+              </w:rPr>
+              <w:t>AI Hub framework (%AI.MCP.Service)</w:t>
+            </w:r>
+          </w:p>
+        </w:tc>
+      </w:tr>
+      <w:tr>
+        <w:tc>
+          <w:tcPr>
+            <w:tcW w:type="dxa" w:w="2880"/>
+          </w:tcPr>
+          <w:p>
+            <w:r>
+              <w:rPr>
+                <w:sz w:val="20"/>
+              </w:rPr>
+              <w:t>US-H03</w:t>
+            </w:r>
+          </w:p>
+        </w:tc>
+        <w:tc>
+          <w:tcPr>
+            <w:tcW w:type="dxa" w:w="2880"/>
+          </w:tcPr>
+          <w:p>
+            <w:r>
+              <w:rPr>
+                <w:sz w:val="20"/>
+              </w:rPr>
+              <w:t>Tool schema validation and registration</w:t>
+            </w:r>
+          </w:p>
+        </w:tc>
+        <w:tc>
+          <w:tcPr>
+            <w:tcW w:type="dxa" w:w="2880"/>
+          </w:tcPr>
+          <w:p>
+            <w:r>
+              <w:rPr>
+                <w:sz w:val="20"/>
+              </w:rPr>
+              <w:t>AI Hub framework (%AI.Tool)</w:t>
+            </w:r>
+          </w:p>
+        </w:tc>
+      </w:tr>
+      <w:tr>
+        <w:tc>
+          <w:tcPr>
+            <w:tcW w:type="dxa" w:w="2880"/>
+          </w:tcPr>
+          <w:p>
+            <w:r>
+              <w:rPr>
+                <w:sz w:val="20"/>
+              </w:rPr>
+              <w:t>US-H04</w:t>
+            </w:r>
+          </w:p>
+        </w:tc>
+        <w:tc>
+          <w:tcPr>
+            <w:tcW w:type="dxa" w:w="2880"/>
+          </w:tcPr>
+          <w:p>
+            <w:r>
+              <w:rPr>
+                <w:sz w:val="20"/>
+              </w:rPr>
+              <w:t>LLM provider abstraction (Bedrock, Anthropic, OpenAI, etc.)</w:t>
+            </w:r>
+          </w:p>
+        </w:tc>
+        <w:tc>
+          <w:tcPr>
+            <w:tcW w:type="dxa" w:w="2880"/>
+          </w:tcPr>
+          <w:p>
+            <w:r>
+              <w:rPr>
+                <w:sz w:val="20"/>
+              </w:rPr>
+              <w:t>AI Hub framework (LLM bridge)</w:t>
+            </w:r>
+          </w:p>
+        </w:tc>
+      </w:tr>
+      <w:tr>
+        <w:tc>
+          <w:tcPr>
+            <w:tcW w:type="dxa" w:w="2880"/>
+          </w:tcPr>
+          <w:p>
+            <w:r>
+              <w:rPr>
+                <w:sz w:val="20"/>
+              </w:rPr>
+              <w:t>US-H05</w:t>
+            </w:r>
+          </w:p>
+        </w:tc>
+        <w:tc>
+          <w:tcPr>
+            <w:tcW w:type="dxa" w:w="2880"/>
+          </w:tcPr>
+          <w:p>
+            <w:r>
+              <w:rPr>
+                <w:sz w:val="20"/>
+              </w:rPr>
+              <w:t>SSE streaming from agent to client</w:t>
+            </w:r>
+          </w:p>
+        </w:tc>
+        <w:tc>
+          <w:tcPr>
+            <w:tcW w:type="dxa" w:w="2880"/>
+          </w:tcPr>
+          <w:p>
+            <w:r>
+              <w:rPr>
+                <w:sz w:val="20"/>
+              </w:rPr>
+              <w:t>AI Hub framework (%AI.Agent.StreamChat)</w:t>
+            </w:r>
+          </w:p>
+        </w:tc>
+      </w:tr>
+      <w:tr>
+        <w:tc>
+          <w:tcPr>
+            <w:tcW w:type="dxa" w:w="2880"/>
+          </w:tcPr>
+          <w:p>
+            <w:r>
+              <w:rPr>
+                <w:sz w:val="20"/>
+              </w:rPr>
+              <w:t>US-H06</w:t>
+            </w:r>
+          </w:p>
+        </w:tc>
+        <w:tc>
+          <w:tcPr>
+            <w:tcW w:type="dxa" w:w="2880"/>
+          </w:tcPr>
+          <w:p>
+            <w:r>
+              <w:rPr>
+                <w:sz w:val="20"/>
+              </w:rPr>
+              <w:t>Conversation state management across turns</w:t>
+            </w:r>
+          </w:p>
+        </w:tc>
+        <w:tc>
+          <w:tcPr>
+            <w:tcW w:type="dxa" w:w="2880"/>
+          </w:tcPr>
+          <w:p>
+            <w:r>
+              <w:rPr>
+                <w:sz w:val="20"/>
+              </w:rPr>
+              <w:t>AI Hub framework (conversation context)</w:t>
+            </w:r>
+          </w:p>
+        </w:tc>
+      </w:tr>
+      <w:tr>
+        <w:tc>
+          <w:tcPr>
+            <w:tcW w:type="dxa" w:w="2880"/>
+          </w:tcPr>
+          <w:p>
+            <w:r>
+              <w:rPr>
+                <w:sz w:val="20"/>
+              </w:rPr>
+              <w:t>US-H07</w:t>
+            </w:r>
+          </w:p>
+        </w:tc>
+        <w:tc>
+          <w:tcPr>
+            <w:tcW w:type="dxa" w:w="2880"/>
+          </w:tcPr>
+          <w:p>
+            <w:r>
+              <w:rPr>
+                <w:sz w:val="20"/>
+              </w:rPr>
+              <w:t>Role-based access control for AI Hub admin operations</w:t>
+            </w:r>
+          </w:p>
+        </w:tc>
+        <w:tc>
+          <w:tcPr>
+            <w:tcW w:type="dxa" w:w="2880"/>
+          </w:tcPr>
+          <w:p>
+            <w:r>
+              <w:rPr>
+                <w:sz w:val="20"/>
+              </w:rPr>
+              <w:t>AI Hub framework (to be confirmed)</w:t>
+            </w:r>
+          </w:p>
+        </w:tc>
+      </w:tr>
+      <w:tr>
+        <w:tc>
+          <w:tcPr>
+            <w:tcW w:type="dxa" w:w="2880"/>
+          </w:tcPr>
+          <w:p>
+            <w:r>
+              <w:rPr>
+                <w:sz w:val="20"/>
+              </w:rPr>
+              <w:t>US-H08</w:t>
+            </w:r>
+          </w:p>
+        </w:tc>
+        <w:tc>
+          <w:tcPr>
+            <w:tcW w:type="dxa" w:w="2880"/>
+          </w:tcPr>
+          <w:p>
+            <w:r>
+              <w:rPr>
+                <w:sz w:val="20"/>
+              </w:rPr>
+              <w:t>Source control hook integration for class changes</w:t>
+            </w:r>
+          </w:p>
+        </w:tc>
+        <w:tc>
+          <w:tcPr>
+            <w:tcW w:type="dxa" w:w="2880"/>
+          </w:tcPr>
+          <w:p>
+            <w:r>
+              <w:rPr>
+                <w:sz w:val="20"/>
+              </w:rPr>
+              <w:t>Health Connect Cloud (%SourceControl hooks)</w:t>
+            </w:r>
+          </w:p>
+        </w:tc>
+      </w:tr>
+    </w:tbl>
+    <w:p/>
+    <w:p>
+      <w:r>
+        <w:t>If any of these are not provided by the framework, they must be built at the application layer. The current implementation includes application-level workarounds for US-H04 (Bedrock hang) and US-H07 (custom role checks).</w:t>
+      </w:r>
+    </w:p>
+    <w:p>
       <w:r>
         <w:br w:type="page"/>
       </w:r>
@@ -4279,7 +5648,7 @@
         <w:pStyle w:val="Heading1"/>
       </w:pPr>
       <w:r>
-        <w:t>8. End User (System Integrator) Experience</w:t>
+        <w:t>8. End User Experience</w:t>
       </w:r>
     </w:p>
     <w:p>
@@ -4292,7 +5661,7 @@
     </w:p>
     <w:p>
       <w:r>
-        <w:t>The End User interacts with the copilot through a streaming chat interface. The chatbot is available at /agentic/chat/index.html (standalone) or embedded in the Interop Editor via an AI button (iframe mode).</w:t>
+        <w:t>The End User (Builder or Operator) interacts with the copilot through a streaming chat interface. The chatbot is available at /agentic/chat/index.html (standalone) or embedded in the Interop Editor via an AI button (iframe mode).</w:t>
       </w:r>
     </w:p>
     <w:p>
@@ -4390,7 +5759,7 @@
         <w:pStyle w:val="ListBullet"/>
       </w:pPr>
       <w:r>
-        <w:t>Starter prompts organized by use case category</w:t>
+        <w:t>Starter prompts organized by use case: Build, Transform, Operate, Review</w:t>
       </w:r>
     </w:p>
     <w:p>
@@ -4398,7 +5767,15 @@
         <w:pStyle w:val="ListBullet"/>
       </w:pPr>
       <w:r>
-        <w:t>Monitor enforces 60s deadline + 50K token budget per turn</w:t>
+        <w:t>Top bar shows agent name, connection status, and New Chat button</w:t>
+      </w:r>
+    </w:p>
+    <w:p>
+      <w:pPr>
+        <w:pStyle w:val="Heading2"/>
+      </w:pPr>
+      <w:r>
+        <w:t>8.2 Performance Guardrails</w:t>
       </w:r>
     </w:p>
     <w:p>
@@ -4406,7 +5783,23 @@
         <w:pStyle w:val="ListBullet"/>
       </w:pPr>
       <w:r>
-        <w:t>Top bar shows agent name, connection status, and New Chat button</w:t>
+        <w:t>Monitor enforces 60-second deadline + 50,000 token budget per turn</w:t>
+      </w:r>
+    </w:p>
+    <w:p>
+      <w:pPr>
+        <w:pStyle w:val="ListBullet"/>
+      </w:pPr>
+      <w:r>
+        <w:t>Complex tasks broken into multiple short turns with visible progress at each phase</w:t>
+      </w:r>
+    </w:p>
+    <w:p>
+      <w:pPr>
+        <w:pStyle w:val="ListBullet"/>
+      </w:pPr>
+      <w:r>
+        <w:t>If a turn exceeds limits, the monitor triggers a graceful stop and the agent summarizes partial results</w:t>
       </w:r>
     </w:p>
     <w:p>
@@ -4414,42 +5807,239 @@
         <w:pStyle w:val="Heading2"/>
       </w:pPr>
       <w:r>
-        <w:t>8.2 How the End User Works</w:t>
-      </w:r>
-    </w:p>
-    <w:p>
-      <w:r>
-        <w:t>The End User describes what they need in plain English. The agent:</w:t>
-      </w:r>
-    </w:p>
-    <w:p>
-      <w:r>
-        <w:t>1. Searches catalogs to discover relevant classes and transformations</w:t>
-      </w:r>
-    </w:p>
-    <w:p>
-      <w:r>
-        <w:t>2. Proposes a plan and presents it for approval</w:t>
-      </w:r>
-    </w:p>
-    <w:p>
-      <w:r>
-        <w:t>3. Builds step by step, pausing at each mutating action for confirmation</w:t>
-      </w:r>
-    </w:p>
-    <w:p>
-      <w:r>
-        <w:t>4. Validates the result by running automated checks and test messages</w:t>
-      </w:r>
-    </w:p>
-    <w:p>
-      <w:r>
-        <w:t>5. Reports what was done and what to verify</w:t>
-      </w:r>
-    </w:p>
-    <w:p>
-      <w:r>
-        <w:t>The End User approves or rejects each mutating step. They can redirect the agent at any point, ask clarifying questions, or request changes to the plan.</w:t>
+        <w:t>8.3 Builder User Stories</w:t>
+      </w:r>
+    </w:p>
+    <w:p>
+      <w:pPr>
+        <w:pStyle w:val="Heading3"/>
+      </w:pPr>
+      <w:r>
+        <w:t>US-E01: Build a Production Through Conversation</w:t>
+      </w:r>
+    </w:p>
+    <w:p>
+      <w:r>
+        <w:t>As a Builder, I want to describe an integration requirement in plain English and have the agent build the production, so that I can create working integrations without manually navigating the Management Portal.</w:t>
+      </w:r>
+    </w:p>
+    <w:p>
+      <w:r>
+        <w:t>Acceptance criteria:</w:t>
+      </w:r>
+    </w:p>
+    <w:p>
+      <w:pPr>
+        <w:pStyle w:val="ListBullet"/>
+      </w:pPr>
+      <w:r>
+        <w:t>Agent searches catalogs for appropriate Business Hosts</w:t>
+      </w:r>
+    </w:p>
+    <w:p>
+      <w:pPr>
+        <w:pStyle w:val="ListBullet"/>
+      </w:pPr>
+      <w:r>
+        <w:t>Agent proposes a production layout and waits for approval</w:t>
+      </w:r>
+    </w:p>
+    <w:p>
+      <w:pPr>
+        <w:pStyle w:val="ListBullet"/>
+      </w:pPr>
+      <w:r>
+        <w:t>Each mutating step goes through the confirmation gate</w:t>
+      </w:r>
+    </w:p>
+    <w:p>
+      <w:pPr>
+        <w:pStyle w:val="ListBullet"/>
+      </w:pPr>
+      <w:r>
+        <w:t>PostBuildValidation runs after build to verify configuration</w:t>
+      </w:r>
+    </w:p>
+    <w:p>
+      <w:pPr>
+        <w:pStyle w:val="ListBullet"/>
+      </w:pPr>
+      <w:r>
+        <w:t>Test message sent through the pipeline to verify end-to-end flow</w:t>
+      </w:r>
+    </w:p>
+    <w:p>
+      <w:pPr>
+        <w:pStyle w:val="ListBullet"/>
+      </w:pPr>
+      <w:r>
+        <w:t>Newly created classes are captured by source control hooks (if configured)</w:t>
+      </w:r>
+    </w:p>
+    <w:p>
+      <w:pPr>
+        <w:pStyle w:val="Heading3"/>
+      </w:pPr>
+      <w:r>
+        <w:t>US-E02: Create a Transformation Through Conversation</w:t>
+      </w:r>
+    </w:p>
+    <w:p>
+      <w:r>
+        <w:t>As a Builder, I want to describe a data transformation requirement and have the agent scaffold the DTL, so that I can create transformations with the correct source/target classes and field mappings.</w:t>
+      </w:r>
+    </w:p>
+    <w:p>
+      <w:r>
+        <w:t>Acceptance criteria:</w:t>
+      </w:r>
+    </w:p>
+    <w:p>
+      <w:pPr>
+        <w:pStyle w:val="ListBullet"/>
+      </w:pPr>
+      <w:r>
+        <w:t>Agent searches HS.* catalog for existing transformations</w:t>
+      </w:r>
+    </w:p>
+    <w:p>
+      <w:pPr>
+        <w:pStyle w:val="ListBullet"/>
+      </w:pPr>
+      <w:r>
+        <w:t>Agent creates DTL with correct source/target document types</w:t>
+      </w:r>
+    </w:p>
+    <w:p>
+      <w:pPr>
+        <w:pStyle w:val="ListBullet"/>
+      </w:pPr>
+      <w:r>
+        <w:t>Dry-run executes against sample data before deployment</w:t>
+      </w:r>
+    </w:p>
+    <w:p>
+      <w:pPr>
+        <w:pStyle w:val="ListBullet"/>
+      </w:pPr>
+      <w:r>
+        <w:t>Compiled DTL is captured by source control hooks (if configured)</w:t>
+      </w:r>
+    </w:p>
+    <w:p>
+      <w:pPr>
+        <w:pStyle w:val="Heading2"/>
+      </w:pPr>
+      <w:r>
+        <w:t>8.4 Operator User Stories</w:t>
+      </w:r>
+    </w:p>
+    <w:p>
+      <w:pPr>
+        <w:pStyle w:val="Heading3"/>
+      </w:pPr>
+      <w:r>
+        <w:t>US-E03: Triage Production Errors</w:t>
+      </w:r>
+    </w:p>
+    <w:p>
+      <w:r>
+        <w:t>As an Operator, I want to ask the agent to review recent errors and group them by cause, so that I can quickly identify systemic issues and prioritize remediation.</w:t>
+      </w:r>
+    </w:p>
+    <w:p>
+      <w:r>
+        <w:t>Acceptance criteria:</w:t>
+      </w:r>
+    </w:p>
+    <w:p>
+      <w:pPr>
+        <w:pStyle w:val="ListBullet"/>
+      </w:pPr>
+      <w:r>
+        <w:t>Agent queries Event Log for recent errors (no mutating operations)</w:t>
+      </w:r>
+    </w:p>
+    <w:p>
+      <w:pPr>
+        <w:pStyle w:val="ListBullet"/>
+      </w:pPr>
+      <w:r>
+        <w:t>Results grouped by Business Host and error message</w:t>
+      </w:r>
+    </w:p>
+    <w:p>
+      <w:pPr>
+        <w:pStyle w:val="ListBullet"/>
+      </w:pPr>
+      <w:r>
+        <w:t>Suspended and errored messages identified</w:t>
+      </w:r>
+    </w:p>
+    <w:p>
+      <w:pPr>
+        <w:pStyle w:val="ListBullet"/>
+      </w:pPr>
+      <w:r>
+        <w:t>Remediation steps recommended (but not automatically applied)</w:t>
+      </w:r>
+    </w:p>
+    <w:p>
+      <w:pPr>
+        <w:pStyle w:val="ListBullet"/>
+      </w:pPr>
+      <w:r>
+        <w:t>Agent does NOT have access to create/delete tools in Operator mode</w:t>
+      </w:r>
+    </w:p>
+    <w:p>
+      <w:pPr>
+        <w:pStyle w:val="Heading3"/>
+      </w:pPr>
+      <w:r>
+        <w:t>US-E04: Assess Production Health</w:t>
+      </w:r>
+    </w:p>
+    <w:p>
+      <w:r>
+        <w:t>As an Operator, I want to ask the agent for a health assessment of a running production, so that I can identify bottlenecks and tuning opportunities without reading raw metrics.</w:t>
+      </w:r>
+    </w:p>
+    <w:p>
+      <w:r>
+        <w:t>Acceptance criteria:</w:t>
+      </w:r>
+    </w:p>
+    <w:p>
+      <w:pPr>
+        <w:pStyle w:val="ListBullet"/>
+      </w:pPr>
+      <w:r>
+        <w:t>Agent inspects production configuration, queue depths, and throughput</w:t>
+      </w:r>
+    </w:p>
+    <w:p>
+      <w:pPr>
+        <w:pStyle w:val="ListBullet"/>
+      </w:pPr>
+      <w:r>
+        <w:t>Agent recommends operational settings changes (pool size, throttle, retry)</w:t>
+      </w:r>
+    </w:p>
+    <w:p>
+      <w:pPr>
+        <w:pStyle w:val="ListBullet"/>
+      </w:pPr>
+      <w:r>
+        <w:t>Agent can apply operational settings adjustments if the Operator approves</w:t>
+      </w:r>
+    </w:p>
+    <w:p>
+      <w:pPr>
+        <w:pStyle w:val="ListBullet"/>
+      </w:pPr>
+      <w:r>
+        <w:t>Agent cannot make structural changes (add/remove hosts, create classes)</w:t>
       </w:r>
     </w:p>
     <w:p>
@@ -4586,7 +6176,7 @@
         <w:pStyle w:val="Heading2"/>
       </w:pPr>
       <w:r>
-        <w:t>9.2 Authorization</w:t>
+        <w:t>9.2 Authorization and Role-Based Access</w:t>
       </w:r>
     </w:p>
     <w:p>
@@ -4610,6 +6200,22 @@
         <w:pStyle w:val="ListBullet"/>
       </w:pPr>
       <w:r>
+        <w:t>Builder-mode tools (create, update, delete, compile, start, stop) require specific roles assigned by the AI Hub Admin</w:t>
+      </w:r>
+    </w:p>
+    <w:p>
+      <w:pPr>
+        <w:pStyle w:val="ListBullet"/>
+      </w:pPr>
+      <w:r>
+        <w:t>Operator-mode tools (read, monitor, query) require basic authenticated access</w:t>
+      </w:r>
+    </w:p>
+    <w:p>
+      <w:pPr>
+        <w:pStyle w:val="ListBullet"/>
+      </w:pPr>
+      <w:r>
         <w:t>Mutating operations require explicit Approve from the End User via the ConfirmationGate policy -- the agent cannot modify the system without user consent</w:t>
       </w:r>
     </w:p>
@@ -4626,7 +6232,396 @@
         <w:pStyle w:val="Heading2"/>
       </w:pPr>
       <w:r>
-        <w:t>9.3 Audit Logging</w:t>
+        <w:t>9.3 LLM Service Identity and Permission Delegation</w:t>
+      </w:r>
+    </w:p>
+    <w:p>
+      <w:r>
+        <w:t>The LLM agent executes tool calls within the IRIS process. This creates a critical security requirement: the agent must NEVER bypass the authenticated user's permissions, even if the agent's service identity has broader access.</w:t>
+      </w:r>
+    </w:p>
+    <w:p>
+      <w:r>
+        <w:t>The principle: The agent acts on behalf of the authenticated user, not on its own behalf. Every tool call is executed under the authenticated user's security context. If the user cannot perform an action through the Management Portal, the agent must not perform it either.</w:t>
+      </w:r>
+    </w:p>
+    <w:p/>
+    <w:p>
+      <w:r>
+        <w:t>Implementation requirements:</w:t>
+      </w:r>
+    </w:p>
+    <w:p>
+      <w:pPr>
+        <w:pStyle w:val="ListBullet"/>
+      </w:pPr>
+      <w:r>
+        <w:t>Every tool receives the authenticated username from the REST layer (extracted from Basic auth or JWT)</w:t>
+      </w:r>
+    </w:p>
+    <w:p>
+      <w:pPr>
+        <w:pStyle w:val="ListBullet"/>
+      </w:pPr>
+      <w:r>
+        <w:t>Before executing a mutating operation, the tool checks the user's roles and database privileges via $System.Security.Check() or equivalent</w:t>
+      </w:r>
+    </w:p>
+    <w:p>
+      <w:pPr>
+        <w:pStyle w:val="ListBullet"/>
+      </w:pPr>
+      <w:r>
+        <w:t>If the user lacks the required permission, the tool returns a structured error: { "error": { "code": "PERMISSION_DENIED", "message": "...", "required_permission": "..." } }</w:t>
+      </w:r>
+    </w:p>
+    <w:p>
+      <w:pPr>
+        <w:pStyle w:val="ListBullet"/>
+      </w:pPr>
+      <w:r>
+        <w:t>The agent surfaces this error to the user in plain language</w:t>
+      </w:r>
+    </w:p>
+    <w:p>
+      <w:pPr>
+        <w:pStyle w:val="ListBullet"/>
+      </w:pPr>
+      <w:r>
+        <w:t>The audit log records both the attempted action and the permission denial</w:t>
+      </w:r>
+    </w:p>
+    <w:p/>
+    <w:p>
+      <w:r>
+        <w:t>Example scenarios:</w:t>
+      </w:r>
+    </w:p>
+    <w:tbl>
+      <w:tblPr>
+        <w:tblStyle w:val="TableGrid"/>
+        <w:tblW w:type="auto" w:w="0"/>
+        <w:jc w:val="center"/>
+        <w:tblLook w:firstColumn="1" w:firstRow="1" w:lastColumn="0" w:lastRow="0" w:noHBand="0" w:noVBand="1" w:val="04A0"/>
+      </w:tblPr>
+      <w:tblGrid>
+        <w:gridCol w:w="2880"/>
+        <w:gridCol w:w="2880"/>
+        <w:gridCol w:w="2880"/>
+      </w:tblGrid>
+      <w:tr>
+        <w:tc>
+          <w:tcPr>
+            <w:tcW w:type="dxa" w:w="2880"/>
+            <w:shd w:val="clear" w:color="auto" w:fill="1A1A2E"/>
+          </w:tcPr>
+          <w:p>
+            <w:r>
+              <w:rPr>
+                <w:b/>
+                <w:color w:val="FFFFFF"/>
+                <w:sz w:val="20"/>
+              </w:rPr>
+              <w:t>User Request</w:t>
+            </w:r>
+          </w:p>
+        </w:tc>
+        <w:tc>
+          <w:tcPr>
+            <w:tcW w:type="dxa" w:w="2880"/>
+            <w:shd w:val="clear" w:color="auto" w:fill="1A1A2E"/>
+          </w:tcPr>
+          <w:p>
+            <w:r>
+              <w:rPr>
+                <w:b/>
+                <w:color w:val="FFFFFF"/>
+                <w:sz w:val="20"/>
+              </w:rPr>
+              <w:t>User Has Permission?</w:t>
+            </w:r>
+          </w:p>
+        </w:tc>
+        <w:tc>
+          <w:tcPr>
+            <w:tcW w:type="dxa" w:w="2880"/>
+            <w:shd w:val="clear" w:color="auto" w:fill="1A1A2E"/>
+          </w:tcPr>
+          <w:p>
+            <w:r>
+              <w:rPr>
+                <w:b/>
+                <w:color w:val="FFFFFF"/>
+                <w:sz w:val="20"/>
+              </w:rPr>
+              <w:t>Agent Behavior</w:t>
+            </w:r>
+          </w:p>
+        </w:tc>
+      </w:tr>
+      <w:tr>
+        <w:tc>
+          <w:tcPr>
+            <w:tcW w:type="dxa" w:w="2880"/>
+          </w:tcPr>
+          <w:p>
+            <w:r>
+              <w:rPr>
+                <w:sz w:val="20"/>
+              </w:rPr>
+              <w:t>Create a new production</w:t>
+            </w:r>
+          </w:p>
+        </w:tc>
+        <w:tc>
+          <w:tcPr>
+            <w:tcW w:type="dxa" w:w="2880"/>
+          </w:tcPr>
+          <w:p>
+            <w:r>
+              <w:rPr>
+                <w:sz w:val="20"/>
+              </w:rPr>
+              <w:t>Yes (%DB_WRITE)</w:t>
+            </w:r>
+          </w:p>
+        </w:tc>
+        <w:tc>
+          <w:tcPr>
+            <w:tcW w:type="dxa" w:w="2880"/>
+          </w:tcPr>
+          <w:p>
+            <w:r>
+              <w:rPr>
+                <w:sz w:val="20"/>
+              </w:rPr>
+              <w:t>Agent proceeds with confirmation gate</w:t>
+            </w:r>
+          </w:p>
+        </w:tc>
+      </w:tr>
+      <w:tr>
+        <w:tc>
+          <w:tcPr>
+            <w:tcW w:type="dxa" w:w="2880"/>
+          </w:tcPr>
+          <w:p>
+            <w:r>
+              <w:rPr>
+                <w:sz w:val="20"/>
+              </w:rPr>
+              <w:t>Create a new production</w:t>
+            </w:r>
+          </w:p>
+        </w:tc>
+        <w:tc>
+          <w:tcPr>
+            <w:tcW w:type="dxa" w:w="2880"/>
+          </w:tcPr>
+          <w:p>
+            <w:r>
+              <w:rPr>
+                <w:sz w:val="20"/>
+              </w:rPr>
+              <w:t>No (read-only access)</w:t>
+            </w:r>
+          </w:p>
+        </w:tc>
+        <w:tc>
+          <w:tcPr>
+            <w:tcW w:type="dxa" w:w="2880"/>
+          </w:tcPr>
+          <w:p>
+            <w:r>
+              <w:rPr>
+                <w:sz w:val="20"/>
+              </w:rPr>
+              <w:t>Agent explains the user lacks write permission</w:t>
+            </w:r>
+          </w:p>
+        </w:tc>
+      </w:tr>
+      <w:tr>
+        <w:tc>
+          <w:tcPr>
+            <w:tcW w:type="dxa" w:w="2880"/>
+          </w:tcPr>
+          <w:p>
+            <w:r>
+              <w:rPr>
+                <w:sz w:val="20"/>
+              </w:rPr>
+              <w:t>Create an OAuth 2.0 client</w:t>
+            </w:r>
+          </w:p>
+        </w:tc>
+        <w:tc>
+          <w:tcPr>
+            <w:tcW w:type="dxa" w:w="2880"/>
+          </w:tcPr>
+          <w:p>
+            <w:r>
+              <w:rPr>
+                <w:sz w:val="20"/>
+              </w:rPr>
+              <w:t>No (requires %Admin_Secure)</w:t>
+            </w:r>
+          </w:p>
+        </w:tc>
+        <w:tc>
+          <w:tcPr>
+            <w:tcW w:type="dxa" w:w="2880"/>
+          </w:tcPr>
+          <w:p>
+            <w:r>
+              <w:rPr>
+                <w:sz w:val="20"/>
+              </w:rPr>
+              <w:t>Agent explains the user needs security admin privileges</w:t>
+            </w:r>
+          </w:p>
+        </w:tc>
+      </w:tr>
+      <w:tr>
+        <w:tc>
+          <w:tcPr>
+            <w:tcW w:type="dxa" w:w="2880"/>
+          </w:tcPr>
+          <w:p>
+            <w:r>
+              <w:rPr>
+                <w:sz w:val="20"/>
+              </w:rPr>
+              <w:t>Query the event log</w:t>
+            </w:r>
+          </w:p>
+        </w:tc>
+        <w:tc>
+          <w:tcPr>
+            <w:tcW w:type="dxa" w:w="2880"/>
+          </w:tcPr>
+          <w:p>
+            <w:r>
+              <w:rPr>
+                <w:sz w:val="20"/>
+              </w:rPr>
+              <w:t>Yes (any authenticated user)</w:t>
+            </w:r>
+          </w:p>
+        </w:tc>
+        <w:tc>
+          <w:tcPr>
+            <w:tcW w:type="dxa" w:w="2880"/>
+          </w:tcPr>
+          <w:p>
+            <w:r>
+              <w:rPr>
+                <w:sz w:val="20"/>
+              </w:rPr>
+              <w:t>Agent executes the read-only query</w:t>
+            </w:r>
+          </w:p>
+        </w:tc>
+      </w:tr>
+      <w:tr>
+        <w:tc>
+          <w:tcPr>
+            <w:tcW w:type="dxa" w:w="2880"/>
+          </w:tcPr>
+          <w:p>
+            <w:r>
+              <w:rPr>
+                <w:sz w:val="20"/>
+              </w:rPr>
+              <w:t>Modify classes in HSLIB</w:t>
+            </w:r>
+          </w:p>
+        </w:tc>
+        <w:tc>
+          <w:tcPr>
+            <w:tcW w:type="dxa" w:w="2880"/>
+          </w:tcPr>
+          <w:p>
+            <w:r>
+              <w:rPr>
+                <w:sz w:val="20"/>
+              </w:rPr>
+              <w:t>No (Foundation namespace)</w:t>
+            </w:r>
+          </w:p>
+        </w:tc>
+        <w:tc>
+          <w:tcPr>
+            <w:tcW w:type="dxa" w:w="2880"/>
+          </w:tcPr>
+          <w:p>
+            <w:r>
+              <w:rPr>
+                <w:sz w:val="20"/>
+              </w:rPr>
+              <w:t>Agent explains Foundation namespaces are read-only</w:t>
+            </w:r>
+          </w:p>
+        </w:tc>
+      </w:tr>
+    </w:tbl>
+    <w:p/>
+    <w:p>
+      <w:pPr>
+        <w:pStyle w:val="Heading2"/>
+      </w:pPr>
+      <w:r>
+        <w:t>9.4 Namespace Constraints</w:t>
+      </w:r>
+    </w:p>
+    <w:p>
+      <w:r>
+        <w:t>Not all namespaces are equal. IRIS for Health distinguishes between Foundation namespaces (shipped with the product) and non-Foundation namespaces (created by users for their integration work).</w:t>
+      </w:r>
+    </w:p>
+    <w:p/>
+    <w:p>
+      <w:r>
+        <w:t>Foundation namespaces (HSLIB, HSSYS, ENSLIB, and others marked as Foundation): always read-only for the agent, regardless of user permissions. The agent can search and inspect classes but MUST NOT create, modify, or delete any class definition. This is a hard constraint -- the ConfirmationGate cannot override it.</w:t>
+      </w:r>
+    </w:p>
+    <w:p/>
+    <w:p>
+      <w:r>
+        <w:t>Non-Foundation namespaces (HSCUSTOM, user-created namespaces): the agent respects the authenticated user's database-level permissions. Users with %DB_WRITE can create and modify classes (through the agent with confirmation). Users with read-only access can inspect and search but not modify.</w:t>
+      </w:r>
+    </w:p>
+    <w:p>
+      <w:pPr>
+        <w:pStyle w:val="Heading2"/>
+      </w:pPr>
+      <w:r>
+        <w:t>9.5 Builder vs Operator Privilege Separation</w:t>
+      </w:r>
+    </w:p>
+    <w:p>
+      <w:r>
+        <w:t>The security distinction between Builder and Operator is enforced at two levels:</w:t>
+      </w:r>
+    </w:p>
+    <w:p/>
+    <w:p>
+      <w:r>
+        <w:t>Level 1: Tool availability (configured by AI Hub Admin). The AI Hub Admin binds different ToolSets to Builder-mode and Operator-mode agent configurations. Operator agents do not have access to mutating tools. Even if an Operator user has database-level write access, the agent cannot call tools that are not bound to the Operator configuration. This prevents prompt injection attacks from escalating Operator sessions to Builder-level access.</w:t>
+      </w:r>
+    </w:p>
+    <w:p/>
+    <w:p>
+      <w:r>
+        <w:t>Level 2: Permission validation (enforced by tools). Even in Builder mode, every mutating tool validates the user's permissions before executing. The ConfirmationGate provides a third layer: the user must explicitly approve each mutating action.</w:t>
+      </w:r>
+    </w:p>
+    <w:p>
+      <w:pPr>
+        <w:pStyle w:val="Heading2"/>
+      </w:pPr>
+      <w:r>
+        <w:t>9.6 Audit Logging</w:t>
       </w:r>
     </w:p>
     <w:p>
@@ -5010,7 +7005,7 @@
               <w:rPr>
                 <w:sz w:val="20"/>
               </w:rPr>
-              <w:t>Error message (if status &gt;= 400)</w:t>
+              <w:t>Error message (if status &gt;= 400), including permission denials</w:t>
             </w:r>
           </w:p>
         </w:tc>
@@ -5103,7 +7098,7 @@
         <w:pStyle w:val="Heading2"/>
       </w:pPr>
       <w:r>
-        <w:t>9.4 Secret Management</w:t>
+        <w:t>9.7 Secret Management</w:t>
       </w:r>
     </w:p>
     <w:p>
@@ -5148,17 +7143,17 @@
         <w:pStyle w:val="Heading2"/>
       </w:pPr>
       <w:r>
-        <w:t>9.5 Security Policies</w:t>
-      </w:r>
-    </w:p>
-    <w:p>
-      <w:r>
-        <w:t>ConfirmationGate policy: Mutating tools (create, update, delete, start, stop) pause execution and surface an Approve/Reject prompt in the chat UI. The agent cannot modify productions, transformations, or routing rules without the End User clicking Approve.</w:t>
-      </w:r>
-    </w:p>
-    <w:p>
-      <w:r>
-        <w:t>ToolFilter policy: Strips framework-default tools (FileSystem, SQL, ShellTools) from the LLM's tool catalog. Reduces the catalog from 57 to 42 healthcare-specific tools, saving ~5K tokens per request and preventing access to generic system tools.</w:t>
+        <w:t>9.8 Security Policies</w:t>
+      </w:r>
+    </w:p>
+    <w:p>
+      <w:r>
+        <w:t>ConfirmationGate policy: Mutating tools (create, update, delete, start, stop) pause execution and surface an Approve/Reject prompt in the chat UI. The agent cannot modify productions, transformations, or routing rules without the End User clicking Approve. This is the last line of defense after permission checks and namespace validation.</w:t>
+      </w:r>
+    </w:p>
+    <w:p>
+      <w:r>
+        <w:t>ToolFilter policy: Strips framework-default tools (FileSystem, SQL, ShellTools) from the LLM's tool catalog. Reduces the catalog from 57 to 42 healthcare-specific tools, saving ~5K tokens per request. This policy also prevents the LLM from using tools that could bypass the permission model (e.g., raw SQL execution).</w:t>
       </w:r>
     </w:p>
     <w:p>
@@ -5171,12 +7166,273 @@
         <w:pStyle w:val="Heading1"/>
       </w:pPr>
       <w:r>
-        <w:t>10. End-to-End Scenario</w:t>
-      </w:r>
-    </w:p>
-    <w:p>
-      <w:r>
-        <w:t>This scenario demonstrates all three personas working together:</w:t>
+        <w:t>10. Source Control and Change Control Integration</w:t>
+      </w:r>
+    </w:p>
+    <w:p>
+      <w:pPr>
+        <w:pStyle w:val="Heading2"/>
+      </w:pPr>
+      <w:r>
+        <w:t>10.1 The Problem</w:t>
+      </w:r>
+    </w:p>
+    <w:p>
+      <w:r>
+        <w:t>When the agent creates a new production, DTL, BPL, or routing rule, it is creating or modifying IRIS class definitions. These class changes must flow through the same change control process as any manual edit -- version control tracking, peer review, and CI/CD validation. Without source control integration, agent-created artifacts become invisible to the deployment pipeline.</w:t>
+      </w:r>
+    </w:p>
+    <w:p>
+      <w:pPr>
+        <w:pStyle w:val="Heading2"/>
+      </w:pPr>
+      <w:r>
+        <w:t>10.2 Health Connect Cloud Source Control Model</w:t>
+      </w:r>
+    </w:p>
+    <w:p>
+      <w:r>
+        <w:t>Health Connect Cloud provides version control hooks via the %SourceControl framework. These hooks intercept class save and compile events, export class definitions to a local Git repository, track which user made which change, and feed into a GitLab-based CI/CD pipeline that validates, tests, and deploys changes across environments (dev -&gt; staging -&gt; production).</w:t>
+      </w:r>
+    </w:p>
+    <w:p>
+      <w:r>
+        <w:t>The agent's work must integrate with this model. Agent-created artifacts are NOT a special case -- they follow the same path as manually created artifacts.</w:t>
+      </w:r>
+    </w:p>
+    <w:p>
+      <w:pPr>
+        <w:pStyle w:val="Heading2"/>
+      </w:pPr>
+      <w:r>
+        <w:t>10.3 Integration Requirements</w:t>
+      </w:r>
+    </w:p>
+    <w:p>
+      <w:pPr>
+        <w:pStyle w:val="ListBullet"/>
+      </w:pPr>
+      <w:r>
+        <w:t>Artifact capture: When the agent creates or modifies a class, the %SourceControl hooks fire automatically because the agent uses standard IRIS APIs ($System.OBJ.Compile, %Dictionary) that trigger the hooks.</w:t>
+      </w:r>
+    </w:p>
+    <w:p>
+      <w:pPr>
+        <w:pStyle w:val="ListBullet"/>
+      </w:pPr>
+      <w:r>
+        <w:t>User attribution: Changes are attributed to the authenticated user (the Builder), not to the agent's service account. The source control hooks capture the $username from the IRIS process context.</w:t>
+      </w:r>
+    </w:p>
+    <w:p>
+      <w:pPr>
+        <w:pStyle w:val="ListBullet"/>
+      </w:pPr>
+      <w:r>
+        <w:t>No bypass: The agent does not use any mechanism that would bypass source control hooks. All class modifications go through the documented %Dictionary and $System.OBJ APIs.</w:t>
+      </w:r>
+    </w:p>
+    <w:p>
+      <w:pPr>
+        <w:pStyle w:val="Heading2"/>
+      </w:pPr>
+      <w:r>
+        <w:t>10.4 CI/CD Pipeline Flow</w:t>
+      </w:r>
+    </w:p>
+    <w:p>
+      <w:r>
+        <w:t>Builder asks agent to create a production</w:t>
+      </w:r>
+    </w:p>
+    <w:p>
+      <w:r>
+        <w:t xml:space="preserve">  --&gt; Agent creates class via $System.OBJ.Compile()</w:t>
+      </w:r>
+    </w:p>
+    <w:p>
+      <w:r>
+        <w:t xml:space="preserve">    --&gt; %SourceControl hook fires</w:t>
+      </w:r>
+    </w:p>
+    <w:p>
+      <w:r>
+        <w:t xml:space="preserve">      --&gt; Class definition exported to local Git working directory</w:t>
+      </w:r>
+    </w:p>
+    <w:p>
+      <w:r>
+        <w:t xml:space="preserve">        --&gt; Builder commits and pushes to GitLab</w:t>
+      </w:r>
+    </w:p>
+    <w:p>
+      <w:r>
+        <w:t xml:space="preserve">          --&gt; CI/CD pipeline runs: lint, validate, test</w:t>
+      </w:r>
+    </w:p>
+    <w:p>
+      <w:r>
+        <w:t xml:space="preserve">            --&gt; On success: deploy to staging/production</w:t>
+      </w:r>
+    </w:p>
+    <w:p>
+      <w:pPr>
+        <w:pStyle w:val="Heading2"/>
+      </w:pPr>
+      <w:r>
+        <w:t>10.5 User Stories</w:t>
+      </w:r>
+    </w:p>
+    <w:p>
+      <w:pPr>
+        <w:pStyle w:val="Heading3"/>
+      </w:pPr>
+      <w:r>
+        <w:t>US-SC01: Agent-Created Artifacts Appear in Source Control</w:t>
+      </w:r>
+    </w:p>
+    <w:p>
+      <w:r>
+        <w:t>As a Builder, I want the productions, DTLs, and BPLs that the agent creates to be captured by source control hooks, so that they flow through the same CI/CD pipeline as manually created artifacts.</w:t>
+      </w:r>
+    </w:p>
+    <w:p>
+      <w:r>
+        <w:t>Acceptance criteria:</w:t>
+      </w:r>
+    </w:p>
+    <w:p>
+      <w:pPr>
+        <w:pStyle w:val="ListBullet"/>
+      </w:pPr>
+      <w:r>
+        <w:t>Agent uses standard IRIS APIs for all class operations</w:t>
+      </w:r>
+    </w:p>
+    <w:p>
+      <w:pPr>
+        <w:pStyle w:val="ListBullet"/>
+      </w:pPr>
+      <w:r>
+        <w:t>%SourceControl hooks fire on every class save and compile</w:t>
+      </w:r>
+    </w:p>
+    <w:p>
+      <w:pPr>
+        <w:pStyle w:val="ListBullet"/>
+      </w:pPr>
+      <w:r>
+        <w:t>Exported class definitions appear in the local Git working directory</w:t>
+      </w:r>
+    </w:p>
+    <w:p>
+      <w:pPr>
+        <w:pStyle w:val="ListBullet"/>
+      </w:pPr>
+      <w:r>
+        <w:t>Changes are attributed to the authenticated user, not the agent</w:t>
+      </w:r>
+    </w:p>
+    <w:p>
+      <w:pPr>
+        <w:pStyle w:val="Heading3"/>
+      </w:pPr>
+      <w:r>
+        <w:t>US-SC02: Agent Reports Source Control Status</w:t>
+      </w:r>
+    </w:p>
+    <w:p>
+      <w:r>
+        <w:t>As a Builder, I want the agent to report whether source control captured the new classes after a build, so that I know whether my changes are tracked.</w:t>
+      </w:r>
+    </w:p>
+    <w:p>
+      <w:r>
+        <w:t>Acceptance criteria:</w:t>
+      </w:r>
+    </w:p>
+    <w:p>
+      <w:pPr>
+        <w:pStyle w:val="ListBullet"/>
+      </w:pPr>
+      <w:r>
+        <w:t>After creating classes, the agent checks whether %SourceControl hooks are active</w:t>
+      </w:r>
+    </w:p>
+    <w:p>
+      <w:pPr>
+        <w:pStyle w:val="ListBullet"/>
+      </w:pPr>
+      <w:r>
+        <w:t>If active: agent reports 'Classes exported to source control'</w:t>
+      </w:r>
+    </w:p>
+    <w:p>
+      <w:pPr>
+        <w:pStyle w:val="ListBullet"/>
+      </w:pPr>
+      <w:r>
+        <w:t>If not active: agent warns 'Source control is not configured in this namespace'</w:t>
+      </w:r>
+    </w:p>
+    <w:p>
+      <w:pPr>
+        <w:pStyle w:val="Heading3"/>
+      </w:pPr>
+      <w:r>
+        <w:t>US-SC03: Agent Respects Source Control Locks</w:t>
+      </w:r>
+    </w:p>
+    <w:p>
+      <w:r>
+        <w:t>As a Builder, I want the agent to respect source control locks on classes, so that it does not modify a class that another user has locked for editing.</w:t>
+      </w:r>
+    </w:p>
+    <w:p>
+      <w:r>
+        <w:t>Acceptance criteria:</w:t>
+      </w:r>
+    </w:p>
+    <w:p>
+      <w:pPr>
+        <w:pStyle w:val="ListBullet"/>
+      </w:pPr>
+      <w:r>
+        <w:t>Before modifying a class, the agent checks whether it is locked</w:t>
+      </w:r>
+    </w:p>
+    <w:p>
+      <w:pPr>
+        <w:pStyle w:val="ListBullet"/>
+      </w:pPr>
+      <w:r>
+        <w:t>If locked: agent reports 'This class is locked by [user]. Cannot modify.'</w:t>
+      </w:r>
+    </w:p>
+    <w:p>
+      <w:pPr>
+        <w:pStyle w:val="ListBullet"/>
+      </w:pPr>
+      <w:r>
+        <w:t>If unlocked: agent proceeds with the normal confirmation gate flow</w:t>
+      </w:r>
+    </w:p>
+    <w:p>
+      <w:r>
+        <w:br w:type="page"/>
+      </w:r>
+    </w:p>
+    <w:p>
+      <w:pPr>
+        <w:pStyle w:val="Heading1"/>
+      </w:pPr>
+      <w:r>
+        <w:t>11. End-to-End Scenario</w:t>
+      </w:r>
+    </w:p>
+    <w:p>
+      <w:r>
+        <w:t>This scenario demonstrates all four personas working together:</w:t>
       </w:r>
     </w:p>
     <w:p>
@@ -5218,7 +7474,7 @@
         <w:t>AI Hub Admin</w:t>
       </w:r>
       <w:r>
-        <w:t xml:space="preserve"> goes to the Connections tab, verifies the LLM connection shows a green status dot</w:t>
+        <w:t xml:space="preserve"> configures Builder and Operator agent profiles with appropriate ToolSet bindings</w:t>
       </w:r>
     </w:p>
     <w:p>
@@ -5232,7 +7488,7 @@
         <w:t>AI Hub Admin</w:t>
       </w:r>
       <w:r>
-        <w:t xml:space="preserve"> opens the Catalogs tab, verifies both catalogs (search_ens: 164 classes, search_hs: 58 classes) are indexed</w:t>
+        <w:t xml:space="preserve"> goes to the Connections tab, verifies the LLM connection shows a green status dot</w:t>
       </w:r>
     </w:p>
     <w:p>
@@ -5246,7 +7502,7 @@
         <w:t>AI Hub Admin</w:t>
       </w:r>
       <w:r>
-        <w:t xml:space="preserve"> opens the Transforms tab, selects HL7 v2 -&gt; FHIR R4, reviews Address field mappings to verify the Transformation and Mapping Catalog is populated</w:t>
+        <w:t xml:space="preserve"> opens the Catalogs tab, verifies both catalogs (search_ens: 164 classes, search_hs: 58 classes) are indexed</w:t>
       </w:r>
     </w:p>
     <w:p>
@@ -5257,7 +7513,21 @@
         <w:rPr>
           <w:b/>
         </w:rPr>
-        <w:t>End User</w:t>
+        <w:t>AI Hub Admin</w:t>
+      </w:r>
+      <w:r>
+        <w:t xml:space="preserve"> opens the Transforms tab, selects HL7 v2 -&gt; FHIR R4, reviews Address field mappings to verify the Transformation and Mapping Catalog is populated</w:t>
+      </w:r>
+    </w:p>
+    <w:p>
+      <w:r>
+        <w:t xml:space="preserve">7. </w:t>
+      </w:r>
+      <w:r>
+        <w:rPr>
+          <w:b/>
+        </w:rPr>
+        <w:t>Builder</w:t>
       </w:r>
       <w:r>
         <w:t xml:space="preserve"> opens the chatbot and asks: 'Build me a production that receives ADT^A04 messages via MLLP, transforms patient demographics to FHIR R4, and sends them to a REST endpoint'</w:t>
@@ -5265,7 +7535,7 @@
     </w:p>
     <w:p>
       <w:r>
-        <w:t xml:space="preserve">7. </w:t>
+        <w:t xml:space="preserve">8. </w:t>
       </w:r>
       <w:r>
         <w:rPr>
@@ -5274,12 +7544,12 @@
         <w:t>Agent</w:t>
       </w:r>
       <w:r>
-        <w:t xml:space="preserve"> searches the Ens.* catalog for appropriate Business Hosts (EnsLib.HL7.Service.TCPService, EnsLib.FHIR.Operation.REST)</w:t>
-      </w:r>
-    </w:p>
-    <w:p>
-      <w:r>
-        <w:t xml:space="preserve">8. </w:t>
+        <w:t xml:space="preserve"> validates that the Builder has %DB_WRITE permission on the target namespace</w:t>
+      </w:r>
+    </w:p>
+    <w:p>
+      <w:r>
+        <w:t xml:space="preserve">9. </w:t>
       </w:r>
       <w:r>
         <w:rPr>
@@ -5288,21 +7558,7 @@
         <w:t>Agent</w:t>
       </w:r>
       <w:r>
-        <w:t xml:space="preserve"> proposes the production layout and asks the End User to approve</w:t>
-      </w:r>
-    </w:p>
-    <w:p>
-      <w:r>
-        <w:t xml:space="preserve">9. </w:t>
-      </w:r>
-      <w:r>
-        <w:rPr>
-          <w:b/>
-        </w:rPr>
-        <w:t>End User</w:t>
-      </w:r>
-      <w:r>
-        <w:t xml:space="preserve"> clicks Approve</w:t>
+        <w:t xml:space="preserve"> searches the Ens.* catalog for appropriate Business Hosts (EnsLib.HL7.Service.TCPService, EnsLib.FHIR.Operation.REST)</w:t>
       </w:r>
     </w:p>
     <w:p>
@@ -5316,12 +7572,26 @@
         <w:t>Agent</w:t>
       </w:r>
       <w:r>
-        <w:t xml:space="preserve"> creates the production, adds the hosts, configures settings</w:t>
+        <w:t xml:space="preserve"> proposes the production layout and asks the Builder to approve</w:t>
       </w:r>
     </w:p>
     <w:p>
       <w:r>
         <w:t xml:space="preserve">11. </w:t>
+      </w:r>
+      <w:r>
+        <w:rPr>
+          <w:b/>
+        </w:rPr>
+        <w:t>Builder</w:t>
+      </w:r>
+      <w:r>
+        <w:t xml:space="preserve"> clicks Approve</w:t>
+      </w:r>
+    </w:p>
+    <w:p>
+      <w:r>
+        <w:t xml:space="preserve">12. </w:t>
       </w:r>
       <w:r>
         <w:rPr>
@@ -5330,12 +7600,12 @@
         <w:t>Agent</w:t>
       </w:r>
       <w:r>
-        <w:t xml:space="preserve"> builds and sends a test HL7 ADT^A04 message</w:t>
-      </w:r>
-    </w:p>
-    <w:p>
-      <w:r>
-        <w:t xml:space="preserve">12. </w:t>
+        <w:t xml:space="preserve"> creates the production, adds the hosts, configures settings. Source control hooks capture each class change</w:t>
+      </w:r>
+    </w:p>
+    <w:p>
+      <w:r>
+        <w:t xml:space="preserve">13. </w:t>
       </w:r>
       <w:r>
         <w:rPr>
@@ -5344,12 +7614,68 @@
         <w:t>Agent</w:t>
       </w:r>
       <w:r>
-        <w:t xml:space="preserve"> validates the result and reports success</w:t>
-      </w:r>
-    </w:p>
-    <w:p>
-      <w:r>
-        <w:t xml:space="preserve">13. </w:t>
+        <w:t xml:space="preserve"> builds and sends a test HL7 ADT^A04 message</w:t>
+      </w:r>
+    </w:p>
+    <w:p>
+      <w:r>
+        <w:t xml:space="preserve">14. </w:t>
+      </w:r>
+      <w:r>
+        <w:rPr>
+          <w:b/>
+        </w:rPr>
+        <w:t>Agent</w:t>
+      </w:r>
+      <w:r>
+        <w:t xml:space="preserve"> validates the result and reports success, confirms source control captured the changes</w:t>
+      </w:r>
+    </w:p>
+    <w:p>
+      <w:r>
+        <w:t xml:space="preserve">15. </w:t>
+      </w:r>
+      <w:r>
+        <w:rPr>
+          <w:b/>
+        </w:rPr>
+        <w:t>Operator</w:t>
+      </w:r>
+      <w:r>
+        <w:t xml:space="preserve"> opens the chatbot the next day and asks: 'How is the ADT production performing? Any errors in the last 24 hours?'</w:t>
+      </w:r>
+    </w:p>
+    <w:p>
+      <w:r>
+        <w:t xml:space="preserve">16. </w:t>
+      </w:r>
+      <w:r>
+        <w:rPr>
+          <w:b/>
+        </w:rPr>
+        <w:t>Agent</w:t>
+      </w:r>
+      <w:r>
+        <w:t xml:space="preserve"> queries the Event Log (read-only), reports throughput statistics and any issues</w:t>
+      </w:r>
+    </w:p>
+    <w:p>
+      <w:r>
+        <w:t xml:space="preserve">17. </w:t>
+      </w:r>
+      <w:r>
+        <w:rPr>
+          <w:b/>
+        </w:rPr>
+        <w:t>Operator</w:t>
+      </w:r>
+      <w:r>
+        <w:t xml:space="preserve"> asks: 'Increase the pool size on the TCPService to 3' -- the agent adjusts the operational setting after approval</w:t>
+      </w:r>
+    </w:p>
+    <w:p>
+      <w:r>
+        <w:t xml:space="preserve">18. </w:t>
       </w:r>
       <w:r>
         <w:rPr>
@@ -5358,7 +7684,7 @@
         <w:t>AI Hub Admin</w:t>
       </w:r>
       <w:r>
-        <w:t xml:space="preserve"> reviews the audit log to see the complete trace of all tool calls</w:t>
+        <w:t xml:space="preserve"> reviews the audit log to see the complete trace of all actions by both Builder and Operator</w:t>
       </w:r>
     </w:p>
     <w:p>
@@ -5366,7 +7692,7 @@
         <w:pStyle w:val="Heading1"/>
       </w:pPr>
       <w:r>
-        <w:t>11. Non-Functional Requirements</w:t>
+        <w:t>12. Non-Functional Requirements</w:t>
       </w:r>
     </w:p>
     <w:tbl>
@@ -5606,6 +7932,34 @@
                 <w:sz w:val="20"/>
               </w:rPr>
               <w:t>Chrome 120+, Edge 120+, Firefox 120+ (ES2020 baseline)</w:t>
+            </w:r>
+          </w:p>
+        </w:tc>
+      </w:tr>
+      <w:tr>
+        <w:tc>
+          <w:tcPr>
+            <w:tcW w:type="dxa" w:w="4320"/>
+          </w:tcPr>
+          <w:p>
+            <w:r>
+              <w:rPr>
+                <w:sz w:val="20"/>
+              </w:rPr>
+              <w:t>Permission check latency</w:t>
+            </w:r>
+          </w:p>
+        </w:tc>
+        <w:tc>
+          <w:tcPr>
+            <w:tcW w:type="dxa" w:w="4320"/>
+          </w:tcPr>
+          <w:p>
+            <w:r>
+              <w:rPr>
+                <w:sz w:val="20"/>
+              </w:rPr>
+              <w:t>&lt; 10ms per tool call (cached role lookups)</w:t>
             </w:r>
           </w:p>
         </w:tc>
@@ -6592,6 +8946,252 @@
       </w:tr>
     </w:tbl>
     <w:p/>
+    <w:p>
+      <w:pPr>
+        <w:pStyle w:val="Heading1"/>
+      </w:pPr>
+      <w:r>
+        <w:t>Appendix C: Security Enforcement Layers</w:t>
+      </w:r>
+    </w:p>
+    <w:p>
+      <w:r>
+        <w:t>The agent's actions pass through four enforcement layers before any mutation occurs:</w:t>
+      </w:r>
+    </w:p>
+    <w:tbl>
+      <w:tblPr>
+        <w:tblStyle w:val="TableGrid"/>
+        <w:tblW w:type="auto" w:w="0"/>
+        <w:jc w:val="center"/>
+        <w:tblLook w:firstColumn="1" w:firstRow="1" w:lastColumn="0" w:lastRow="0" w:noHBand="0" w:noVBand="1" w:val="04A0"/>
+      </w:tblPr>
+      <w:tblGrid>
+        <w:gridCol w:w="2880"/>
+        <w:gridCol w:w="2880"/>
+        <w:gridCol w:w="2880"/>
+      </w:tblGrid>
+      <w:tr>
+        <w:tc>
+          <w:tcPr>
+            <w:tcW w:type="dxa" w:w="2880"/>
+            <w:shd w:val="clear" w:color="auto" w:fill="1A1A2E"/>
+          </w:tcPr>
+          <w:p>
+            <w:r>
+              <w:rPr>
+                <w:b/>
+                <w:color w:val="FFFFFF"/>
+                <w:sz w:val="20"/>
+              </w:rPr>
+              <w:t>Layer</w:t>
+            </w:r>
+          </w:p>
+        </w:tc>
+        <w:tc>
+          <w:tcPr>
+            <w:tcW w:type="dxa" w:w="2880"/>
+            <w:shd w:val="clear" w:color="auto" w:fill="1A1A2E"/>
+          </w:tcPr>
+          <w:p>
+            <w:r>
+              <w:rPr>
+                <w:b/>
+                <w:color w:val="FFFFFF"/>
+                <w:sz w:val="20"/>
+              </w:rPr>
+              <w:t>Enforced By</w:t>
+            </w:r>
+          </w:p>
+        </w:tc>
+        <w:tc>
+          <w:tcPr>
+            <w:tcW w:type="dxa" w:w="2880"/>
+            <w:shd w:val="clear" w:color="auto" w:fill="1A1A2E"/>
+          </w:tcPr>
+          <w:p>
+            <w:r>
+              <w:rPr>
+                <w:b/>
+                <w:color w:val="FFFFFF"/>
+                <w:sz w:val="20"/>
+              </w:rPr>
+              <w:t>What It Checks</w:t>
+            </w:r>
+          </w:p>
+        </w:tc>
+      </w:tr>
+      <w:tr>
+        <w:tc>
+          <w:tcPr>
+            <w:tcW w:type="dxa" w:w="2880"/>
+          </w:tcPr>
+          <w:p>
+            <w:r>
+              <w:rPr>
+                <w:sz w:val="20"/>
+              </w:rPr>
+              <w:t>1. Tool availability</w:t>
+            </w:r>
+          </w:p>
+        </w:tc>
+        <w:tc>
+          <w:tcPr>
+            <w:tcW w:type="dxa" w:w="2880"/>
+          </w:tcPr>
+          <w:p>
+            <w:r>
+              <w:rPr>
+                <w:sz w:val="20"/>
+              </w:rPr>
+              <w:t>AI Hub Admin (ToolSet binding)</w:t>
+            </w:r>
+          </w:p>
+        </w:tc>
+        <w:tc>
+          <w:tcPr>
+            <w:tcW w:type="dxa" w:w="2880"/>
+          </w:tcPr>
+          <w:p>
+            <w:r>
+              <w:rPr>
+                <w:sz w:val="20"/>
+              </w:rPr>
+              <w:t>Is this tool bound to the user's agent profile (Builder vs Operator)?</w:t>
+            </w:r>
+          </w:p>
+        </w:tc>
+      </w:tr>
+      <w:tr>
+        <w:tc>
+          <w:tcPr>
+            <w:tcW w:type="dxa" w:w="2880"/>
+          </w:tcPr>
+          <w:p>
+            <w:r>
+              <w:rPr>
+                <w:sz w:val="20"/>
+              </w:rPr>
+              <w:t>2. Namespace validation</w:t>
+            </w:r>
+          </w:p>
+        </w:tc>
+        <w:tc>
+          <w:tcPr>
+            <w:tcW w:type="dxa" w:w="2880"/>
+          </w:tcPr>
+          <w:p>
+            <w:r>
+              <w:rPr>
+                <w:sz w:val="20"/>
+              </w:rPr>
+              <w:t>Tool implementation</w:t>
+            </w:r>
+          </w:p>
+        </w:tc>
+        <w:tc>
+          <w:tcPr>
+            <w:tcW w:type="dxa" w:w="2880"/>
+          </w:tcPr>
+          <w:p>
+            <w:r>
+              <w:rPr>
+                <w:sz w:val="20"/>
+              </w:rPr>
+              <w:t>Is the target namespace non-Foundation? Does the user have database access?</w:t>
+            </w:r>
+          </w:p>
+        </w:tc>
+      </w:tr>
+      <w:tr>
+        <w:tc>
+          <w:tcPr>
+            <w:tcW w:type="dxa" w:w="2880"/>
+          </w:tcPr>
+          <w:p>
+            <w:r>
+              <w:rPr>
+                <w:sz w:val="20"/>
+              </w:rPr>
+              <w:t>3. Permission delegation</w:t>
+            </w:r>
+          </w:p>
+        </w:tc>
+        <w:tc>
+          <w:tcPr>
+            <w:tcW w:type="dxa" w:w="2880"/>
+          </w:tcPr>
+          <w:p>
+            <w:r>
+              <w:rPr>
+                <w:sz w:val="20"/>
+              </w:rPr>
+              <w:t>Tool implementation</w:t>
+            </w:r>
+          </w:p>
+        </w:tc>
+        <w:tc>
+          <w:tcPr>
+            <w:tcW w:type="dxa" w:w="2880"/>
+          </w:tcPr>
+          <w:p>
+            <w:r>
+              <w:rPr>
+                <w:sz w:val="20"/>
+              </w:rPr>
+              <w:t>Does the authenticated user have the required IRIS role for this operation?</w:t>
+            </w:r>
+          </w:p>
+        </w:tc>
+      </w:tr>
+      <w:tr>
+        <w:tc>
+          <w:tcPr>
+            <w:tcW w:type="dxa" w:w="2880"/>
+          </w:tcPr>
+          <w:p>
+            <w:r>
+              <w:rPr>
+                <w:sz w:val="20"/>
+              </w:rPr>
+              <w:t>4. User confirmation</w:t>
+            </w:r>
+          </w:p>
+        </w:tc>
+        <w:tc>
+          <w:tcPr>
+            <w:tcW w:type="dxa" w:w="2880"/>
+          </w:tcPr>
+          <w:p>
+            <w:r>
+              <w:rPr>
+                <w:sz w:val="20"/>
+              </w:rPr>
+              <w:t>ConfirmationGate policy</w:t>
+            </w:r>
+          </w:p>
+        </w:tc>
+        <w:tc>
+          <w:tcPr>
+            <w:tcW w:type="dxa" w:w="2880"/>
+          </w:tcPr>
+          <w:p>
+            <w:r>
+              <w:rPr>
+                <w:sz w:val="20"/>
+              </w:rPr>
+              <w:t>Did the user click Approve for this specific mutating action?</w:t>
+            </w:r>
+          </w:p>
+        </w:tc>
+      </w:tr>
+    </w:tbl>
+    <w:p/>
+    <w:p>
+      <w:r>
+        <w:t>A mutating action must pass all four layers. A failure at any layer prevents execution and returns a clear error to the agent, which explains the denial to the user.</w:t>
+      </w:r>
+    </w:p>
     <w:sectPr>
       <w:pgSz w:w="12240" w:h="15840"/>
       <w:pgMar w:top="1440" w:right="1800" w:bottom="1440" w:left="1800" w:header="720" w:footer="720" w:gutter="0"/>

</xml_diff>

<commit_message>
Add CI/CD Pipeline Flow diagram (Section 10.4)
- Created graphical diagram showing the 6-step pipeline flow:
  Request -> Compile -> Hook -> Push -> Validate -> Deploy
- Color-coded by actor: Builder, Agent, IRIS, Git, GitLab CI, Pipeline
- Rendered as PNG via Pillow (docs/diagrams/build_cicd_diagram.py)
- HTML version also available (docs/diagrams/cicd_pipeline.html)
- Embedded diagram in both Requirements and Tech Spec .docx files
- Rebuilt all three .docx documents

Co-Authored-By: Claude Opus 4.6 <noreply@anthropic.com>
</commit_message>
<xml_diff>
--- a/docs/01_Requirements_User_Stories.docx
+++ b/docs/01_Requirements_User_Stories.docx
@@ -7241,40 +7241,58 @@
       </w:r>
     </w:p>
     <w:p>
-      <w:r>
-        <w:t>Builder asks agent to create a production</w:t>
-      </w:r>
-    </w:p>
-    <w:p>
-      <w:r>
-        <w:t xml:space="preserve">  --&gt; Agent creates class via $System.OBJ.Compile()</w:t>
-      </w:r>
-    </w:p>
-    <w:p>
-      <w:r>
-        <w:t xml:space="preserve">    --&gt; %SourceControl hook fires</w:t>
-      </w:r>
-    </w:p>
-    <w:p>
-      <w:r>
-        <w:t xml:space="preserve">      --&gt; Class definition exported to local Git working directory</w:t>
-      </w:r>
-    </w:p>
-    <w:p>
-      <w:r>
-        <w:t xml:space="preserve">        --&gt; Builder commits and pushes to GitLab</w:t>
-      </w:r>
-    </w:p>
-    <w:p>
-      <w:r>
-        <w:t xml:space="preserve">          --&gt; CI/CD pipeline runs: lint, validate, test</w:t>
-      </w:r>
-    </w:p>
-    <w:p>
-      <w:r>
-        <w:t xml:space="preserve">            --&gt; On success: deploy to staging/production</w:t>
-      </w:r>
-    </w:p>
+      <w:pPr>
+        <w:jc w:val="center"/>
+      </w:pPr>
+      <w:r>
+        <w:drawing>
+          <wp:inline xmlns:a="http://schemas.openxmlformats.org/drawingml/2006/main" xmlns:pic="http://schemas.openxmlformats.org/drawingml/2006/picture">
+            <wp:extent cx="5669280" cy="2325396"/>
+            <wp:docPr id="20" name="Picture 20"/>
+            <wp:cNvGraphicFramePr>
+              <a:graphicFrameLocks noChangeAspect="1"/>
+            </wp:cNvGraphicFramePr>
+            <a:graphic>
+              <a:graphicData uri="http://schemas.openxmlformats.org/drawingml/2006/picture">
+                <pic:pic>
+                  <pic:nvPicPr>
+                    <pic:cNvPr id="0" name="16_cicd_pipeline.png"/>
+                    <pic:cNvPicPr/>
+                  </pic:nvPicPr>
+                  <pic:blipFill>
+                    <a:blip r:embed="rId24"/>
+                    <a:stretch>
+                      <a:fillRect/>
+                    </a:stretch>
+                  </pic:blipFill>
+                  <pic:spPr>
+                    <a:xfrm>
+                      <a:off x="0" y="0"/>
+                      <a:ext cx="5669280" cy="2325396"/>
+                    </a:xfrm>
+                    <a:prstGeom prst="rect"/>
+                  </pic:spPr>
+                </pic:pic>
+              </a:graphicData>
+            </a:graphic>
+          </wp:inline>
+        </w:drawing>
+      </w:r>
+    </w:p>
+    <w:p>
+      <w:pPr>
+        <w:jc w:val="center"/>
+      </w:pPr>
+      <w:r>
+        <w:rPr>
+          <w:i/>
+          <w:color w:val="666666"/>
+          <w:sz w:val="18"/>
+        </w:rPr>
+        <w:t>Figure: CI/CD Pipeline Flow: how agent-created artifacts flow from conversation to production deployment through source control hooks, Git, and the CI/CD pipeline</w:t>
+      </w:r>
+    </w:p>
+    <w:p/>
     <w:p>
       <w:pPr>
         <w:pStyle w:val="Heading2"/>

</xml_diff>

<commit_message>
Rename Builder to Interface Engineer, rewrite README with 4 personas and use cases, update IPM metadata
- Rename "Builder" persona to "Interface Engineer" (abbreviated "Int. Eng." in compact
  contexts) across all docs, build scripts, diagrams, and HTML files. Class names
  (AgenticInterop.Catalog.Builder) preserved.
- Rewrite README with features section, 4 persona definitions (Developer, AI Hub Admin,
  Interface Engineer, Operator), 5 use cases per persona, and Int. Eng. vs Operator
  tool access table.
- Add SystemRequirements to module.xml for IRIS for Health 2026.2+ with %AI Framework.
- Update class count from 61 to 64 in README and module description.
- Rebuild CI/CD pipeline diagram with updated actor labels.
- Rebuild all three .docx files with the rename applied.

Co-Authored-By: Claude Opus 4.6 <noreply@anthropic.com>
</commit_message>
<xml_diff>
--- a/docs/01_Requirements_User_Stories.docx
+++ b/docs/01_Requirements_User_Stories.docx
@@ -97,7 +97,7 @@
     </w:p>
     <w:p>
       <w:r>
-        <w:t xml:space="preserve">    2.3 End User: Builder</w:t>
+        <w:t xml:space="preserve">    2.3 End User: Interface Engineer</w:t>
       </w:r>
     </w:p>
     <w:p>
@@ -107,7 +107,7 @@
     </w:p>
     <w:p>
       <w:r>
-        <w:t xml:space="preserve">    2.5 Builder vs Operator: Tool Access</w:t>
+        <w:t xml:space="preserve">    2.5 Interface Engineer vs Operator: Tool Access</w:t>
       </w:r>
     </w:p>
     <w:p>
@@ -127,17 +127,17 @@
     </w:p>
     <w:p>
       <w:r>
-        <w:t xml:space="preserve">    5.1 Build Productions (Builder)</w:t>
-      </w:r>
-    </w:p>
-    <w:p>
-      <w:r>
-        <w:t xml:space="preserve">    5.2 Review and Improve Existing Productions (Operator, with Builder escalation)</w:t>
-      </w:r>
-    </w:p>
-    <w:p>
-      <w:r>
-        <w:t xml:space="preserve">    5.3 Create and Optimize Transformations (Builder)</w:t>
+        <w:t xml:space="preserve">    5.1 Build Productions (Interface Engineer)</w:t>
+      </w:r>
+    </w:p>
+    <w:p>
+      <w:r>
+        <w:t xml:space="preserve">    5.2 Review and Improve Existing Productions (Operator, with Interface Engineer escalation)</w:t>
+      </w:r>
+    </w:p>
+    <w:p>
+      <w:r>
+        <w:t xml:space="preserve">    5.3 Create and Optimize Transformations (Interface Engineer)</w:t>
       </w:r>
     </w:p>
     <w:p>
@@ -167,7 +167,7 @@
     </w:p>
     <w:p>
       <w:r>
-        <w:t xml:space="preserve">    8.3 Builder User Stories</w:t>
+        <w:t xml:space="preserve">    8.3 Interface Engineer User Stories</w:t>
       </w:r>
     </w:p>
     <w:p>
@@ -594,7 +594,7 @@
     </w:p>
     <w:p>
       <w:r>
-        <w:t>The system serves four distinct personas. The End User role is split into Builder and Operator because the distinction affects which tools are available, which permissions are required, and whether the agent operates as a dev-time or run-time tool.</w:t>
+        <w:t>The system serves four distinct personas. The End User role is split into Interface Engineer and Operator because the distinction affects which tools are available, which permissions are required, and whether the agent operates as a dev-time or run-time tool.</w:t>
       </w:r>
     </w:p>
     <w:p>
@@ -845,7 +845,7 @@
               <w:rPr>
                 <w:sz w:val="20"/>
               </w:rPr>
-              <w:t>Configures all AI settings: creates agents with custom system prompts, assembles MCP Servers from available ToolSets, links Skills to Agents, manages LLM connections, builds vector catalogs, reviews audit logs. Assigns Builder and Operator roles to end users</w:t>
+              <w:t>Configures all AI settings: creates agents with custom system prompts, assembles MCP Servers from available ToolSets, links Skills to Agents, manages LLM connections, builds vector catalogs, reviews audit logs. Assigns Interface Engineer and Operator roles to end users</w:t>
             </w:r>
           </w:p>
         </w:tc>
@@ -938,7 +938,7 @@
     <w:p/>
     <w:p>
       <w:r>
-        <w:t>The AI Hub Admin decides how the copilot behaves. They configure the agent's personality, which tools are available, which skills are loaded, and which LLM provider powers the responses. They also control which tools are available to Builders versus Operators through ToolSet configuration and role-based tool filtering. No code editing required -- everything is configuration through the admin UI.</w:t>
+        <w:t>The AI Hub Admin decides how the copilot behaves. They configure the agent's personality, which tools are available, which skills are loaded, and which LLM provider powers the responses. They also control which tools are available to Interface Engineers versus Operators through ToolSet configuration and role-based tool filtering. No code editing required -- everything is configuration through the admin UI.</w:t>
       </w:r>
     </w:p>
     <w:p>
@@ -999,7 +999,7 @@
         <w:pStyle w:val="Heading2"/>
       </w:pPr>
       <w:r>
-        <w:t>2.3 End User: Builder</w:t>
+        <w:t>2.3 End User: Interface Engineer</w:t>
       </w:r>
     </w:p>
     <w:tbl>
@@ -1070,7 +1070,7 @@
               <w:rPr>
                 <w:sz w:val="20"/>
               </w:rPr>
-              <w:t>Uses the chatbot to create new integration artifacts: productions, DTLs, BPLs, routing rules, lookup tables. This is a dev-time role -- the Builder authors new content that will be deployed</w:t>
+              <w:t>Uses the chatbot to create new integration artifacts: productions, DTLs, BPLs, routing rules, lookup tables. This is a dev-time role -- the Interface Engineer authors new content that will be deployed</w:t>
             </w:r>
           </w:p>
         </w:tc>
@@ -1191,7 +1191,7 @@
     <w:p/>
     <w:p>
       <w:r>
-        <w:t>The Builder creates new integration artifacts through conversation. Because Builders create and modify class definitions, their work triggers source control hooks (see Section 10) and feeds into the CI/CD pipeline. Builder tool access includes create_production, add_business_host, create_dtl, compile_dtl, create_routing_rule, and other mutating tools.</w:t>
+        <w:t>The Interface Engineer creates new integration artifacts through conversation. Because Interface Engineers create and modify class definitions, their work triggers source control hooks (see Section 10) and feeds into the CI/CD pipeline. Interface Engineer tool access includes create_production, add_business_host, create_dtl, compile_dtl, create_routing_rule, and other mutating tools.</w:t>
       </w:r>
     </w:p>
     <w:p>
@@ -1391,7 +1391,7 @@
     <w:p/>
     <w:p>
       <w:r>
-        <w:t>The Operator focuses on run-time concerns: error triage, throughput monitoring, queue depth analysis, and production health assessment. They can recommend changes (refactor this DTL, add a dead-letter queue, increase pool size) but structural changes require a Builder. Operator tool access includes get_production, query_event_log, top_errors, message_summary, queue_status, and other read/monitoring tools.</w:t>
+        <w:t>The Operator focuses on run-time concerns: error triage, throughput monitoring, queue depth analysis, and production health assessment. They can recommend changes (refactor this DTL, add a dead-letter queue, increase pool size) but structural changes require an Interface Engineer. Operator tool access includes get_production, query_event_log, top_errors, message_summary, queue_status, and other read/monitoring tools.</w:t>
       </w:r>
     </w:p>
     <w:p>
@@ -1399,12 +1399,12 @@
         <w:pStyle w:val="Heading2"/>
       </w:pPr>
       <w:r>
-        <w:t>2.5 Builder vs Operator: Tool Access</w:t>
-      </w:r>
-    </w:p>
-    <w:p>
-      <w:r>
-        <w:t>The distinction between Builder and Operator is enforced through tool availability. The AI Hub Admin configures which ToolSets are available to each role:</w:t>
+        <w:t>2.5 Interface Engineer vs Operator: Tool Access</w:t>
+      </w:r>
+    </w:p>
+    <w:p>
+      <w:r>
+        <w:t>The distinction between Interface Engineer and Operator is enforced through tool availability. The AI Hub Admin configures which ToolSets are available to each role:</w:t>
       </w:r>
     </w:p>
     <w:tbl>
@@ -1449,7 +1449,7 @@
                 <w:color w:val="FFFFFF"/>
                 <w:sz w:val="20"/>
               </w:rPr>
-              <w:t>Builder</w:t>
+              <w:t>Int. Eng.</w:t>
             </w:r>
           </w:p>
         </w:tc>
@@ -1922,7 +1922,7 @@
     <w:p/>
     <w:p>
       <w:r>
-        <w:t>This separation matters for security: the Operator's agent instance cannot create or modify class definitions, which means it cannot accidentally (or through prompt injection) alter production behavior. The AI Hub Admin enforces this by binding different ToolSets to Builder-mode and Operator-mode agent configurations.</w:t>
+        <w:t>This separation matters for security: the Operator's agent instance cannot create or modify class definitions, which means it cannot accidentally (or through prompt injection) alter production behavior. The AI Hub Admin enforces this by binding different ToolSets to Interface Engineer-mode and Operator-mode agent configurations.</w:t>
       </w:r>
     </w:p>
     <w:p>
@@ -2801,7 +2801,7 @@
     </w:p>
     <w:p>
       <w:r>
-        <w:t>The copilot addresses three primary use cases that cover the full lifecycle of healthcare integration work inside IRIS for Health. Each use case maps to a primary End User persona (Builder or Operator).</w:t>
+        <w:t>The copilot addresses three primary use cases that cover the full lifecycle of healthcare integration work inside IRIS for Health. Each use case maps to a primary End User persona (Interface Engineer or Operator).</w:t>
       </w:r>
     </w:p>
     <w:p>
@@ -2862,7 +2862,7 @@
         <w:pStyle w:val="Heading2"/>
       </w:pPr>
       <w:r>
-        <w:t>5.1 Use Case 1: Build Productions (Builder)</w:t>
+        <w:t>5.1 Use Case 1: Build Productions (Interface Engineer)</w:t>
       </w:r>
     </w:p>
     <w:p>
@@ -2872,7 +2872,7 @@
     </w:p>
     <w:p>
       <w:r>
-        <w:t>The agent assists the Builder through the entire production lifecycle:</w:t>
+        <w:t>The agent assists the Interface Engineer through the entire production lifecycle:</w:t>
       </w:r>
     </w:p>
     <w:p>
@@ -2888,7 +2888,7 @@
         <w:pStyle w:val="ListBullet"/>
       </w:pPr>
       <w:r>
-        <w:t>Proposal: The agent presents a production layout -- which hosts to add, what settings to configure, which adapters to use -- and asks the Builder to approve before making changes.</w:t>
+        <w:t>Proposal: The agent presents a production layout -- which hosts to add, what settings to configure, which adapters to use -- and asks the Interface Engineer to approve before making changes.</w:t>
       </w:r>
     </w:p>
     <w:p>
@@ -3026,7 +3026,7 @@
         <w:pStyle w:val="Heading2"/>
       </w:pPr>
       <w:r>
-        <w:t>5.2 Use Case 2: Review and Improve Existing Productions (Operator, with Builder escalation)</w:t>
+        <w:t>5.2 Use Case 2: Review and Improve Existing Productions (Operator, with Interface Engineer escalation)</w:t>
       </w:r>
     </w:p>
     <w:p>
@@ -3036,7 +3036,7 @@
     </w:p>
     <w:p>
       <w:r>
-        <w:t>This use case spans both personas. The Operator handles the read-only investigative work (error triage, health assessment, throughput analysis). When the investigation reveals changes that need to be made (refactor a DTL, add a dead-letter queue, restructure routing rules), those changes escalate to the Builder.</w:t>
+        <w:t>This use case spans both personas. The Operator handles the read-only investigative work (error triage, health assessment, throughput analysis). When the investigation reveals changes that need to be made (refactor a DTL, add a dead-letter queue, restructure routing rules), those changes escalate to the Interface Engineer.</w:t>
       </w:r>
     </w:p>
     <w:p/>
@@ -3066,13 +3066,13 @@
         <w:pStyle w:val="ListBullet"/>
       </w:pPr>
       <w:r>
-        <w:t>Operational Settings Adjustment: The Operator can adjust operational settings (pool size, throttle, retry intervals, call interval) through the agent without Builder involvement. These are runtime tuning changes, not structural modifications.</w:t>
+        <w:t>Operational Settings Adjustment: The Operator can adjust operational settings (pool size, throttle, retry intervals, call interval) through the agent without Interface Engineer involvement. These are runtime tuning changes, not structural modifications.</w:t>
       </w:r>
     </w:p>
     <w:p/>
     <w:p>
       <w:r>
-        <w:t>Builder activities (mutating, dev-time):</w:t>
+        <w:t>Interface Engineer activities (mutating, dev-time):</w:t>
       </w:r>
     </w:p>
     <w:p>
@@ -3080,7 +3080,7 @@
         <w:pStyle w:val="ListBullet"/>
       </w:pPr>
       <w:r>
-        <w:t>DTL Review and Refactoring: The agent reviews Data Transformation Language (DTL) definitions and identifies hardcoded values that should be lookup tables, missing null checks on source fields, incorrect handling of repeating fields, and segments being dropped. It suggests refactored versions with explanations. Implementing the refactored DTL requires Builder permissions.</w:t>
+        <w:t>DTL Review and Refactoring: The agent reviews Data Transformation Language (DTL) definitions and identifies hardcoded values that should be lookup tables, missing null checks on source fields, incorrect handling of repeating fields, and segments being dropped. It suggests refactored versions with explanations. Implementing the refactored DTL requires Interface Engineer permissions.</w:t>
       </w:r>
     </w:p>
     <w:p>
@@ -3088,7 +3088,7 @@
         <w:pStyle w:val="ListBullet"/>
       </w:pPr>
       <w:r>
-        <w:t>Modernization: The agent knows about newer IRIS features (via Skills) and can recommend upgrades -- for example, replacing a custom BPL with a built-in DTL, using record maps instead of custom parsers, or adopting the HL7-to-SDA-to-FHIR pipeline instead of point-to-point transformations. Implementing these changes requires Builder permissions.</w:t>
+        <w:t>Modernization: The agent knows about newer IRIS features (via Skills) and can recommend upgrades -- for example, replacing a custom BPL with a built-in DTL, using record maps instead of custom parsers, or adopting the HL7-to-SDA-to-FHIR pipeline instead of point-to-point transformations. Implementing these changes requires Interface Engineer permissions.</w:t>
       </w:r>
     </w:p>
     <w:p/>
@@ -3164,7 +3164,7 @@
     <w:p/>
     <w:p>
       <w:r>
-        <w:t>Tools involved (Builder escalation):</w:t>
+        <w:t>Tools involved (Interface Engineer escalation):</w:t>
       </w:r>
     </w:p>
     <w:p>
@@ -3222,7 +3222,7 @@
     <w:p/>
     <w:p>
       <w:r>
-        <w:t>Example prompts (Builder):</w:t>
+        <w:t>Example prompts (Interface Engineer):</w:t>
       </w:r>
     </w:p>
     <w:p>
@@ -3246,7 +3246,7 @@
         <w:pStyle w:val="Heading2"/>
       </w:pPr>
       <w:r>
-        <w:t>5.3 Use Case 3: Create and Optimize Transformations (Builder)</w:t>
+        <w:t>5.3 Use Case 3: Create and Optimize Transformations (Interface Engineer)</w:t>
       </w:r>
     </w:p>
     <w:p>
@@ -3256,7 +3256,7 @@
     </w:p>
     <w:p>
       <w:r>
-        <w:t>The agent assists the Builder with transformation work at every stage:</w:t>
+        <w:t>The agent assists the Interface Engineer with transformation work at every stage:</w:t>
       </w:r>
     </w:p>
     <w:p>
@@ -3280,7 +3280,7 @@
         <w:pStyle w:val="ListBullet"/>
       </w:pPr>
       <w:r>
-        <w:t>Schema Introspection: The agent can introspect HL7 v2 message schemas (segments, fields, components) and FHIR R4 resource structures so the Builder understands what data is available at each point in the pipeline.</w:t>
+        <w:t>Schema Introspection: The agent can introspect HL7 v2 message schemas (segments, fields, components) and FHIR R4 resource structures so the Interface Engineer understands what data is available at each point in the pipeline.</w:t>
       </w:r>
     </w:p>
     <w:p>
@@ -3555,7 +3555,7 @@
         <w:pStyle w:val="ListBullet"/>
       </w:pPr>
       <w:r>
-        <w:t>Tool specifies whether it is available to Builder, Operator, or both roles</w:t>
+        <w:t>Tool specifies whether it is available to Interface Engineer, Operator, or both roles</w:t>
       </w:r>
     </w:p>
     <w:p>
@@ -4014,7 +4014,7 @@
     <w:p/>
     <w:p>
       <w:r>
-        <w:t>Note: The AI Hub Admin can configure separate agent profiles for Builder and Operator roles, each with different ToolSet bindings. This enforces the privilege separation described in Section 2.5.</w:t>
+        <w:t>Note: The AI Hub Admin can configure separate agent profiles for Interface Engineer and Operator roles, each with different ToolSet bindings. This enforces the privilege separation described in Section 2.5.</w:t>
       </w:r>
     </w:p>
     <w:p>
@@ -5661,7 +5661,7 @@
     </w:p>
     <w:p>
       <w:r>
-        <w:t>The End User (Builder or Operator) interacts with the copilot through a streaming chat interface. The chatbot is available at /agentic/chat/index.html (standalone) or embedded in the Interop Editor via an AI button (iframe mode).</w:t>
+        <w:t>The End User (Interface Engineer or Operator) interacts with the copilot through a streaming chat interface. The chatbot is available at /agentic/chat/index.html (standalone) or embedded in the Interop Editor via an AI button (iframe mode).</w:t>
       </w:r>
     </w:p>
     <w:p>
@@ -5807,7 +5807,7 @@
         <w:pStyle w:val="Heading2"/>
       </w:pPr>
       <w:r>
-        <w:t>8.3 Builder User Stories</w:t>
+        <w:t>8.3 Interface Engineer User Stories</w:t>
       </w:r>
     </w:p>
     <w:p>
@@ -5820,7 +5820,7 @@
     </w:p>
     <w:p>
       <w:r>
-        <w:t>As a Builder, I want to describe an integration requirement in plain English and have the agent build the production, so that I can create working integrations without manually navigating the Management Portal.</w:t>
+        <w:t>As an Interface Engineer, I want to describe an integration requirement in plain English and have the agent build the production, so that I can create working integrations without manually navigating the Management Portal.</w:t>
       </w:r>
     </w:p>
     <w:p>
@@ -5886,7 +5886,7 @@
     </w:p>
     <w:p>
       <w:r>
-        <w:t>As a Builder, I want to describe a data transformation requirement and have the agent scaffold the DTL, so that I can create transformations with the correct source/target classes and field mappings.</w:t>
+        <w:t>As an Interface Engineer, I want to describe a data transformation requirement and have the agent scaffold the DTL, so that I can create transformations with the correct source/target classes and field mappings.</w:t>
       </w:r>
     </w:p>
     <w:p>
@@ -6200,7 +6200,7 @@
         <w:pStyle w:val="ListBullet"/>
       </w:pPr>
       <w:r>
-        <w:t>Builder-mode tools (create, update, delete, compile, start, stop) require specific roles assigned by the AI Hub Admin</w:t>
+        <w:t>Interface Engineer-mode tools (create, update, delete, compile, start, stop) require specific roles assigned by the AI Hub Admin</w:t>
       </w:r>
     </w:p>
     <w:p>
@@ -6596,24 +6596,24 @@
         <w:pStyle w:val="Heading2"/>
       </w:pPr>
       <w:r>
-        <w:t>9.5 Builder vs Operator Privilege Separation</w:t>
-      </w:r>
-    </w:p>
-    <w:p>
-      <w:r>
-        <w:t>The security distinction between Builder and Operator is enforced at two levels:</w:t>
+        <w:t>9.5 Interface Engineer vs Operator Privilege Separation</w:t>
+      </w:r>
+    </w:p>
+    <w:p>
+      <w:r>
+        <w:t>The security distinction between Interface Engineer and Operator is enforced at two levels:</w:t>
       </w:r>
     </w:p>
     <w:p/>
     <w:p>
       <w:r>
-        <w:t>Level 1: Tool availability (configured by AI Hub Admin). The AI Hub Admin binds different ToolSets to Builder-mode and Operator-mode agent configurations. Operator agents do not have access to mutating tools. Even if an Operator user has database-level write access, the agent cannot call tools that are not bound to the Operator configuration. This prevents prompt injection attacks from escalating Operator sessions to Builder-level access.</w:t>
+        <w:t>Level 1: Tool availability (configured by AI Hub Admin). The AI Hub Admin binds different ToolSets to Interface Engineer-mode and Operator-mode agent configurations. Operator agents do not have access to mutating tools. Even if an Operator user has database-level write access, the agent cannot call tools that are not bound to the Operator configuration. This prevents prompt injection attacks from escalating Operator sessions to Interface Engineer-level access.</w:t>
       </w:r>
     </w:p>
     <w:p/>
     <w:p>
       <w:r>
-        <w:t>Level 2: Permission validation (enforced by tools). Even in Builder mode, every mutating tool validates the user's permissions before executing. The ConfirmationGate provides a third layer: the user must explicitly approve each mutating action.</w:t>
+        <w:t>Level 2: Permission validation (enforced by tools). Even in Interface Engineer mode, every mutating tool validates the user's permissions before executing. The ConfirmationGate provides a third layer: the user must explicitly approve each mutating action.</w:t>
       </w:r>
     </w:p>
     <w:p>
@@ -7221,7 +7221,7 @@
         <w:pStyle w:val="ListBullet"/>
       </w:pPr>
       <w:r>
-        <w:t>User attribution: Changes are attributed to the authenticated user (the Builder), not to the agent's service account. The source control hooks capture the $username from the IRIS process context.</w:t>
+        <w:t>User attribution: Changes are attributed to the authenticated user (the Interface Engineer), not to the agent's service account. The source control hooks capture the $username from the IRIS process context.</w:t>
       </w:r>
     </w:p>
     <w:p>
@@ -7311,7 +7311,7 @@
     </w:p>
     <w:p>
       <w:r>
-        <w:t>As a Builder, I want the productions, DTLs, and BPLs that the agent creates to be captured by source control hooks, so that they flow through the same CI/CD pipeline as manually created artifacts.</w:t>
+        <w:t>As an Interface Engineer, I want the productions, DTLs, and BPLs that the agent creates to be captured by source control hooks, so that they flow through the same CI/CD pipeline as manually created artifacts.</w:t>
       </w:r>
     </w:p>
     <w:p>
@@ -7361,7 +7361,7 @@
     </w:p>
     <w:p>
       <w:r>
-        <w:t>As a Builder, I want the agent to report whether source control captured the new classes after a build, so that I know whether my changes are tracked.</w:t>
+        <w:t>As an Interface Engineer, I want the agent to report whether source control captured the new classes after a build, so that I know whether my changes are tracked.</w:t>
       </w:r>
     </w:p>
     <w:p>
@@ -7403,7 +7403,7 @@
     </w:p>
     <w:p>
       <w:r>
-        <w:t>As a Builder, I want the agent to respect source control locks on classes, so that it does not modify a class that another user has locked for editing.</w:t>
+        <w:t>As an Interface Engineer, I want the agent to respect source control locks on classes, so that it does not modify a class that another user has locked for editing.</w:t>
       </w:r>
     </w:p>
     <w:p>
@@ -7492,7 +7492,7 @@
         <w:t>AI Hub Admin</w:t>
       </w:r>
       <w:r>
-        <w:t xml:space="preserve"> configures Builder and Operator agent profiles with appropriate ToolSet bindings</w:t>
+        <w:t xml:space="preserve"> configures Interface Engineer and Operator agent profiles with appropriate ToolSet bindings</w:t>
       </w:r>
     </w:p>
     <w:p>
@@ -7545,7 +7545,7 @@
         <w:rPr>
           <w:b/>
         </w:rPr>
-        <w:t>Builder</w:t>
+        <w:t>Int. Eng.</w:t>
       </w:r>
       <w:r>
         <w:t xml:space="preserve"> opens the chatbot and asks: 'Build me a production that receives ADT^A04 messages via MLLP, transforms patient demographics to FHIR R4, and sends them to a REST endpoint'</w:t>
@@ -7562,7 +7562,7 @@
         <w:t>Agent</w:t>
       </w:r>
       <w:r>
-        <w:t xml:space="preserve"> validates that the Builder has %DB_WRITE permission on the target namespace</w:t>
+        <w:t xml:space="preserve"> validates that the Interface Engineer has %DB_WRITE permission on the target namespace</w:t>
       </w:r>
     </w:p>
     <w:p>
@@ -7590,7 +7590,7 @@
         <w:t>Agent</w:t>
       </w:r>
       <w:r>
-        <w:t xml:space="preserve"> proposes the production layout and asks the Builder to approve</w:t>
+        <w:t xml:space="preserve"> proposes the production layout and asks the Interface Engineer to approve</w:t>
       </w:r>
     </w:p>
     <w:p>
@@ -7601,7 +7601,7 @@
         <w:rPr>
           <w:b/>
         </w:rPr>
-        <w:t>Builder</w:t>
+        <w:t>Int. Eng.</w:t>
       </w:r>
       <w:r>
         <w:t xml:space="preserve"> clicks Approve</w:t>
@@ -7702,7 +7702,7 @@
         <w:t>AI Hub Admin</w:t>
       </w:r>
       <w:r>
-        <w:t xml:space="preserve"> reviews the audit log to see the complete trace of all actions by both Builder and Operator</w:t>
+        <w:t xml:space="preserve"> reviews the audit log to see the complete trace of all actions by both Interface Engineer and Operator</w:t>
       </w:r>
     </w:p>
     <w:p>
@@ -9075,7 +9075,7 @@
               <w:rPr>
                 <w:sz w:val="20"/>
               </w:rPr>
-              <w:t>Is this tool bound to the user's agent profile (Builder vs Operator)?</w:t>
+              <w:t>Is this tool bound to the user's agent profile (Interface Engineer vs Operator)?</w:t>
             </w:r>
           </w:p>
         </w:tc>

</xml_diff>